<commit_message>
Embed screens in the US, drop the copy-pasted cancellation restriction
The user story now renders SC1-SC5 and the flow diagram inline and no
longer carries an Open Questions section (clarifications handled with
the PO directly). The restrictions table loses the cancellation row
inherited from the cancellation BRD - a pending cancellation always
shows a non-Rejected status, which the not-rejected rule already
blocks - and the Revert button condition drops the Cancel_App clause
for the same reason.

Co-Authored-By: Claude Fable 5 <noreply@anthropic.com>
Claude-Session: https://claude.ai/code/session_01GMyQEZm7CauvpgScBFz4Cf
</commit_message>
<xml_diff>
--- a/docs/brd/Appro_RF_Application_Revert_in_Super_Portal_v1.0.docx
+++ b/docs/brd/Appro_RF_Application_Revert_in_Super_Portal_v1.0.docx
@@ -1612,7 +1612,7 @@
                 <w:sz w:val="21"/>
                 <w:szCs w:val="21"/>
               </w:rPr>
-              <w:t xml:space="preserve">Revert_App = TRUE (a request is already pending in the Revert Queue)</w:t>
+              <w:t xml:space="preserve">Revert_App = TRUE (a revert request is already pending in the Revert Queue)</w:t>
             </w:r>
           </w:p>
         </w:tc>
@@ -1646,7 +1646,7 @@
                 <w:sz w:val="21"/>
                 <w:szCs w:val="21"/>
               </w:rPr>
-              <w:t xml:space="preserve">Bank users already initiated cancellation</w:t>
+              <w:t xml:space="preserve">Application is not rejected</w:t>
             </w:r>
           </w:p>
         </w:tc>
@@ -1675,70 +1675,7 @@
                 <w:sz w:val="21"/>
                 <w:szCs w:val="21"/>
               </w:rPr>
-              <w:t xml:space="preserve">Application Status = 'User Initiated Cancellation' OR Cancel_App = TRUE</w:t>
-            </w:r>
-          </w:p>
-        </w:tc>
-      </w:tr>
-      <w:tr>
-        <w:trPr>
-          <w:cantSplit/>
-        </w:trPr>
-        <w:tc>
-          <w:tcPr>
-            <w:tcW w:type="dxa" w:w="2708"/>
-            <w:shd w:fill="FFFFFF" w:color="auto" w:val="clear"/>
-            <w:tcMar>
-              <w:top w:type="dxa" w:w="90"/>
-              <w:left w:type="dxa" w:w="110"/>
-              <w:bottom w:type="dxa" w:w="90"/>
-              <w:right w:type="dxa" w:w="110"/>
-            </w:tcMar>
-            <w:vAlign w:val="top"/>
-          </w:tcPr>
-          <w:p>
-            <w:pPr>
-              <w:spacing w:after="0" w:before="0" w:line="252"/>
-            </w:pPr>
-            <w:r>
-              <w:rPr>
-                <w:rFonts w:ascii="Arial" w:cs="Arial" w:eastAsia="Arial" w:hAnsi="Arial"/>
-                <w:b w:val="false"/>
-                <w:bCs w:val="false"/>
-                <w:color w:val="000000"/>
-                <w:sz w:val="21"/>
-                <w:szCs w:val="21"/>
-              </w:rPr>
-              <w:t xml:space="preserve">Application is not rejected</w:t>
-            </w:r>
-          </w:p>
-        </w:tc>
-        <w:tc>
-          <w:tcPr>
-            <w:tcW w:type="dxa" w:w="6318"/>
-            <w:shd w:fill="FFFFFF" w:color="auto" w:val="clear"/>
-            <w:tcMar>
-              <w:top w:type="dxa" w:w="90"/>
-              <w:left w:type="dxa" w:w="110"/>
-              <w:bottom w:type="dxa" w:w="90"/>
-              <w:right w:type="dxa" w:w="110"/>
-            </w:tcMar>
-            <w:vAlign w:val="top"/>
-          </w:tcPr>
-          <w:p>
-            <w:pPr>
-              <w:spacing w:after="0" w:before="0" w:line="252"/>
-            </w:pPr>
-            <w:r>
-              <w:rPr>
-                <w:rFonts w:ascii="Arial" w:cs="Arial" w:eastAsia="Arial" w:hAnsi="Arial"/>
-                <w:b w:val="false"/>
-                <w:bCs w:val="false"/>
-                <w:color w:val="000000"/>
-                <w:sz w:val="21"/>
-                <w:szCs w:val="21"/>
-              </w:rPr>
-              <w:t xml:space="preserve">Any Application Status other than 'Rejected' — Lead | In Progress | Awaiting Compliance Review | Awaiting Risk Review | Awaiting Sales Response | Awaiting Credit Approval | Approval In Principle | Awaiting Cooling Off Period | Awaiting Signature | KFS Signature | Completed</w:t>
+              <w:t xml:space="preserve">Any Application Status other than 'Rejected' — Lead | In Progress | Awaiting Compliance Review | Awaiting Risk Review | Awaiting Sales Response | Awaiting Credit Approval | Approval In Principle | Awaiting Cooling Off Period | Awaiting Signature | KFS Signature | User Initiated Cancellation | Completed</w:t>
             </w:r>
           </w:p>
         </w:tc>
@@ -3053,7 +2990,7 @@
           <w:sz w:val="22"/>
           <w:szCs w:val="22"/>
         </w:rPr>
-        <w:t xml:space="preserve"> button is placed in the action bar next to the existing 'Cancel Application' button, and is enabled only when Application Status = 'Rejected', the rejection trigger point is revertible (section 5), and no revert or cancellation request is already pending.</w:t>
+        <w:t xml:space="preserve"> button is placed in the action bar next to the existing 'Cancel Application' button, and is enabled only when Application Status = 'Rejected', the rejection trigger point is revertible (section 5), and no revert request is already pending.</w:t>
       </w:r>
     </w:p>
     <w:p>

</xml_diff>

<commit_message>
Apply PO decisions: Credit-only scope, both DBR nets park, customer template
Scope narrows to Credit-root-cause rejections only - rejected by Credit,
or auto-rejected by the System for credit reasons; Compliance, Risk and
Sale queue rejections are out of scope, so the revert target is always
Awaiting Credit Approval at Credit Queue L1. Gross DBR > 100% gets the
same parking treatment as Existing DBR > 50%. A new Customer-type email
template covers approval after re-assessment (final confirmation only),
the 30-day window restarts from the latest rejection, and no cap applies.

Screens renamed to mapped SC names so the ticket references, the repo
and the shared zip all match; US impact analysis becomes a table and
the PO-decisions section is folded into the relevant ACs.

Co-Authored-By: Claude Fable 5 <noreply@anthropic.com>
Claude-Session: https://claude.ai/code/session_01GMyQEZm7CauvpgScBFz4Cf
</commit_message>
<xml_diff>
--- a/docs/brd/Appro_RF_Application_Revert_in_Super_Portal_v1.0.docx
+++ b/docs/brd/Appro_RF_Application_Revert_in_Super_Portal_v1.0.docx
@@ -562,6 +562,110 @@
         <w:t xml:space="preserve">(CASA is excluded — it has no credit decisioning; Mortgage Loan and Auto Loan are not yet part of the platform scope.)</w:t>
       </w:r>
     </w:p>
+    <w:p>
+      <w:pPr>
+        <w:spacing w:after="120" w:before="40" w:line="264"/>
+      </w:pPr>
+      <w:r>
+        <w:rPr>
+          <w:rFonts w:ascii="Arial" w:cs="Arial" w:eastAsia="Arial" w:hAnsi="Arial"/>
+          <w:b w:val="false"/>
+          <w:bCs w:val="false"/>
+          <w:color w:val="000000"/>
+          <w:sz w:val="22"/>
+          <w:szCs w:val="22"/>
+        </w:rPr>
+        <w:t xml:space="preserve">Scope rule: only rejections with a </w:t>
+      </w:r>
+      <w:r>
+        <w:rPr>
+          <w:rFonts w:ascii="Arial" w:cs="Arial" w:eastAsia="Arial" w:hAnsi="Arial"/>
+          <w:b/>
+          <w:bCs/>
+          <w:color w:val="000000"/>
+          <w:sz w:val="22"/>
+          <w:szCs w:val="22"/>
+        </w:rPr>
+        <w:t xml:space="preserve">Credit root cause</w:t>
+      </w:r>
+      <w:r>
+        <w:rPr>
+          <w:rFonts w:ascii="Arial" w:cs="Arial" w:eastAsia="Arial" w:hAnsi="Arial"/>
+          <w:b w:val="false"/>
+          <w:bCs w:val="false"/>
+          <w:color w:val="000000"/>
+          <w:sz w:val="22"/>
+          <w:szCs w:val="22"/>
+        </w:rPr>
+        <w:t xml:space="preserve"> are revertible — </w:t>
+      </w:r>
+      <w:r>
+        <w:rPr>
+          <w:rFonts w:ascii="Arial" w:cs="Arial" w:eastAsia="Arial" w:hAnsi="Arial"/>
+          <w:b/>
+          <w:bCs/>
+          <w:color w:val="000000"/>
+          <w:sz w:val="22"/>
+          <w:szCs w:val="22"/>
+        </w:rPr>
+        <w:t xml:space="preserve">rejected by Credit</w:t>
+      </w:r>
+      <w:r>
+        <w:rPr>
+          <w:rFonts w:ascii="Arial" w:cs="Arial" w:eastAsia="Arial" w:hAnsi="Arial"/>
+          <w:b w:val="false"/>
+          <w:bCs w:val="false"/>
+          <w:color w:val="000000"/>
+          <w:sz w:val="22"/>
+          <w:szCs w:val="22"/>
+        </w:rPr>
+        <w:t xml:space="preserve"> in Credit Queue, or </w:t>
+      </w:r>
+      <w:r>
+        <w:rPr>
+          <w:rFonts w:ascii="Arial" w:cs="Arial" w:eastAsia="Arial" w:hAnsi="Arial"/>
+          <w:b/>
+          <w:bCs/>
+          <w:color w:val="000000"/>
+          <w:sz w:val="22"/>
+          <w:szCs w:val="22"/>
+        </w:rPr>
+        <w:t xml:space="preserve">auto-rejected by the System for credit reasons</w:t>
+      </w:r>
+      <w:r>
+        <w:rPr>
+          <w:rFonts w:ascii="Arial" w:cs="Arial" w:eastAsia="Arial" w:hAnsi="Arial"/>
+          <w:b w:val="false"/>
+          <w:bCs w:val="false"/>
+          <w:color w:val="000000"/>
+          <w:sz w:val="22"/>
+          <w:szCs w:val="22"/>
+        </w:rPr>
+        <w:t xml:space="preserve"> (DBR safety nets, segmentation failure, approved limit below Min Boundary). Compliance, Risk and Sale queue rejections are </w:t>
+      </w:r>
+      <w:r>
+        <w:rPr>
+          <w:rFonts w:ascii="Arial" w:cs="Arial" w:eastAsia="Arial" w:hAnsi="Arial"/>
+          <w:b/>
+          <w:bCs/>
+          <w:color w:val="000000"/>
+          <w:sz w:val="22"/>
+          <w:szCs w:val="22"/>
+        </w:rPr>
+        <w:t xml:space="preserve">out of scope</w:t>
+      </w:r>
+      <w:r>
+        <w:rPr>
+          <w:rFonts w:ascii="Arial" w:cs="Arial" w:eastAsia="Arial" w:hAnsi="Arial"/>
+          <w:b w:val="false"/>
+          <w:bCs w:val="false"/>
+          <w:color w:val="000000"/>
+          <w:sz w:val="22"/>
+          <w:szCs w:val="22"/>
+        </w:rPr>
+        <w:t xml:space="preserve">.</w:t>
+      </w:r>
+    </w:p>
     <w:tbl>
       <w:tblPr>
         <w:tblW w:type="dxa" w:w="9026"/>
@@ -1050,7 +1154,7 @@
                 <w:sz w:val="21"/>
                 <w:szCs w:val="21"/>
               </w:rPr>
-              <w:t xml:space="preserve">Rejected by Compliance user in Compliance Queue (L1–L2)</w:t>
+              <w:t xml:space="preserve">Auto-rejected by System — Existing DBR &gt; 50% after calculation</w:t>
             </w:r>
           </w:p>
         </w:tc>
@@ -1079,7 +1183,7 @@
                 <w:sz w:val="21"/>
                 <w:szCs w:val="21"/>
               </w:rPr>
-              <w:t xml:space="preserve">Back to 'Awaiting Compliance Review' — Compliance Queue L1</w:t>
+              <w:t xml:space="preserve">System change: the case is parked into Credit Queue L1 ('Awaiting Credit Approval') instead of auto-rejecting — same Failed Reason message as today, with Rule Engine and Limit Assignment results available in the queue view. A subsequent Credit rejection then reverts under row 1 (see section 5)</w:t>
             </w:r>
           </w:p>
         </w:tc>
@@ -1142,7 +1246,7 @@
                 <w:sz w:val="21"/>
                 <w:szCs w:val="21"/>
               </w:rPr>
-              <w:t xml:space="preserve">Rejected by Risk user in Risk Queue (L1–L3)</w:t>
+              <w:t xml:space="preserve">Auto-rejected by System — Gross DBR &gt; 100% safety net</w:t>
             </w:r>
           </w:p>
         </w:tc>
@@ -1171,7 +1275,7 @@
                 <w:sz w:val="21"/>
                 <w:szCs w:val="21"/>
               </w:rPr>
-              <w:t xml:space="preserve">Back to 'Awaiting Risk Review' — Risk Queue L1</w:t>
+              <w:t xml:space="preserve">Same treatment as row 2 — parked into Credit Queue L1 instead of auto-rejecting, with the same Failed Reason message and completed Rule Engine / Limit Assignment results</w:t>
             </w:r>
           </w:p>
         </w:tc>
@@ -1234,7 +1338,7 @@
                 <w:sz w:val="21"/>
                 <w:szCs w:val="21"/>
               </w:rPr>
-              <w:t xml:space="preserve">Auto-rejected by System — Existing DBR &gt; 50% after calculation</w:t>
+              <w:t xml:space="preserve">Auto-rejected by System — application fails all segmentations (rejection logic unchanged)</w:t>
             </w:r>
           </w:p>
         </w:tc>
@@ -1263,7 +1367,7 @@
                 <w:sz w:val="21"/>
                 <w:szCs w:val="21"/>
               </w:rPr>
-              <w:t xml:space="preserve">System change: the case is parked into Credit Queue L1 ('Awaiting Credit Approval') instead of auto-rejecting — same Failed Reason message as today, with Rule Engine and Limit Assignment results available in the queue view. A subsequent Credit rejection then reverts under row 1 (see section 5)</w:t>
+              <w:t xml:space="preserve">Back to 'Awaiting Credit Approval' — Credit Queue L1</w:t>
             </w:r>
           </w:p>
         </w:tc>
@@ -1298,98 +1402,6 @@
                 <w:szCs w:val="21"/>
               </w:rPr>
               <w:t xml:space="preserve">5</w:t>
-            </w:r>
-          </w:p>
-        </w:tc>
-        <w:tc>
-          <w:tcPr>
-            <w:tcW w:type="dxa" w:w="3610"/>
-            <w:shd w:fill="FFFFFF" w:color="auto" w:val="clear"/>
-            <w:tcMar>
-              <w:top w:type="dxa" w:w="90"/>
-              <w:left w:type="dxa" w:w="110"/>
-              <w:bottom w:type="dxa" w:w="90"/>
-              <w:right w:type="dxa" w:w="110"/>
-            </w:tcMar>
-            <w:vAlign w:val="top"/>
-          </w:tcPr>
-          <w:p>
-            <w:pPr>
-              <w:spacing w:after="0" w:before="0" w:line="252"/>
-            </w:pPr>
-            <w:r>
-              <w:rPr>
-                <w:rFonts w:ascii="Arial" w:cs="Arial" w:eastAsia="Arial" w:hAnsi="Arial"/>
-                <w:b w:val="false"/>
-                <w:bCs w:val="false"/>
-                <w:color w:val="000000"/>
-                <w:sz w:val="21"/>
-                <w:szCs w:val="21"/>
-              </w:rPr>
-              <w:t xml:space="preserve">Auto-rejected by System — application fails all segmentations (rejection logic unchanged)</w:t>
-            </w:r>
-          </w:p>
-        </w:tc>
-        <w:tc>
-          <w:tcPr>
-            <w:tcW w:type="dxa" w:w="4874"/>
-            <w:shd w:fill="FFFFFF" w:color="auto" w:val="clear"/>
-            <w:tcMar>
-              <w:top w:type="dxa" w:w="90"/>
-              <w:left w:type="dxa" w:w="110"/>
-              <w:bottom w:type="dxa" w:w="90"/>
-              <w:right w:type="dxa" w:w="110"/>
-            </w:tcMar>
-            <w:vAlign w:val="top"/>
-          </w:tcPr>
-          <w:p>
-            <w:pPr>
-              <w:spacing w:after="0" w:before="0" w:line="252"/>
-            </w:pPr>
-            <w:r>
-              <w:rPr>
-                <w:rFonts w:ascii="Arial" w:cs="Arial" w:eastAsia="Arial" w:hAnsi="Arial"/>
-                <w:b w:val="false"/>
-                <w:bCs w:val="false"/>
-                <w:color w:val="000000"/>
-                <w:sz w:val="21"/>
-                <w:szCs w:val="21"/>
-              </w:rPr>
-              <w:t xml:space="preserve">Back to 'Awaiting Credit Approval' — Credit Queue L1</w:t>
-            </w:r>
-          </w:p>
-        </w:tc>
-      </w:tr>
-      <w:tr>
-        <w:trPr>
-          <w:cantSplit/>
-        </w:trPr>
-        <w:tc>
-          <w:tcPr>
-            <w:tcW w:type="dxa" w:w="542"/>
-            <w:shd w:fill="FFFFFF" w:color="auto" w:val="clear"/>
-            <w:tcMar>
-              <w:top w:type="dxa" w:w="90"/>
-              <w:left w:type="dxa" w:w="110"/>
-              <w:bottom w:type="dxa" w:w="90"/>
-              <w:right w:type="dxa" w:w="110"/>
-            </w:tcMar>
-            <w:vAlign w:val="top"/>
-          </w:tcPr>
-          <w:p>
-            <w:pPr>
-              <w:spacing w:after="0" w:before="0" w:line="252"/>
-            </w:pPr>
-            <w:r>
-              <w:rPr>
-                <w:rFonts w:ascii="Arial" w:cs="Arial" w:eastAsia="Arial" w:hAnsi="Arial"/>
-                <w:b w:val="false"/>
-                <w:bCs w:val="false"/>
-                <w:color w:val="000000"/>
-                <w:sz w:val="21"/>
-                <w:szCs w:val="21"/>
-              </w:rPr>
-              <w:t xml:space="preserve">6</w:t>
             </w:r>
           </w:p>
         </w:tc>
@@ -1613,6 +1625,69 @@
                 <w:szCs w:val="21"/>
               </w:rPr>
               <w:t xml:space="preserve">Revert_App = TRUE (a revert request is already pending in the Revert Queue)</w:t>
+            </w:r>
+          </w:p>
+        </w:tc>
+      </w:tr>
+      <w:tr>
+        <w:trPr>
+          <w:cantSplit/>
+        </w:trPr>
+        <w:tc>
+          <w:tcPr>
+            <w:tcW w:type="dxa" w:w="2708"/>
+            <w:shd w:fill="FFFFFF" w:color="auto" w:val="clear"/>
+            <w:tcMar>
+              <w:top w:type="dxa" w:w="90"/>
+              <w:left w:type="dxa" w:w="110"/>
+              <w:bottom w:type="dxa" w:w="90"/>
+              <w:right w:type="dxa" w:w="110"/>
+            </w:tcMar>
+            <w:vAlign w:val="top"/>
+          </w:tcPr>
+          <w:p>
+            <w:pPr>
+              <w:spacing w:after="0" w:before="0" w:line="252"/>
+            </w:pPr>
+            <w:r>
+              <w:rPr>
+                <w:rFonts w:ascii="Arial" w:cs="Arial" w:eastAsia="Arial" w:hAnsi="Arial"/>
+                <w:b w:val="false"/>
+                <w:bCs w:val="false"/>
+                <w:color w:val="000000"/>
+                <w:sz w:val="21"/>
+                <w:szCs w:val="21"/>
+              </w:rPr>
+              <w:t xml:space="preserve">Rejection has no Credit root cause</w:t>
+            </w:r>
+          </w:p>
+        </w:tc>
+        <w:tc>
+          <w:tcPr>
+            <w:tcW w:type="dxa" w:w="6318"/>
+            <w:shd w:fill="FFFFFF" w:color="auto" w:val="clear"/>
+            <w:tcMar>
+              <w:top w:type="dxa" w:w="90"/>
+              <w:left w:type="dxa" w:w="110"/>
+              <w:bottom w:type="dxa" w:w="90"/>
+              <w:right w:type="dxa" w:w="110"/>
+            </w:tcMar>
+            <w:vAlign w:val="top"/>
+          </w:tcPr>
+          <w:p>
+            <w:pPr>
+              <w:spacing w:after="0" w:before="0" w:line="252"/>
+            </w:pPr>
+            <w:r>
+              <w:rPr>
+                <w:rFonts w:ascii="Arial" w:cs="Arial" w:eastAsia="Arial" w:hAnsi="Arial"/>
+                <w:b w:val="false"/>
+                <w:bCs w:val="false"/>
+                <w:color w:val="000000"/>
+                <w:sz w:val="21"/>
+                <w:szCs w:val="21"/>
+              </w:rPr>
+              <w:t xml:space="preserve">Rejected by Compliance Queue, Risk Queue or Sale Queue — only Credit-root-cause rejections are revertible (rejected by Credit, or auto-rejected by the System for credit reasons)</w:t>
             </w:r>
           </w:p>
         </w:tc>
@@ -6607,7 +6682,7 @@
           <w:sz w:val="22"/>
           <w:szCs w:val="22"/>
         </w:rPr>
-        <w:t xml:space="preserve">The status an application is reverted </w:t>
+        <w:t xml:space="preserve">The revertibility of an application is determined by </w:t>
       </w:r>
       <w:r>
         <w:rPr>
@@ -6618,7 +6693,7 @@
           <w:sz w:val="22"/>
           <w:szCs w:val="22"/>
         </w:rPr>
-        <w:t xml:space="preserve">to</w:t>
+        <w:t xml:space="preserve">how it became Rejected</w:t>
       </w:r>
       <w:r>
         <w:rPr>
@@ -6629,7 +6704,7 @@
           <w:sz w:val="22"/>
           <w:szCs w:val="22"/>
         </w:rPr>
-        <w:t xml:space="preserve"> is determined by </w:t>
+        <w:t xml:space="preserve"> — the system derives the rejection root cause from the audit step recorded at the point of rejection, and resolves it when the request is raised. Only </w:t>
       </w:r>
       <w:r>
         <w:rPr>
@@ -6640,7 +6715,7 @@
           <w:sz w:val="22"/>
           <w:szCs w:val="22"/>
         </w:rPr>
-        <w:t xml:space="preserve">how it became Rejected</w:t>
+        <w:t xml:space="preserve">Credit-root-cause</w:t>
       </w:r>
       <w:r>
         <w:rPr>
@@ -6651,7 +6726,7 @@
           <w:sz w:val="22"/>
           <w:szCs w:val="22"/>
         </w:rPr>
-        <w:t xml:space="preserve"> — the system derives it from the audit step recorded at the point of rejection, and resolves it when the request is raised. Re-entry is </w:t>
+        <w:t xml:space="preserve"> rejections are revertible, so in this scope the target is always </w:t>
       </w:r>
       <w:r>
         <w:rPr>
@@ -6662,7 +6737,7 @@
           <w:sz w:val="22"/>
           <w:szCs w:val="22"/>
         </w:rPr>
-        <w:t xml:space="preserve">always at Level 1</w:t>
+        <w:t xml:space="preserve">‘Awaiting Credit Approval’ — Credit Queue Level 1</w:t>
       </w:r>
       <w:r>
         <w:rPr>
@@ -6673,7 +6748,7 @@
           <w:sz w:val="22"/>
           <w:szCs w:val="22"/>
         </w:rPr>
-        <w:t xml:space="preserve"> of the target queue, regardless of the level the rejection occurred at; the case then escalates through levels under the standard queue rules. No new data capture is required:</w:t>
+        <w:t xml:space="preserve">; the case then escalates through levels under the standard queue rules. No new data capture is required:</w:t>
       </w:r>
     </w:p>
     <w:tbl>
@@ -6966,7 +7041,7 @@
                 <w:sz w:val="21"/>
                 <w:szCs w:val="21"/>
               </w:rPr>
-              <w:t xml:space="preserve">Compliance Reject</w:t>
+              <w:t xml:space="preserve">{Safety net for Finance DBR}</w:t>
             </w:r>
           </w:p>
         </w:tc>
@@ -6995,7 +7070,7 @@
                 <w:sz w:val="21"/>
                 <w:szCs w:val="21"/>
               </w:rPr>
-              <w:t xml:space="preserve">Compliance user rejects in Compliance Queue L1–L2</w:t>
+              <w:t xml:space="preserve">System — Existing DBR &gt; 50% after calculation</w:t>
             </w:r>
           </w:p>
         </w:tc>
@@ -7024,7 +7099,7 @@
                 <w:sz w:val="21"/>
                 <w:szCs w:val="21"/>
               </w:rPr>
-              <w:t xml:space="preserve">Yes</w:t>
+              <w:t xml:space="preserve">Via parking change below</w:t>
             </w:r>
           </w:p>
         </w:tc>
@@ -7053,7 +7128,7 @@
                 <w:sz w:val="21"/>
                 <w:szCs w:val="21"/>
               </w:rPr>
-              <w:t xml:space="preserve">Awaiting Compliance Review — Compliance Queue L1</w:t>
+              <w:t xml:space="preserve">Awaiting Credit Approval — Credit Queue L1</w:t>
             </w:r>
           </w:p>
         </w:tc>
@@ -7087,7 +7162,7 @@
                 <w:sz w:val="21"/>
                 <w:szCs w:val="21"/>
               </w:rPr>
-              <w:t xml:space="preserve">Risk Reject</w:t>
+              <w:t xml:space="preserve">{Safety net for Gross DBR}</w:t>
             </w:r>
           </w:p>
         </w:tc>
@@ -7116,7 +7191,7 @@
                 <w:sz w:val="21"/>
                 <w:szCs w:val="21"/>
               </w:rPr>
-              <w:t xml:space="preserve">Risk user rejects in Risk Queue L1–L3</w:t>
+              <w:t xml:space="preserve">System — Gross DBR &gt; 100%</w:t>
             </w:r>
           </w:p>
         </w:tc>
@@ -7145,7 +7220,7 @@
                 <w:sz w:val="21"/>
                 <w:szCs w:val="21"/>
               </w:rPr>
-              <w:t xml:space="preserve">Yes</w:t>
+              <w:t xml:space="preserve">Via parking change below</w:t>
             </w:r>
           </w:p>
         </w:tc>
@@ -7174,7 +7249,7 @@
                 <w:sz w:val="21"/>
                 <w:szCs w:val="21"/>
               </w:rPr>
-              <w:t xml:space="preserve">Awaiting Risk Review — Risk Queue L1</w:t>
+              <w:t xml:space="preserve">Awaiting Credit Approval — Credit Queue L1</w:t>
             </w:r>
           </w:p>
         </w:tc>
@@ -7208,7 +7283,7 @@
                 <w:sz w:val="21"/>
                 <w:szCs w:val="21"/>
               </w:rPr>
-              <w:t xml:space="preserve">Sale Reject</w:t>
+              <w:t xml:space="preserve">{Fail Strategies Check}</w:t>
             </w:r>
           </w:p>
         </w:tc>
@@ -7237,7 +7312,7 @@
                 <w:sz w:val="21"/>
                 <w:szCs w:val="21"/>
               </w:rPr>
-              <w:t xml:space="preserve">Sales user rejects in Sale Queue</w:t>
+              <w:t xml:space="preserve">System — fails all segmentations (logic unchanged)</w:t>
             </w:r>
           </w:p>
         </w:tc>
@@ -7266,7 +7341,7 @@
                 <w:sz w:val="21"/>
                 <w:szCs w:val="21"/>
               </w:rPr>
-              <w:t xml:space="preserve">TBC</w:t>
+              <w:t xml:space="preserve">Yes</w:t>
             </w:r>
           </w:p>
         </w:tc>
@@ -7295,7 +7370,7 @@
                 <w:sz w:val="21"/>
                 <w:szCs w:val="21"/>
               </w:rPr>
-              <w:t xml:space="preserve">Awaiting Sales Response (Open Questions #4)</w:t>
+              <w:t xml:space="preserve">Awaiting Credit Approval — Credit Queue L1</w:t>
             </w:r>
           </w:p>
         </w:tc>
@@ -7329,7 +7404,7 @@
                 <w:sz w:val="21"/>
                 <w:szCs w:val="21"/>
               </w:rPr>
-              <w:t xml:space="preserve">{Safety net for Finance DBR}</w:t>
+              <w:t xml:space="preserve">Approval Limit Result = “Failed”</w:t>
             </w:r>
           </w:p>
         </w:tc>
@@ -7358,7 +7433,7 @@
                 <w:sz w:val="21"/>
                 <w:szCs w:val="21"/>
               </w:rPr>
-              <w:t xml:space="preserve">System — Existing DBR &gt; 50% after calculation</w:t>
+              <w:t xml:space="preserve">System — approved limit &lt; Min Boundary, no deviation (logic unchanged)</w:t>
             </w:r>
           </w:p>
         </w:tc>
@@ -7387,7 +7462,7 @@
                 <w:sz w:val="21"/>
                 <w:szCs w:val="21"/>
               </w:rPr>
-              <w:t xml:space="preserve">Via parking change below</w:t>
+              <w:t xml:space="preserve">Yes</w:t>
             </w:r>
           </w:p>
         </w:tc>
@@ -7450,7 +7525,7 @@
                 <w:sz w:val="21"/>
                 <w:szCs w:val="21"/>
               </w:rPr>
-              <w:t xml:space="preserve">{Fail Strategies Check}</w:t>
+              <w:t xml:space="preserve">Compliance Reject</w:t>
             </w:r>
           </w:p>
         </w:tc>
@@ -7479,7 +7554,7 @@
                 <w:sz w:val="21"/>
                 <w:szCs w:val="21"/>
               </w:rPr>
-              <w:t xml:space="preserve">System — fails all segmentations (logic unchanged)</w:t>
+              <w:t xml:space="preserve">Compliance user rejects in Compliance Queue L1–L2</w:t>
             </w:r>
           </w:p>
         </w:tc>
@@ -7508,7 +7583,7 @@
                 <w:sz w:val="21"/>
                 <w:szCs w:val="21"/>
               </w:rPr>
-              <w:t xml:space="preserve">Yes</w:t>
+              <w:t xml:space="preserve">No — out of scope</w:t>
             </w:r>
           </w:p>
         </w:tc>
@@ -7537,7 +7612,7 @@
                 <w:sz w:val="21"/>
                 <w:szCs w:val="21"/>
               </w:rPr>
-              <w:t xml:space="preserve">Awaiting Credit Approval — Credit Queue L1</w:t>
+              <w:t xml:space="preserve">— (no Credit root cause)</w:t>
             </w:r>
           </w:p>
         </w:tc>
@@ -7571,7 +7646,7 @@
                 <w:sz w:val="21"/>
                 <w:szCs w:val="21"/>
               </w:rPr>
-              <w:t xml:space="preserve">Approval Limit Result = “Failed”</w:t>
+              <w:t xml:space="preserve">Risk Reject</w:t>
             </w:r>
           </w:p>
         </w:tc>
@@ -7600,7 +7675,7 @@
                 <w:sz w:val="21"/>
                 <w:szCs w:val="21"/>
               </w:rPr>
-              <w:t xml:space="preserve">System — approved limit &lt; Min Boundary, no deviation (logic unchanged)</w:t>
+              <w:t xml:space="preserve">Risk user rejects in Risk Queue L1–L3</w:t>
             </w:r>
           </w:p>
         </w:tc>
@@ -7629,7 +7704,7 @@
                 <w:sz w:val="21"/>
                 <w:szCs w:val="21"/>
               </w:rPr>
-              <w:t xml:space="preserve">Yes</w:t>
+              <w:t xml:space="preserve">No — out of scope</w:t>
             </w:r>
           </w:p>
         </w:tc>
@@ -7658,7 +7733,128 @@
                 <w:sz w:val="21"/>
                 <w:szCs w:val="21"/>
               </w:rPr>
-              <w:t xml:space="preserve">Awaiting Credit Approval — Credit Queue L1</w:t>
+              <w:t xml:space="preserve">— (no Credit root cause)</w:t>
+            </w:r>
+          </w:p>
+        </w:tc>
+      </w:tr>
+      <w:tr>
+        <w:trPr>
+          <w:cantSplit/>
+        </w:trPr>
+        <w:tc>
+          <w:tcPr>
+            <w:tcW w:type="dxa" w:w="2347"/>
+            <w:shd w:fill="FFFFFF" w:color="auto" w:val="clear"/>
+            <w:tcMar>
+              <w:top w:type="dxa" w:w="90"/>
+              <w:left w:type="dxa" w:w="110"/>
+              <w:bottom w:type="dxa" w:w="90"/>
+              <w:right w:type="dxa" w:w="110"/>
+            </w:tcMar>
+            <w:vAlign w:val="top"/>
+          </w:tcPr>
+          <w:p>
+            <w:pPr>
+              <w:spacing w:after="0" w:before="0" w:line="252"/>
+            </w:pPr>
+            <w:r>
+              <w:rPr>
+                <w:rFonts w:ascii="Arial" w:cs="Arial" w:eastAsia="Arial" w:hAnsi="Arial"/>
+                <w:b w:val="false"/>
+                <w:bCs w:val="false"/>
+                <w:color w:val="000000"/>
+                <w:sz w:val="21"/>
+                <w:szCs w:val="21"/>
+              </w:rPr>
+              <w:t xml:space="preserve">Sale Reject</w:t>
+            </w:r>
+          </w:p>
+        </w:tc>
+        <w:tc>
+          <w:tcPr>
+            <w:tcW w:type="dxa" w:w="2527"/>
+            <w:shd w:fill="FFFFFF" w:color="auto" w:val="clear"/>
+            <w:tcMar>
+              <w:top w:type="dxa" w:w="90"/>
+              <w:left w:type="dxa" w:w="110"/>
+              <w:bottom w:type="dxa" w:w="90"/>
+              <w:right w:type="dxa" w:w="110"/>
+            </w:tcMar>
+            <w:vAlign w:val="top"/>
+          </w:tcPr>
+          <w:p>
+            <w:pPr>
+              <w:spacing w:after="0" w:before="0" w:line="252"/>
+            </w:pPr>
+            <w:r>
+              <w:rPr>
+                <w:rFonts w:ascii="Arial" w:cs="Arial" w:eastAsia="Arial" w:hAnsi="Arial"/>
+                <w:b w:val="false"/>
+                <w:bCs w:val="false"/>
+                <w:color w:val="000000"/>
+                <w:sz w:val="21"/>
+                <w:szCs w:val="21"/>
+              </w:rPr>
+              <w:t xml:space="preserve">Sales user rejects in Sale Queue</w:t>
+            </w:r>
+          </w:p>
+        </w:tc>
+        <w:tc>
+          <w:tcPr>
+            <w:tcW w:type="dxa" w:w="1264"/>
+            <w:shd w:fill="FFFFFF" w:color="auto" w:val="clear"/>
+            <w:tcMar>
+              <w:top w:type="dxa" w:w="90"/>
+              <w:left w:type="dxa" w:w="110"/>
+              <w:bottom w:type="dxa" w:w="90"/>
+              <w:right w:type="dxa" w:w="110"/>
+            </w:tcMar>
+            <w:vAlign w:val="top"/>
+          </w:tcPr>
+          <w:p>
+            <w:pPr>
+              <w:spacing w:after="0" w:before="0" w:line="252"/>
+            </w:pPr>
+            <w:r>
+              <w:rPr>
+                <w:rFonts w:ascii="Arial" w:cs="Arial" w:eastAsia="Arial" w:hAnsi="Arial"/>
+                <w:b w:val="false"/>
+                <w:bCs w:val="false"/>
+                <w:color w:val="000000"/>
+                <w:sz w:val="21"/>
+                <w:szCs w:val="21"/>
+              </w:rPr>
+              <w:t xml:space="preserve">No — out of scope</w:t>
+            </w:r>
+          </w:p>
+        </w:tc>
+        <w:tc>
+          <w:tcPr>
+            <w:tcW w:type="dxa" w:w="2888"/>
+            <w:shd w:fill="FFFFFF" w:color="auto" w:val="clear"/>
+            <w:tcMar>
+              <w:top w:type="dxa" w:w="90"/>
+              <w:left w:type="dxa" w:w="110"/>
+              <w:bottom w:type="dxa" w:w="90"/>
+              <w:right w:type="dxa" w:w="110"/>
+            </w:tcMar>
+            <w:vAlign w:val="top"/>
+          </w:tcPr>
+          <w:p>
+            <w:pPr>
+              <w:spacing w:after="0" w:before="0" w:line="252"/>
+            </w:pPr>
+            <w:r>
+              <w:rPr>
+                <w:rFonts w:ascii="Arial" w:cs="Arial" w:eastAsia="Arial" w:hAnsi="Arial"/>
+                <w:b w:val="false"/>
+                <w:bCs w:val="false"/>
+                <w:color w:val="000000"/>
+                <w:sz w:val="21"/>
+                <w:szCs w:val="21"/>
+              </w:rPr>
+              <w:t xml:space="preserve">—</w:t>
             </w:r>
           </w:p>
         </w:tc>
@@ -7814,7 +8010,7 @@
           <w:sz w:val="22"/>
           <w:szCs w:val="22"/>
         </w:rPr>
-        <w:t xml:space="preserve"> Today, Existing DBR &gt; 50% after calculation auto-rejects the application with Action by = &lt;system&gt;, leaving no previous queue status to restore. The system shall instead </w:t>
+        <w:t xml:space="preserve"> Today, a breach of the DBR safety nets — </w:t>
       </w:r>
       <w:r>
         <w:rPr>
@@ -7825,7 +8021,7 @@
           <w:sz w:val="22"/>
           <w:szCs w:val="22"/>
         </w:rPr>
-        <w:t xml:space="preserve">park the case into Credit Queue L1</w:t>
+        <w:t xml:space="preserve">Existing DBR &gt; 50%</w:t>
       </w:r>
       <w:r>
         <w:rPr>
@@ -7836,7 +8032,7 @@
           <w:sz w:val="22"/>
           <w:szCs w:val="22"/>
         </w:rPr>
-        <w:t xml:space="preserve"> (‘Awaiting Credit Approval’): the </w:t>
+        <w:t xml:space="preserve"> after calculation, or </w:t>
       </w:r>
       <w:r>
         <w:rPr>
@@ -7847,7 +8043,7 @@
           <w:sz w:val="22"/>
           <w:szCs w:val="22"/>
         </w:rPr>
-        <w:t xml:space="preserve">Failed Reason continues to show the same message</w:t>
+        <w:t xml:space="preserve">Gross DBR &gt; 100%</w:t>
       </w:r>
       <w:r>
         <w:rPr>
@@ -7858,7 +8054,7 @@
           <w:sz w:val="22"/>
           <w:szCs w:val="22"/>
         </w:rPr>
-        <w:t xml:space="preserve"> as the current auto-rejection, and the system shall </w:t>
+        <w:t xml:space="preserve"> — auto-rejects the application with Action by = &lt;system&gt;, leaving no previous queue status to restore. The system shall instead </w:t>
       </w:r>
       <w:r>
         <w:rPr>
@@ -7869,7 +8065,7 @@
           <w:sz w:val="22"/>
           <w:szCs w:val="22"/>
         </w:rPr>
-        <w:t xml:space="preserve">complete the Rule Engine run and Limit Assignment</w:t>
+        <w:t xml:space="preserve">park the case into Credit Queue L1</w:t>
       </w:r>
       <w:r>
         <w:rPr>
@@ -7880,7 +8076,51 @@
           <w:sz w:val="22"/>
           <w:szCs w:val="22"/>
         </w:rPr>
-        <w:t xml:space="preserve"> so the RE result and limit-assignment result are available in the Credit Queue view — the Credit user must have enough information to decide. If the Credit user then rejects the case, that rejection carries a named owner and is revertible under the standard rule (row 1). This parking applies to every DBR breach, not only cases later reverted — Credit Queue volume impact should be sized during estimation.</w:t>
+        <w:t xml:space="preserve"> (‘Awaiting Credit Approval’) for both safety nets: the </w:t>
+      </w:r>
+      <w:r>
+        <w:rPr>
+          <w:rFonts w:ascii="Arial" w:cs="Arial" w:eastAsia="Arial" w:hAnsi="Arial"/>
+          <w:b/>
+          <w:bCs/>
+          <w:color w:val="000000"/>
+          <w:sz w:val="22"/>
+          <w:szCs w:val="22"/>
+        </w:rPr>
+        <w:t xml:space="preserve">Failed Reason continues to show the same message</w:t>
+      </w:r>
+      <w:r>
+        <w:rPr>
+          <w:rFonts w:ascii="Arial" w:cs="Arial" w:eastAsia="Arial" w:hAnsi="Arial"/>
+          <w:b w:val="false"/>
+          <w:bCs w:val="false"/>
+          <w:color w:val="000000"/>
+          <w:sz w:val="22"/>
+          <w:szCs w:val="22"/>
+        </w:rPr>
+        <w:t xml:space="preserve"> as the current auto-rejection, and the system shall </w:t>
+      </w:r>
+      <w:r>
+        <w:rPr>
+          <w:rFonts w:ascii="Arial" w:cs="Arial" w:eastAsia="Arial" w:hAnsi="Arial"/>
+          <w:b/>
+          <w:bCs/>
+          <w:color w:val="000000"/>
+          <w:sz w:val="22"/>
+          <w:szCs w:val="22"/>
+        </w:rPr>
+        <w:t xml:space="preserve">complete the Rule Engine run and Limit Assignment</w:t>
+      </w:r>
+      <w:r>
+        <w:rPr>
+          <w:rFonts w:ascii="Arial" w:cs="Arial" w:eastAsia="Arial" w:hAnsi="Arial"/>
+          <w:b w:val="false"/>
+          <w:bCs w:val="false"/>
+          <w:color w:val="000000"/>
+          <w:sz w:val="22"/>
+          <w:szCs w:val="22"/>
+        </w:rPr>
+        <w:t xml:space="preserve"> so the RE result and limit-assignment result are available in the Credit Queue view — the Credit user must have enough information to decide. If the Credit user then rejects the case, that rejection carries a named owner and is revertible under the standard rule (row 1). This parking applies to every safety-net breach, not only cases later reverted — Credit Queue volume impact should be sized during estimation.</w:t>
       </w:r>
     </w:p>
     <w:p>
@@ -8042,7 +8282,7 @@
           <w:sz w:val="22"/>
           <w:szCs w:val="22"/>
         </w:rPr>
-        <w:t xml:space="preserve"> the 30-day re-application window shall run from the </w:t>
+        <w:t xml:space="preserve"> the 30-day re-application window </w:t>
       </w:r>
       <w:r>
         <w:rPr>
@@ -8053,7 +8293,7 @@
           <w:sz w:val="22"/>
           <w:szCs w:val="22"/>
         </w:rPr>
-        <w:t xml:space="preserve">latest</w:t>
+        <w:t xml:space="preserve">restarts from the latest rejection</w:t>
       </w:r>
       <w:r>
         <w:rPr>
@@ -8064,7 +8304,7 @@
           <w:sz w:val="22"/>
           <w:szCs w:val="22"/>
         </w:rPr>
-        <w:t xml:space="preserve"> rejection (to be confirmed).</w:t>
+        <w:t xml:space="preserve"> — the countdown begins again at the new rejection date.</w:t>
       </w:r>
     </w:p>
     <w:p>
@@ -8085,7 +8325,7 @@
           <w:sz w:val="22"/>
           <w:szCs w:val="22"/>
         </w:rPr>
-        <w:t xml:space="preserve">Customer communication:</w:t>
+        <w:t xml:space="preserve">Customer communication — final confirmation only:</w:t>
       </w:r>
       <w:r>
         <w:rPr>
@@ -8096,9 +8336,298 @@
           <w:sz w:val="22"/>
           <w:szCs w:val="22"/>
         </w:rPr>
-        <w:t xml:space="preserve"> the customer already received the rejection email at the point of decision. No customer notification of the reopen is proposed for v1 — the customer is informed again only when the re-decision completes (to be confirmed).</w:t>
+        <w:t xml:space="preserve"> the customer already received the rejection notification at the point of decision and is </w:t>
+      </w:r>
+      <w:r>
+        <w:rPr>
+          <w:rFonts w:ascii="Arial" w:cs="Arial" w:eastAsia="Arial" w:hAnsi="Arial"/>
+          <w:b/>
+          <w:bCs/>
+          <w:color w:val="000000"/>
+          <w:sz w:val="22"/>
+          <w:szCs w:val="22"/>
+        </w:rPr>
+        <w:t xml:space="preserve">not</w:t>
+      </w:r>
+      <w:r>
+        <w:rPr>
+          <w:rFonts w:ascii="Arial" w:cs="Arial" w:eastAsia="Arial" w:hAnsi="Arial"/>
+          <w:b w:val="false"/>
+          <w:bCs w:val="false"/>
+          <w:color w:val="000000"/>
+          <w:sz w:val="22"/>
+          <w:szCs w:val="22"/>
+        </w:rPr>
+        <w:t xml:space="preserve"> notified of the reopen. The customer is informed only when the re-assessment completes: on approval, the customer receives the approval communication below — the same message as a normally approved application; on a repeat rejection, the standard rejection notification applies and the 30-day window restarts.</w:t>
       </w:r>
     </w:p>
+    <w:p>
+      <w:pPr>
+        <w:spacing w:after="60"/>
+      </w:pPr>
+    </w:p>
+    <w:tbl>
+      <w:tblPr>
+        <w:tblW w:type="dxa" w:w="9026"/>
+        <w:tblBorders>
+          <w:top w:val="single" w:color="A6A6A6" w:sz="4"/>
+          <w:left w:val="single" w:color="A6A6A6" w:sz="4"/>
+          <w:bottom w:val="single" w:color="A6A6A6" w:sz="4"/>
+          <w:right w:val="single" w:color="A6A6A6" w:sz="4"/>
+          <w:insideH w:val="single" w:color="A6A6A6" w:sz="4"/>
+          <w:insideV w:val="single" w:color="A6A6A6" w:sz="4"/>
+        </w:tblBorders>
+      </w:tblPr>
+      <w:tblGrid>
+        <w:gridCol w:w="1354"/>
+        <w:gridCol w:w="1986"/>
+        <w:gridCol w:w="3610"/>
+        <w:gridCol w:w="2076"/>
+      </w:tblGrid>
+      <w:tr>
+        <w:trPr>
+          <w:cantSplit/>
+          <w:tblHeader/>
+        </w:trPr>
+        <w:tc>
+          <w:tcPr>
+            <w:tcW w:type="dxa" w:w="1354"/>
+            <w:shd w:fill="156082" w:color="auto" w:val="clear"/>
+            <w:tcMar>
+              <w:top w:type="dxa" w:w="90"/>
+              <w:left w:type="dxa" w:w="110"/>
+              <w:bottom w:type="dxa" w:w="90"/>
+              <w:right w:type="dxa" w:w="110"/>
+            </w:tcMar>
+            <w:vAlign w:val="top"/>
+          </w:tcPr>
+          <w:p>
+            <w:pPr>
+              <w:spacing w:after="0" w:before="0" w:line="252"/>
+            </w:pPr>
+            <w:r>
+              <w:rPr>
+                <w:rFonts w:ascii="Arial" w:cs="Arial" w:eastAsia="Arial" w:hAnsi="Arial"/>
+                <w:b/>
+                <w:bCs/>
+                <w:color w:val="FFFFFF"/>
+                <w:sz w:val="21"/>
+                <w:szCs w:val="21"/>
+              </w:rPr>
+              <w:t xml:space="preserve">Type</w:t>
+            </w:r>
+          </w:p>
+        </w:tc>
+        <w:tc>
+          <w:tcPr>
+            <w:tcW w:type="dxa" w:w="1986"/>
+            <w:shd w:fill="156082" w:color="auto" w:val="clear"/>
+            <w:tcMar>
+              <w:top w:type="dxa" w:w="90"/>
+              <w:left w:type="dxa" w:w="110"/>
+              <w:bottom w:type="dxa" w:w="90"/>
+              <w:right w:type="dxa" w:w="110"/>
+            </w:tcMar>
+            <w:vAlign w:val="top"/>
+          </w:tcPr>
+          <w:p>
+            <w:pPr>
+              <w:spacing w:after="0" w:before="0" w:line="252"/>
+            </w:pPr>
+            <w:r>
+              <w:rPr>
+                <w:rFonts w:ascii="Arial" w:cs="Arial" w:eastAsia="Arial" w:hAnsi="Arial"/>
+                <w:b/>
+                <w:bCs/>
+                <w:color w:val="FFFFFF"/>
+                <w:sz w:val="21"/>
+                <w:szCs w:val="21"/>
+              </w:rPr>
+              <w:t xml:space="preserve">Subject</w:t>
+            </w:r>
+          </w:p>
+        </w:tc>
+        <w:tc>
+          <w:tcPr>
+            <w:tcW w:type="dxa" w:w="3610"/>
+            <w:shd w:fill="156082" w:color="auto" w:val="clear"/>
+            <w:tcMar>
+              <w:top w:type="dxa" w:w="90"/>
+              <w:left w:type="dxa" w:w="110"/>
+              <w:bottom w:type="dxa" w:w="90"/>
+              <w:right w:type="dxa" w:w="110"/>
+            </w:tcMar>
+            <w:vAlign w:val="top"/>
+          </w:tcPr>
+          <w:p>
+            <w:pPr>
+              <w:spacing w:after="0" w:before="0" w:line="252"/>
+            </w:pPr>
+            <w:r>
+              <w:rPr>
+                <w:rFonts w:ascii="Arial" w:cs="Arial" w:eastAsia="Arial" w:hAnsi="Arial"/>
+                <w:b/>
+                <w:bCs/>
+                <w:color w:val="FFFFFF"/>
+                <w:sz w:val="21"/>
+                <w:szCs w:val="21"/>
+              </w:rPr>
+              <w:t xml:space="preserve">Content</w:t>
+            </w:r>
+          </w:p>
+        </w:tc>
+        <w:tc>
+          <w:tcPr>
+            <w:tcW w:type="dxa" w:w="2076"/>
+            <w:shd w:fill="156082" w:color="auto" w:val="clear"/>
+            <w:tcMar>
+              <w:top w:type="dxa" w:w="90"/>
+              <w:left w:type="dxa" w:w="110"/>
+              <w:bottom w:type="dxa" w:w="90"/>
+              <w:right w:type="dxa" w:w="110"/>
+            </w:tcMar>
+            <w:vAlign w:val="top"/>
+          </w:tcPr>
+          <w:p>
+            <w:pPr>
+              <w:spacing w:after="0" w:before="0" w:line="252"/>
+            </w:pPr>
+            <w:r>
+              <w:rPr>
+                <w:rFonts w:ascii="Arial" w:cs="Arial" w:eastAsia="Arial" w:hAnsi="Arial"/>
+                <w:b/>
+                <w:bCs/>
+                <w:color w:val="FFFFFF"/>
+                <w:sz w:val="21"/>
+                <w:szCs w:val="21"/>
+              </w:rPr>
+              <w:t xml:space="preserve">Trigger</w:t>
+            </w:r>
+          </w:p>
+        </w:tc>
+      </w:tr>
+      <w:tr>
+        <w:trPr>
+          <w:cantSplit/>
+        </w:trPr>
+        <w:tc>
+          <w:tcPr>
+            <w:tcW w:type="dxa" w:w="1354"/>
+            <w:shd w:fill="FFFFFF" w:color="auto" w:val="clear"/>
+            <w:tcMar>
+              <w:top w:type="dxa" w:w="90"/>
+              <w:left w:type="dxa" w:w="110"/>
+              <w:bottom w:type="dxa" w:w="90"/>
+              <w:right w:type="dxa" w:w="110"/>
+            </w:tcMar>
+            <w:vAlign w:val="top"/>
+          </w:tcPr>
+          <w:p>
+            <w:pPr>
+              <w:spacing w:after="0" w:before="0" w:line="252"/>
+            </w:pPr>
+            <w:r>
+              <w:rPr>
+                <w:rFonts w:ascii="Arial" w:cs="Arial" w:eastAsia="Arial" w:hAnsi="Arial"/>
+                <w:b w:val="false"/>
+                <w:bCs w:val="false"/>
+                <w:color w:val="000000"/>
+                <w:sz w:val="21"/>
+                <w:szCs w:val="21"/>
+              </w:rPr>
+              <w:t xml:space="preserve">Email (Customer)</w:t>
+            </w:r>
+          </w:p>
+        </w:tc>
+        <w:tc>
+          <w:tcPr>
+            <w:tcW w:type="dxa" w:w="1986"/>
+            <w:shd w:fill="FFFFFF" w:color="auto" w:val="clear"/>
+            <w:tcMar>
+              <w:top w:type="dxa" w:w="90"/>
+              <w:left w:type="dxa" w:w="110"/>
+              <w:bottom w:type="dxa" w:w="90"/>
+              <w:right w:type="dxa" w:w="110"/>
+            </w:tcMar>
+            <w:vAlign w:val="top"/>
+          </w:tcPr>
+          <w:p>
+            <w:pPr>
+              <w:spacing w:after="0" w:before="0" w:line="252"/>
+            </w:pPr>
+            <w:r>
+              <w:rPr>
+                <w:rFonts w:ascii="Arial" w:cs="Arial" w:eastAsia="Arial" w:hAnsi="Arial"/>
+                <w:b w:val="false"/>
+                <w:bCs w:val="false"/>
+                <w:color w:val="000000"/>
+                <w:sz w:val="21"/>
+                <w:szCs w:val="21"/>
+              </w:rPr>
+              <w:t xml:space="preserve">Reem Bank — Update on your application %%APPLICATION_ID%%</w:t>
+            </w:r>
+          </w:p>
+        </w:tc>
+        <w:tc>
+          <w:tcPr>
+            <w:tcW w:type="dxa" w:w="3610"/>
+            <w:shd w:fill="FFFFFF" w:color="auto" w:val="clear"/>
+            <w:tcMar>
+              <w:top w:type="dxa" w:w="90"/>
+              <w:left w:type="dxa" w:w="110"/>
+              <w:bottom w:type="dxa" w:w="90"/>
+              <w:right w:type="dxa" w:w="110"/>
+            </w:tcMar>
+            <w:vAlign w:val="top"/>
+          </w:tcPr>
+          <w:p>
+            <w:pPr>
+              <w:spacing w:after="0" w:before="0" w:line="252"/>
+            </w:pPr>
+            <w:r>
+              <w:rPr>
+                <w:rFonts w:ascii="Arial" w:cs="Arial" w:eastAsia="Arial" w:hAnsi="Arial"/>
+                <w:b w:val="false"/>
+                <w:bCs w:val="false"/>
+                <w:color w:val="000000"/>
+                <w:sz w:val="21"/>
+                <w:szCs w:val="21"/>
+              </w:rPr>
+              <w:t xml:space="preserve">Dear %%CUSTOMER_NAME%%, Following a further review of your %%PRODUCT_TYPE%% application %%APPLICATION_ID%%, we are pleased to inform you that your application has been approved. No action is required from your side — we will be in touch with the next steps to complete your application. Thank you for choosing Reem Bank. Best Regards, Reem Bank</w:t>
+            </w:r>
+          </w:p>
+        </w:tc>
+        <w:tc>
+          <w:tcPr>
+            <w:tcW w:type="dxa" w:w="2076"/>
+            <w:shd w:fill="FFFFFF" w:color="auto" w:val="clear"/>
+            <w:tcMar>
+              <w:top w:type="dxa" w:w="90"/>
+              <w:left w:type="dxa" w:w="110"/>
+              <w:bottom w:type="dxa" w:w="90"/>
+              <w:right w:type="dxa" w:w="110"/>
+            </w:tcMar>
+            <w:vAlign w:val="top"/>
+          </w:tcPr>
+          <w:p>
+            <w:pPr>
+              <w:spacing w:after="0" w:before="0" w:line="252"/>
+            </w:pPr>
+            <w:r>
+              <w:rPr>
+                <w:rFonts w:ascii="Arial" w:cs="Arial" w:eastAsia="Arial" w:hAnsi="Arial"/>
+                <w:b w:val="false"/>
+                <w:bCs w:val="false"/>
+                <w:color w:val="000000"/>
+                <w:sz w:val="21"/>
+                <w:szCs w:val="21"/>
+              </w:rPr>
+              <w:t xml:space="preserve">One time — when an application reopened via an approved revert is approved after re-assessment. New Customer-type template in Communication Setup, mirroring the standard approval message.</w:t>
+            </w:r>
+          </w:p>
+        </w:tc>
+      </w:tr>
+    </w:tbl>
     <w:p>
       <w:pPr>
         <w:pStyle w:val="Heading2"/>
@@ -9094,7 +9623,7 @@
                 <w:sz w:val="21"/>
                 <w:szCs w:val="21"/>
               </w:rPr>
-              <w:t xml:space="preserve">Queue User (Credit / Compliance / Risk)</w:t>
+              <w:t xml:space="preserve">Queue User (Credit)</w:t>
             </w:r>
           </w:p>
         </w:tc>
@@ -9152,7 +9681,7 @@
                 <w:sz w:val="21"/>
                 <w:szCs w:val="21"/>
               </w:rPr>
-              <w:t xml:space="preserve">&lt;Target Status&gt;</w:t>
+              <w:t xml:space="preserve">Awaiting Credit Approval</w:t>
             </w:r>
           </w:p>
         </w:tc>
@@ -9181,7 +9710,7 @@
                 <w:sz w:val="21"/>
                 <w:szCs w:val="21"/>
               </w:rPr>
-              <w:t xml:space="preserve">Application re-decisioned against the currently published credit policy</w:t>
+              <w:t xml:space="preserve">Application re-decisioned against the currently published credit policy; on approval the customer receives the approval communication (section 6), on rejection the 30-day window restarts</w:t>
             </w:r>
           </w:p>
         </w:tc>
@@ -9426,7 +9955,7 @@
                 <w:sz w:val="21"/>
                 <w:szCs w:val="21"/>
               </w:rPr>
-              <w:t xml:space="preserve">One new queue (Revert Queue) in the Queue menu and the Manually Queue role section. The drop-points matrix gains a new entry (approved revert → target queue at L1), plus the DBR parking → Credit Queue L1, which increases Credit Queue volume for every breach — not only reverted cases. DBR-parked cases must carry the completed Rule Engine and Limit Assignment results into the queue view.</w:t>
+              <w:t xml:space="preserve">One new queue (Revert Queue) in the Queue menu and the Manually Queue role section. The drop-points matrix gains a new entry (approved revert → Credit Queue L1), plus the parking of both DBR safety nets (Existing DBR &gt; 50% and Gross DBR &gt; 100%) → Credit Queue L1, which increases Credit Queue volume for every breach — not only reverted cases. Parked cases must carry the completed Rule Engine and Limit Assignment results into the queue view.</w:t>
             </w:r>
           </w:p>
         </w:tc>
@@ -9615,7 +10144,7 @@
                 <w:sz w:val="21"/>
                 <w:szCs w:val="21"/>
               </w:rPr>
-              <w:t xml:space="preserve">Two new Bank-type email templates per product (approved / not approved), English only, signing off as Reem Bank. Existing queue-reject confirmation texts become inaccurate where rejection is revertible — Compliance currently reads “This action can not be revert” and Risk reads “the application will be terminated after you reject it!” — and must be re-worded.</w:t>
+              <w:t xml:space="preserve">Two new Bank-type email templates per product (revert approved / not approved) plus one new Customer-type template — approval after re-assessment, mirroring the standard approval message (section 6). English, banking tone, signing off as Reem Bank. The Compliance / Risk reject confirmation texts stay as they are — those rejections remain non-revertible.</w:t>
             </w:r>
           </w:p>
         </w:tc>
@@ -10033,7 +10562,7 @@
                 <w:sz w:val="21"/>
                 <w:szCs w:val="21"/>
               </w:rPr>
-              <w:t xml:space="preserve">Is the Gross DBR &gt; 100% safety net also in scope for parking to Credit Queue, or does it remain a hard auto-rejection? (Existing DBR &gt; 50% parking is confirmed.)</w:t>
+              <w:t xml:space="preserve">Confirm the timeout period [X] — 5 days proposed, configurable in database, same as cancellation.</w:t>
             </w:r>
           </w:p>
         </w:tc>
@@ -10097,384 +10626,6 @@
                 <w:szCs w:val="21"/>
               </w:rPr>
               <w:t xml:space="preserve">Confirm the Revert_App flag with Application Status remaining “Rejected”, in preference to a new ‘User Initiated Revert’ status (zero mobile-app impact).</w:t>
-            </w:r>
-          </w:p>
-        </w:tc>
-      </w:tr>
-      <w:tr>
-        <w:trPr>
-          <w:cantSplit/>
-        </w:trPr>
-        <w:tc>
-          <w:tcPr>
-            <w:tcW w:type="dxa" w:w="542"/>
-            <w:shd w:fill="FFFFFF" w:color="auto" w:val="clear"/>
-            <w:tcMar>
-              <w:top w:type="dxa" w:w="90"/>
-              <w:left w:type="dxa" w:w="110"/>
-              <w:bottom w:type="dxa" w:w="90"/>
-              <w:right w:type="dxa" w:w="110"/>
-            </w:tcMar>
-            <w:vAlign w:val="top"/>
-          </w:tcPr>
-          <w:p>
-            <w:pPr>
-              <w:spacing w:after="0" w:before="0" w:line="252"/>
-            </w:pPr>
-            <w:r>
-              <w:rPr>
-                <w:rFonts w:ascii="Arial" w:cs="Arial" w:eastAsia="Arial" w:hAnsi="Arial"/>
-                <w:b w:val="false"/>
-                <w:bCs w:val="false"/>
-                <w:color w:val="000000"/>
-                <w:sz w:val="21"/>
-                <w:szCs w:val="21"/>
-              </w:rPr>
-              <w:t xml:space="preserve">4</w:t>
-            </w:r>
-          </w:p>
-        </w:tc>
-        <w:tc>
-          <w:tcPr>
-            <w:tcW w:type="dxa" w:w="8484"/>
-            <w:shd w:fill="FFFFFF" w:color="auto" w:val="clear"/>
-            <w:tcMar>
-              <w:top w:type="dxa" w:w="90"/>
-              <w:left w:type="dxa" w:w="110"/>
-              <w:bottom w:type="dxa" w:w="90"/>
-              <w:right w:type="dxa" w:w="110"/>
-            </w:tcMar>
-            <w:vAlign w:val="top"/>
-          </w:tcPr>
-          <w:p>
-            <w:pPr>
-              <w:spacing w:after="0" w:before="0" w:line="252"/>
-            </w:pPr>
-            <w:r>
-              <w:rPr>
-                <w:rFonts w:ascii="Arial" w:cs="Arial" w:eastAsia="Arial" w:hAnsi="Arial"/>
-                <w:b w:val="false"/>
-                <w:bCs w:val="false"/>
-                <w:color w:val="000000"/>
-                <w:sz w:val="21"/>
-                <w:szCs w:val="21"/>
-              </w:rPr>
-              <w:t xml:space="preserve">Are Sale Queue rejections revertible to ‘Awaiting Sales Response’, or deliberately excluded?</w:t>
-            </w:r>
-          </w:p>
-        </w:tc>
-      </w:tr>
-      <w:tr>
-        <w:trPr>
-          <w:cantSplit/>
-        </w:trPr>
-        <w:tc>
-          <w:tcPr>
-            <w:tcW w:type="dxa" w:w="542"/>
-            <w:shd w:fill="FFFFFF" w:color="auto" w:val="clear"/>
-            <w:tcMar>
-              <w:top w:type="dxa" w:w="90"/>
-              <w:left w:type="dxa" w:w="110"/>
-              <w:bottom w:type="dxa" w:w="90"/>
-              <w:right w:type="dxa" w:w="110"/>
-            </w:tcMar>
-            <w:vAlign w:val="top"/>
-          </w:tcPr>
-          <w:p>
-            <w:pPr>
-              <w:spacing w:after="0" w:before="0" w:line="252"/>
-            </w:pPr>
-            <w:r>
-              <w:rPr>
-                <w:rFonts w:ascii="Arial" w:cs="Arial" w:eastAsia="Arial" w:hAnsi="Arial"/>
-                <w:b w:val="false"/>
-                <w:bCs w:val="false"/>
-                <w:color w:val="000000"/>
-                <w:sz w:val="21"/>
-                <w:szCs w:val="21"/>
-              </w:rPr>
-              <w:t xml:space="preserve">5</w:t>
-            </w:r>
-          </w:p>
-        </w:tc>
-        <w:tc>
-          <w:tcPr>
-            <w:tcW w:type="dxa" w:w="8484"/>
-            <w:shd w:fill="FFFFFF" w:color="auto" w:val="clear"/>
-            <w:tcMar>
-              <w:top w:type="dxa" w:w="90"/>
-              <w:left w:type="dxa" w:w="110"/>
-              <w:bottom w:type="dxa" w:w="90"/>
-              <w:right w:type="dxa" w:w="110"/>
-            </w:tcMar>
-            <w:vAlign w:val="top"/>
-          </w:tcPr>
-          <w:p>
-            <w:pPr>
-              <w:spacing w:after="0" w:before="0" w:line="252"/>
-            </w:pPr>
-            <w:r>
-              <w:rPr>
-                <w:rFonts w:ascii="Arial" w:cs="Arial" w:eastAsia="Arial" w:hAnsi="Arial"/>
-                <w:b w:val="false"/>
-                <w:bCs w:val="false"/>
-                <w:color w:val="000000"/>
-                <w:sz w:val="21"/>
-                <w:szCs w:val="21"/>
-              </w:rPr>
-              <w:t xml:space="preserve">Confirm the timeout period [X] — 5 days proposed, configurable in database, same as cancellation.</w:t>
-            </w:r>
-          </w:p>
-        </w:tc>
-      </w:tr>
-      <w:tr>
-        <w:trPr>
-          <w:cantSplit/>
-        </w:trPr>
-        <w:tc>
-          <w:tcPr>
-            <w:tcW w:type="dxa" w:w="542"/>
-            <w:shd w:fill="FFFFFF" w:color="auto" w:val="clear"/>
-            <w:tcMar>
-              <w:top w:type="dxa" w:w="90"/>
-              <w:left w:type="dxa" w:w="110"/>
-              <w:bottom w:type="dxa" w:w="90"/>
-              <w:right w:type="dxa" w:w="110"/>
-            </w:tcMar>
-            <w:vAlign w:val="top"/>
-          </w:tcPr>
-          <w:p>
-            <w:pPr>
-              <w:spacing w:after="0" w:before="0" w:line="252"/>
-            </w:pPr>
-            <w:r>
-              <w:rPr>
-                <w:rFonts w:ascii="Arial" w:cs="Arial" w:eastAsia="Arial" w:hAnsi="Arial"/>
-                <w:b w:val="false"/>
-                <w:bCs w:val="false"/>
-                <w:color w:val="000000"/>
-                <w:sz w:val="21"/>
-                <w:szCs w:val="21"/>
-              </w:rPr>
-              <w:t xml:space="preserve">6</w:t>
-            </w:r>
-          </w:p>
-        </w:tc>
-        <w:tc>
-          <w:tcPr>
-            <w:tcW w:type="dxa" w:w="8484"/>
-            <w:shd w:fill="FFFFFF" w:color="auto" w:val="clear"/>
-            <w:tcMar>
-              <w:top w:type="dxa" w:w="90"/>
-              <w:left w:type="dxa" w:w="110"/>
-              <w:bottom w:type="dxa" w:w="90"/>
-              <w:right w:type="dxa" w:w="110"/>
-            </w:tcMar>
-            <w:vAlign w:val="top"/>
-          </w:tcPr>
-          <w:p>
-            <w:pPr>
-              <w:spacing w:after="0" w:before="0" w:line="252"/>
-            </w:pPr>
-            <w:r>
-              <w:rPr>
-                <w:rFonts w:ascii="Arial" w:cs="Arial" w:eastAsia="Arial" w:hAnsi="Arial"/>
-                <w:b w:val="false"/>
-                <w:bCs w:val="false"/>
-                <w:color w:val="000000"/>
-                <w:sz w:val="21"/>
-                <w:szCs w:val="21"/>
-              </w:rPr>
-              <w:t xml:space="preserve">Should the customer be notified when an application is reopened? (The rejection email has already been sent at the point of decision.)</w:t>
-            </w:r>
-          </w:p>
-        </w:tc>
-      </w:tr>
-      <w:tr>
-        <w:trPr>
-          <w:cantSplit/>
-        </w:trPr>
-        <w:tc>
-          <w:tcPr>
-            <w:tcW w:type="dxa" w:w="542"/>
-            <w:shd w:fill="FFFFFF" w:color="auto" w:val="clear"/>
-            <w:tcMar>
-              <w:top w:type="dxa" w:w="90"/>
-              <w:left w:type="dxa" w:w="110"/>
-              <w:bottom w:type="dxa" w:w="90"/>
-              <w:right w:type="dxa" w:w="110"/>
-            </w:tcMar>
-            <w:vAlign w:val="top"/>
-          </w:tcPr>
-          <w:p>
-            <w:pPr>
-              <w:spacing w:after="0" w:before="0" w:line="252"/>
-            </w:pPr>
-            <w:r>
-              <w:rPr>
-                <w:rFonts w:ascii="Arial" w:cs="Arial" w:eastAsia="Arial" w:hAnsi="Arial"/>
-                <w:b w:val="false"/>
-                <w:bCs w:val="false"/>
-                <w:color w:val="000000"/>
-                <w:sz w:val="21"/>
-                <w:szCs w:val="21"/>
-              </w:rPr>
-              <w:t xml:space="preserve">7</w:t>
-            </w:r>
-          </w:p>
-        </w:tc>
-        <w:tc>
-          <w:tcPr>
-            <w:tcW w:type="dxa" w:w="8484"/>
-            <w:shd w:fill="FFFFFF" w:color="auto" w:val="clear"/>
-            <w:tcMar>
-              <w:top w:type="dxa" w:w="90"/>
-              <w:left w:type="dxa" w:w="110"/>
-              <w:bottom w:type="dxa" w:w="90"/>
-              <w:right w:type="dxa" w:w="110"/>
-            </w:tcMar>
-            <w:vAlign w:val="top"/>
-          </w:tcPr>
-          <w:p>
-            <w:pPr>
-              <w:spacing w:after="0" w:before="0" w:line="252"/>
-            </w:pPr>
-            <w:r>
-              <w:rPr>
-                <w:rFonts w:ascii="Arial" w:cs="Arial" w:eastAsia="Arial" w:hAnsi="Arial"/>
-                <w:b w:val="false"/>
-                <w:bCs w:val="false"/>
-                <w:color w:val="000000"/>
-                <w:sz w:val="21"/>
-                <w:szCs w:val="21"/>
-              </w:rPr>
-              <w:t xml:space="preserve">Does the 30-day re-application window restart from the latest rejection when a reverted application is rejected again?</w:t>
-            </w:r>
-          </w:p>
-        </w:tc>
-      </w:tr>
-      <w:tr>
-        <w:trPr>
-          <w:cantSplit/>
-        </w:trPr>
-        <w:tc>
-          <w:tcPr>
-            <w:tcW w:type="dxa" w:w="542"/>
-            <w:shd w:fill="FFFFFF" w:color="auto" w:val="clear"/>
-            <w:tcMar>
-              <w:top w:type="dxa" w:w="90"/>
-              <w:left w:type="dxa" w:w="110"/>
-              <w:bottom w:type="dxa" w:w="90"/>
-              <w:right w:type="dxa" w:w="110"/>
-            </w:tcMar>
-            <w:vAlign w:val="top"/>
-          </w:tcPr>
-          <w:p>
-            <w:pPr>
-              <w:spacing w:after="0" w:before="0" w:line="252"/>
-            </w:pPr>
-            <w:r>
-              <w:rPr>
-                <w:rFonts w:ascii="Arial" w:cs="Arial" w:eastAsia="Arial" w:hAnsi="Arial"/>
-                <w:b w:val="false"/>
-                <w:bCs w:val="false"/>
-                <w:color w:val="000000"/>
-                <w:sz w:val="21"/>
-                <w:szCs w:val="21"/>
-              </w:rPr>
-              <w:t xml:space="preserve">8</w:t>
-            </w:r>
-          </w:p>
-        </w:tc>
-        <w:tc>
-          <w:tcPr>
-            <w:tcW w:type="dxa" w:w="8484"/>
-            <w:shd w:fill="FFFFFF" w:color="auto" w:val="clear"/>
-            <w:tcMar>
-              <w:top w:type="dxa" w:w="90"/>
-              <w:left w:type="dxa" w:w="110"/>
-              <w:bottom w:type="dxa" w:w="90"/>
-              <w:right w:type="dxa" w:w="110"/>
-            </w:tcMar>
-            <w:vAlign w:val="top"/>
-          </w:tcPr>
-          <w:p>
-            <w:pPr>
-              <w:spacing w:after="0" w:before="0" w:line="252"/>
-            </w:pPr>
-            <w:r>
-              <w:rPr>
-                <w:rFonts w:ascii="Arial" w:cs="Arial" w:eastAsia="Arial" w:hAnsi="Arial"/>
-                <w:b w:val="false"/>
-                <w:bCs w:val="false"/>
-                <w:color w:val="000000"/>
-                <w:sz w:val="21"/>
-                <w:szCs w:val="21"/>
-              </w:rPr>
-              <w:t xml:space="preserve">Should the number of reverts per application, or a revert time window (e.g. within 30 days of rejection), be capped?</w:t>
-            </w:r>
-          </w:p>
-        </w:tc>
-      </w:tr>
-      <w:tr>
-        <w:trPr>
-          <w:cantSplit/>
-        </w:trPr>
-        <w:tc>
-          <w:tcPr>
-            <w:tcW w:type="dxa" w:w="542"/>
-            <w:shd w:fill="FFFFFF" w:color="auto" w:val="clear"/>
-            <w:tcMar>
-              <w:top w:type="dxa" w:w="90"/>
-              <w:left w:type="dxa" w:w="110"/>
-              <w:bottom w:type="dxa" w:w="90"/>
-              <w:right w:type="dxa" w:w="110"/>
-            </w:tcMar>
-            <w:vAlign w:val="top"/>
-          </w:tcPr>
-          <w:p>
-            <w:pPr>
-              <w:spacing w:after="0" w:before="0" w:line="252"/>
-            </w:pPr>
-            <w:r>
-              <w:rPr>
-                <w:rFonts w:ascii="Arial" w:cs="Arial" w:eastAsia="Arial" w:hAnsi="Arial"/>
-                <w:b w:val="false"/>
-                <w:bCs w:val="false"/>
-                <w:color w:val="000000"/>
-                <w:sz w:val="21"/>
-                <w:szCs w:val="21"/>
-              </w:rPr>
-              <w:t xml:space="preserve">9</w:t>
-            </w:r>
-          </w:p>
-        </w:tc>
-        <w:tc>
-          <w:tcPr>
-            <w:tcW w:type="dxa" w:w="8484"/>
-            <w:shd w:fill="FFFFFF" w:color="auto" w:val="clear"/>
-            <w:tcMar>
-              <w:top w:type="dxa" w:w="90"/>
-              <w:left w:type="dxa" w:w="110"/>
-              <w:bottom w:type="dxa" w:w="90"/>
-              <w:right w:type="dxa" w:w="110"/>
-            </w:tcMar>
-            <w:vAlign w:val="top"/>
-          </w:tcPr>
-          <w:p>
-            <w:pPr>
-              <w:spacing w:after="0" w:before="0" w:line="252"/>
-            </w:pPr>
-            <w:r>
-              <w:rPr>
-                <w:rFonts w:ascii="Arial" w:cs="Arial" w:eastAsia="Arial" w:hAnsi="Arial"/>
-                <w:b w:val="false"/>
-                <w:bCs w:val="false"/>
-                <w:color w:val="000000"/>
-                <w:sz w:val="21"/>
-                <w:szCs w:val="21"/>
-              </w:rPr>
-              <w:t xml:space="preserve">Confirm the revised wording for the Compliance / Risk reject confirmation messages once rejection becomes revertible.</w:t>
             </w:r>
           </w:p>
         </w:tc>

</xml_diff>

<commit_message>
Add SC6 checker screen, restore timeout per RF-2365, concrete target status
New SC6 composite (Revert Queue application details with Approve/Reject,
REVERT REASON comment shown, Edit/FTS/Send/Override removed) built over
the real Credit Queue capture. The timeout AC returns, verified against
the cancellation source (RF-2365 AC2.3, auto-action after [X]=5 days,
audit step mirroring 'Auto Cancellation on timeout'). All post-revert
outcomes now state the concrete transition: status changes from
'Rejected' to 'Awaiting Credit Approval' and the case re-enters Credit
Queue at Level 1.

Co-Authored-By: Claude Fable 5 <noreply@anthropic.com>
Claude-Session: https://claude.ai/code/session_01GMyQEZm7CauvpgScBFz4Cf
</commit_message>
<xml_diff>
--- a/docs/brd/Appro_RF_Application_Revert_in_Super_Portal_v1.0.docx
+++ b/docs/brd/Appro_RF_Application_Revert_in_Super_Portal_v1.0.docx
@@ -459,7 +459,29 @@
           <w:sz w:val="22"/>
           <w:szCs w:val="22"/>
         </w:rPr>
-        <w:t xml:space="preserve"> — the same timeout behaviour as Application Cancellation. For example, if a timeout period is defined as 5 days, when there is no approve/ reject decision for a revert request in Revert Queue, the system approves the request and the application returns to its target queue.</w:t>
+        <w:t xml:space="preserve"> — the same timeout behaviour as Application Cancellation. For example, if a timeout period is defined as 5 days, when there is no approve/ reject decision for a revert request in Revert Queue, the system approves the request and the application status changes from 'Rejected' to </w:t>
+      </w:r>
+      <w:r>
+        <w:rPr>
+          <w:rFonts w:ascii="Arial" w:cs="Arial" w:eastAsia="Arial" w:hAnsi="Arial"/>
+          <w:b/>
+          <w:bCs/>
+          <w:color w:val="000000"/>
+          <w:sz w:val="22"/>
+          <w:szCs w:val="22"/>
+        </w:rPr>
+        <w:t xml:space="preserve">'Awaiting Credit Approval'</w:t>
+      </w:r>
+      <w:r>
+        <w:rPr>
+          <w:rFonts w:ascii="Arial" w:cs="Arial" w:eastAsia="Arial" w:hAnsi="Arial"/>
+          <w:b w:val="false"/>
+          <w:bCs w:val="false"/>
+          <w:color w:val="000000"/>
+          <w:sz w:val="22"/>
+          <w:szCs w:val="22"/>
+        </w:rPr>
+        <w:t xml:space="preserve"> (Credit Queue L1).</w:t>
       </w:r>
     </w:p>
     <w:p>
@@ -4561,7 +4583,7 @@
           <w:sz w:val="22"/>
           <w:szCs w:val="22"/>
         </w:rPr>
-        <w:t xml:space="preserve"> are resolved per section 5 at submission time and stored on the request. Re-entry is always at </w:t>
+        <w:t xml:space="preserve"> are resolved per section 5 at submission time and stored on the request — in this scope always </w:t>
       </w:r>
       <w:r>
         <w:rPr>
@@ -4572,7 +4594,7 @@
           <w:sz w:val="22"/>
           <w:szCs w:val="22"/>
         </w:rPr>
-        <w:t xml:space="preserve">Level 1</w:t>
+        <w:t xml:space="preserve">'Awaiting Credit Approval' — Credit Queue Level 1</w:t>
       </w:r>
       <w:r>
         <w:rPr>
@@ -4583,7 +4605,7 @@
           <w:sz w:val="22"/>
           <w:szCs w:val="22"/>
         </w:rPr>
-        <w:t xml:space="preserve"> of the target queue.</w:t>
+        <w:t xml:space="preserve">.</w:t>
       </w:r>
     </w:p>
     <w:p>
@@ -4637,7 +4659,7 @@
           <w:sz w:val="22"/>
           <w:szCs w:val="22"/>
         </w:rPr>
-        <w:t xml:space="preserve">'Revert requested by %Username% to &lt;TARGET_QUEUE&gt;. Revert reason is &lt;REVERT_REASON captured above&gt;'</w:t>
+        <w:t xml:space="preserve">'Revert requested by %Username% to Credit Queue. Revert reason is &lt;REVERT_REASON captured above&gt;'</w:t>
       </w:r>
       <w:r>
         <w:rPr>
@@ -5391,6 +5413,67 @@
     </w:p>
     <w:p>
       <w:pPr>
+        <w:spacing w:after="60" w:before="120"/>
+        <w:jc w:val="center"/>
+      </w:pPr>
+      <w:r>
+        <w:drawing>
+          <wp:inline distT="0" distB="0" distL="0" distR="0">
+            <wp:extent cx="5715000" cy="3219450"/>
+            <wp:effectExtent t="0" r="0" b="0" l="0"/>
+            <wp:docPr id="1" name="" descr="" title=""/>
+            <wp:cNvGraphicFramePr>
+              <a:graphicFrameLocks xmlns:a="http://schemas.openxmlformats.org/drawingml/2006/main" noChangeAspect="1"/>
+            </wp:cNvGraphicFramePr>
+            <a:graphic xmlns:a="http://schemas.openxmlformats.org/drawingml/2006/main">
+              <a:graphicData uri="http://schemas.openxmlformats.org/drawingml/2006/picture">
+                <pic:pic xmlns:pic="http://schemas.openxmlformats.org/drawingml/2006/picture">
+                  <pic:nvPicPr>
+                    <pic:cNvPr id="0" name="" descr=""/>
+                    <pic:cNvPicPr>
+                      <a:picLocks noChangeAspect="1" noChangeArrowheads="1"/>
+                    </pic:cNvPicPr>
+                  </pic:nvPicPr>
+                  <pic:blipFill>
+                    <a:blip r:embed="rId18" cstate="none"/>
+                    <a:srcRect/>
+                    <a:stretch>
+                      <a:fillRect/>
+                    </a:stretch>
+                  </pic:blipFill>
+                  <pic:spPr bwMode="auto">
+                    <a:xfrm>
+                      <a:off x="0" y="0"/>
+                      <a:ext cx="5715000" cy="3219450"/>
+                    </a:xfrm>
+                    <a:prstGeom prst="rect">
+                      <a:avLst/>
+                    </a:prstGeom>
+                  </pic:spPr>
+                </pic:pic>
+              </a:graphicData>
+            </a:graphic>
+          </wp:inline>
+        </w:drawing>
+      </w:r>
+    </w:p>
+    <w:p>
+      <w:pPr>
+        <w:spacing w:after="220" w:before="0"/>
+        <w:jc w:val="center"/>
+      </w:pPr>
+      <w:r>
+        <w:rPr>
+          <w:rFonts w:ascii="Arial" w:cs="Arial" w:eastAsia="Arial" w:hAnsi="Arial"/>
+          <w:color w:val="000000"/>
+          <w:sz w:val="22"/>
+          <w:szCs w:val="22"/>
+        </w:rPr>
+        <w:t xml:space="preserve">SC6: Revert Queue — Application Details with Approve / Reject</w:t>
+      </w:r>
+    </w:p>
+    <w:p>
+      <w:pPr>
         <w:spacing w:after="120" w:before="40" w:line="264"/>
       </w:pPr>
       <w:r>
@@ -5486,7 +5569,7 @@
           <w:sz w:val="22"/>
           <w:szCs w:val="22"/>
         </w:rPr>
-        <w:t xml:space="preserve">Application Status = </w:t>
+        <w:t xml:space="preserve">Application Status changes from "Rejected" to </w:t>
       </w:r>
       <w:r>
         <w:rPr>
@@ -5497,7 +5580,7 @@
           <w:sz w:val="22"/>
           <w:szCs w:val="22"/>
         </w:rPr>
-        <w:t xml:space="preserve">&lt;TARGET_STATUS&gt;</w:t>
+        <w:t xml:space="preserve">"Awaiting Credit Approval"</w:t>
       </w:r>
       <w:r>
         <w:rPr>
@@ -5519,7 +5602,7 @@
           <w:sz w:val="22"/>
           <w:szCs w:val="22"/>
         </w:rPr>
-        <w:t xml:space="preserve">&lt;TARGET_QUEUE&gt;</w:t>
+        <w:t xml:space="preserve">Credit Queue at Level 1</w:t>
       </w:r>
       <w:r>
         <w:rPr>
@@ -5530,7 +5613,7 @@
           <w:sz w:val="22"/>
           <w:szCs w:val="22"/>
         </w:rPr>
-        <w:t xml:space="preserve"> at Level 1 (section 5). Revert_App = FALSE.</w:t>
+        <w:t xml:space="preserve"> (section 5). Revert_App = FALSE.</w:t>
       </w:r>
     </w:p>
     <w:p>
@@ -5572,7 +5655,7 @@
           <w:sz w:val="22"/>
           <w:szCs w:val="22"/>
         </w:rPr>
-        <w:t xml:space="preserve">Audit trail is captured with: Step = 'Revert Queue', State = &lt;TARGET_STATUS&gt;, Step Detail = 'Application revert requested by “%Username%” and approved by “%Username%”. Application returned to &lt;TARGET_QUEUE&gt;', Action by = &lt;System&gt;.</w:t>
+        <w:t xml:space="preserve">Audit trail is captured with: Step = 'Revert Queue', State = 'Awaiting Credit Approval', Step Detail = 'Application revert requested by “%Username%” and approved by “%Username%”. Application returned to Credit Queue L1', Action by = &lt;System&gt;.</w:t>
       </w:r>
     </w:p>
     <w:p>
@@ -5823,7 +5906,7 @@
                 <w:sz w:val="21"/>
                 <w:szCs w:val="21"/>
               </w:rPr>
-              <w:t xml:space="preserve">Dear %%USER_NAME%%, Please be informed that your request to revert the application %%APPLICATION_ID%% has been approved. The application has been returned to %%TARGET_STATUS%%. Best Regards, Reem Bank</w:t>
+              <w:t xml:space="preserve">Dear %%USER_NAME%%, Please be informed that your request to revert the application %%APPLICATION_ID%% has been approved. The application status has changed from 'Rejected' to 'Awaiting Credit Approval' and the application has been returned to Credit Queue. Best Regards, Reem Bank</w:t>
             </w:r>
           </w:p>
         </w:tc>
@@ -6498,7 +6581,7 @@
                 <w:sz w:val="21"/>
                 <w:szCs w:val="21"/>
               </w:rPr>
-              <w:t xml:space="preserve">Application returned to &lt;TARGET_STATUS&gt; in &lt;TARGET_QUEUE&gt; at Level 1. Please refer to 4.3 above.</w:t>
+              <w:t xml:space="preserve">Application status changes from 'Rejected' to 'Awaiting Credit Approval' and the application re-enters Credit Queue at Level 1. Please refer to 4.3 above.</w:t>
             </w:r>
           </w:p>
         </w:tc>
@@ -6646,7 +6729,51 @@
                 <w:sz w:val="21"/>
                 <w:szCs w:val="21"/>
               </w:rPr>
-              <w:t xml:space="preserve"> the next day after the timeout period ends — the same behaviour as the Application Cancellation timeout. The application returns to &lt;TARGET_STATUS&gt; in &lt;TARGET_QUEUE&gt; at Level 1, Revert_App = FALSE, and it is removed from the Revert Queue. Audit trail is captured with: Step = ‘Auto Revert Approval on timeout’, State = &lt;TARGET_STATUS&gt;, Step Detail = ‘Application revert requested by “%Username%” and approved by System, as per approval timeout configuration of [X] days. Application returned to &lt;TARGET_QUEUE&gt;’, Action by = &lt;System&gt;. Email notification is sent to the bank user who requested the revert — same email as in 4.3.</w:t>
+              <w:t xml:space="preserve"> the next day after the timeout period ends — the same behaviour as the Application Cancellation timeout. Application status changes from 'Rejected' to </w:t>
+            </w:r>
+            <w:r>
+              <w:rPr>
+                <w:rFonts w:ascii="Arial" w:cs="Arial" w:eastAsia="Arial" w:hAnsi="Arial"/>
+                <w:b/>
+                <w:bCs/>
+                <w:color w:val="000000"/>
+                <w:sz w:val="21"/>
+                <w:szCs w:val="21"/>
+              </w:rPr>
+              <w:t xml:space="preserve">'Awaiting Credit Approval'</w:t>
+            </w:r>
+            <w:r>
+              <w:rPr>
+                <w:rFonts w:ascii="Arial" w:cs="Arial" w:eastAsia="Arial" w:hAnsi="Arial"/>
+                <w:b w:val="false"/>
+                <w:bCs w:val="false"/>
+                <w:color w:val="000000"/>
+                <w:sz w:val="21"/>
+                <w:szCs w:val="21"/>
+              </w:rPr>
+              <w:t xml:space="preserve">, the application re-enters </w:t>
+            </w:r>
+            <w:r>
+              <w:rPr>
+                <w:rFonts w:ascii="Arial" w:cs="Arial" w:eastAsia="Arial" w:hAnsi="Arial"/>
+                <w:b/>
+                <w:bCs/>
+                <w:color w:val="000000"/>
+                <w:sz w:val="21"/>
+                <w:szCs w:val="21"/>
+              </w:rPr>
+              <w:t xml:space="preserve">Credit Queue at Level 1</w:t>
+            </w:r>
+            <w:r>
+              <w:rPr>
+                <w:rFonts w:ascii="Arial" w:cs="Arial" w:eastAsia="Arial" w:hAnsi="Arial"/>
+                <w:b w:val="false"/>
+                <w:bCs w:val="false"/>
+                <w:color w:val="000000"/>
+                <w:sz w:val="21"/>
+                <w:szCs w:val="21"/>
+              </w:rPr>
+              <w:t xml:space="preserve">, Revert_App = FALSE, and it is removed from the Revert Queue. Audit trail is captured with: Step = ‘Auto Revert Approval on timeout’, State = 'Awaiting Credit Approval', Step Detail = ‘Application revert requested by “%Username%” and approved by System, as per approval timeout configuration of [X] days. Application returned to Credit Queue L1’, Action by = &lt;System&gt;. Email notification is sent to the bank user who requested the revert — same email as in 4.3.</w:t>
             </w:r>
           </w:p>
         </w:tc>
@@ -9231,7 +9358,7 @@
                 <w:sz w:val="21"/>
                 <w:szCs w:val="21"/>
               </w:rPr>
-              <w:t xml:space="preserve">&lt;Target Status&gt;</w:t>
+              <w:t xml:space="preserve">Awaiting Credit Approval</w:t>
             </w:r>
           </w:p>
         </w:tc>
@@ -9260,7 +9387,7 @@
                 <w:sz w:val="21"/>
                 <w:szCs w:val="21"/>
               </w:rPr>
-              <w:t xml:space="preserve">Application re-enters the target queue at Level 1; email notification sent to Maker; application removed from queue</w:t>
+              <w:t xml:space="preserve">Application re-enters Credit Queue at Level 1; email notification sent to Maker; application removed from queue</w:t>
             </w:r>
           </w:p>
         </w:tc>
@@ -9502,7 +9629,7 @@
                 <w:sz w:val="21"/>
                 <w:szCs w:val="21"/>
               </w:rPr>
-              <w:t xml:space="preserve">No checker action within [X] days — request auto-approved (same as cancellation)</w:t>
+              <w:t xml:space="preserve">No checker action within [X] days — request auto-approved (same as cancellation timeout)</w:t>
             </w:r>
           </w:p>
         </w:tc>
@@ -9531,7 +9658,7 @@
                 <w:sz w:val="21"/>
                 <w:szCs w:val="21"/>
               </w:rPr>
-              <w:t xml:space="preserve">&lt;Target Status&gt;</w:t>
+              <w:t xml:space="preserve">Awaiting Credit Approval</w:t>
             </w:r>
           </w:p>
         </w:tc>
@@ -9560,7 +9687,7 @@
                 <w:sz w:val="21"/>
                 <w:szCs w:val="21"/>
               </w:rPr>
-              <w:t xml:space="preserve">Application re-enters the target queue at Level 1; email notification sent to Maker; Revert_App = FALSE</w:t>
+              <w:t xml:space="preserve">Application re-enters Credit Queue at Level 1; email notification sent to Maker; Revert_App = FALSE</w:t>
             </w:r>
           </w:p>
         </w:tc>
@@ -10081,7 +10208,7 @@
                 <w:sz w:val="21"/>
                 <w:szCs w:val="21"/>
               </w:rPr>
-              <w:t xml:space="preserve">Three new audit steps — 'Manual revert process', 'Revert Queue', 'Auto Revert Approval on timeout' — each writing the full standard field set. The original rejection record is never modified.</w:t>
+              <w:t xml:space="preserve">Three new audit steps — 'Manual revert process', 'Revert Queue', 'Auto Revert Approval on timeout' (mirroring cancellation's 'Auto Cancellation on timeout') — each writing the full standard field set. The original rejection record is never modified.</w:t>
             </w:r>
           </w:p>
         </w:tc>
@@ -10562,7 +10689,7 @@
                 <w:sz w:val="21"/>
                 <w:szCs w:val="21"/>
               </w:rPr>
-              <w:t xml:space="preserve">Confirm the timeout period [X] — 5 days proposed, configurable in database, same as cancellation.</w:t>
+              <w:t xml:space="preserve">Confirm the timeout period [X] — 5 days proposed, configurable in database, same as the cancellation timeout (RF source: currently set to 5 days).</w:t>
             </w:r>
           </w:p>
         </w:tc>

</xml_diff>

<commit_message>
Fix blank page 4, label email types, note templates as new in Comm Setup
The forced page break before the end-to-end section produced an empty
page when the restrictions table filled page 3 exactly; the section now
flows naturally. Email tables state the audience explicitly - Email
(Bank) for the requester notifications, Email (Customer) for the
approval-after-re-assessment message - and the impact analysis calls
out that all three templates are newly added in Communication Setup.

Co-Authored-By: Claude Fable 5 <noreply@anthropic.com>
Claude-Session: https://claude.ai/code/session_01GMyQEZm7CauvpgScBFz4Cf
</commit_message>
<xml_diff>
--- a/docs/brd/Appro_RF_Application_Revert_in_Super_Portal_v1.0.docx
+++ b/docs/brd/Appro_RF_Application_Revert_in_Super_Portal_v1.0.docx
@@ -1905,11 +1905,6 @@
       </w:tr>
     </w:tbl>
     <w:p>
-      <w:r>
-        <w:br w:type="page"/>
-      </w:r>
-    </w:p>
-    <w:p>
       <w:pPr>
         <w:pStyle w:val="Heading1"/>
         <w:spacing w:after="140" w:before="300"/>
@@ -5692,10 +5687,10 @@
         </w:tblBorders>
       </w:tblPr>
       <w:tblGrid>
-        <w:gridCol w:w="993"/>
-        <w:gridCol w:w="2257"/>
-        <w:gridCol w:w="3701"/>
-        <w:gridCol w:w="2075"/>
+        <w:gridCol w:w="1354"/>
+        <w:gridCol w:w="1986"/>
+        <w:gridCol w:w="3610"/>
+        <w:gridCol w:w="2076"/>
       </w:tblGrid>
       <w:tr>
         <w:trPr>
@@ -5704,7 +5699,7 @@
         </w:trPr>
         <w:tc>
           <w:tcPr>
-            <w:tcW w:type="dxa" w:w="993"/>
+            <w:tcW w:type="dxa" w:w="1354"/>
             <w:shd w:fill="156082" w:color="auto" w:val="clear"/>
             <w:tcMar>
               <w:top w:type="dxa" w:w="90"/>
@@ -5733,7 +5728,7 @@
         </w:tc>
         <w:tc>
           <w:tcPr>
-            <w:tcW w:type="dxa" w:w="2257"/>
+            <w:tcW w:type="dxa" w:w="1986"/>
             <w:shd w:fill="156082" w:color="auto" w:val="clear"/>
             <w:tcMar>
               <w:top w:type="dxa" w:w="90"/>
@@ -5762,7 +5757,7 @@
         </w:tc>
         <w:tc>
           <w:tcPr>
-            <w:tcW w:type="dxa" w:w="3701"/>
+            <w:tcW w:type="dxa" w:w="3610"/>
             <w:shd w:fill="156082" w:color="auto" w:val="clear"/>
             <w:tcMar>
               <w:top w:type="dxa" w:w="90"/>
@@ -5791,7 +5786,7 @@
         </w:tc>
         <w:tc>
           <w:tcPr>
-            <w:tcW w:type="dxa" w:w="2075"/>
+            <w:tcW w:type="dxa" w:w="2076"/>
             <w:shd w:fill="156082" w:color="auto" w:val="clear"/>
             <w:tcMar>
               <w:top w:type="dxa" w:w="90"/>
@@ -5825,36 +5820,36 @@
         </w:trPr>
         <w:tc>
           <w:tcPr>
-            <w:tcW w:type="dxa" w:w="993"/>
-            <w:shd w:fill="FFFFFF" w:color="auto" w:val="clear"/>
-            <w:tcMar>
-              <w:top w:type="dxa" w:w="90"/>
-              <w:left w:type="dxa" w:w="110"/>
-              <w:bottom w:type="dxa" w:w="90"/>
-              <w:right w:type="dxa" w:w="110"/>
-            </w:tcMar>
-            <w:vAlign w:val="top"/>
-          </w:tcPr>
-          <w:p>
-            <w:pPr>
-              <w:spacing w:after="0" w:before="0" w:line="252"/>
-            </w:pPr>
-            <w:r>
-              <w:rPr>
-                <w:rFonts w:ascii="Arial" w:cs="Arial" w:eastAsia="Arial" w:hAnsi="Arial"/>
-                <w:b w:val="false"/>
-                <w:bCs w:val="false"/>
-                <w:color w:val="000000"/>
-                <w:sz w:val="21"/>
-                <w:szCs w:val="21"/>
-              </w:rPr>
-              <w:t xml:space="preserve">Email</w:t>
-            </w:r>
-          </w:p>
-        </w:tc>
-        <w:tc>
-          <w:tcPr>
-            <w:tcW w:type="dxa" w:w="2257"/>
+            <w:tcW w:type="dxa" w:w="1354"/>
+            <w:shd w:fill="FFFFFF" w:color="auto" w:val="clear"/>
+            <w:tcMar>
+              <w:top w:type="dxa" w:w="90"/>
+              <w:left w:type="dxa" w:w="110"/>
+              <w:bottom w:type="dxa" w:w="90"/>
+              <w:right w:type="dxa" w:w="110"/>
+            </w:tcMar>
+            <w:vAlign w:val="top"/>
+          </w:tcPr>
+          <w:p>
+            <w:pPr>
+              <w:spacing w:after="0" w:before="0" w:line="252"/>
+            </w:pPr>
+            <w:r>
+              <w:rPr>
+                <w:rFonts w:ascii="Arial" w:cs="Arial" w:eastAsia="Arial" w:hAnsi="Arial"/>
+                <w:b w:val="false"/>
+                <w:bCs w:val="false"/>
+                <w:color w:val="000000"/>
+                <w:sz w:val="21"/>
+                <w:szCs w:val="21"/>
+              </w:rPr>
+              <w:t xml:space="preserve">Email (Bank)</w:t>
+            </w:r>
+          </w:p>
+        </w:tc>
+        <w:tc>
+          <w:tcPr>
+            <w:tcW w:type="dxa" w:w="1986"/>
             <w:shd w:fill="FFFFFF" w:color="auto" w:val="clear"/>
             <w:tcMar>
               <w:top w:type="dxa" w:w="90"/>
@@ -5883,7 +5878,7 @@
         </w:tc>
         <w:tc>
           <w:tcPr>
-            <w:tcW w:type="dxa" w:w="3701"/>
+            <w:tcW w:type="dxa" w:w="3610"/>
             <w:shd w:fill="FFFFFF" w:color="auto" w:val="clear"/>
             <w:tcMar>
               <w:top w:type="dxa" w:w="90"/>
@@ -5912,7 +5907,7 @@
         </w:tc>
         <w:tc>
           <w:tcPr>
-            <w:tcW w:type="dxa" w:w="2075"/>
+            <w:tcW w:type="dxa" w:w="2076"/>
             <w:shd w:fill="FFFFFF" w:color="auto" w:val="clear"/>
             <w:tcMar>
               <w:top w:type="dxa" w:w="90"/>
@@ -6161,10 +6156,10 @@
         </w:tblBorders>
       </w:tblPr>
       <w:tblGrid>
-        <w:gridCol w:w="993"/>
-        <w:gridCol w:w="2257"/>
-        <w:gridCol w:w="3701"/>
-        <w:gridCol w:w="2075"/>
+        <w:gridCol w:w="1354"/>
+        <w:gridCol w:w="1986"/>
+        <w:gridCol w:w="3610"/>
+        <w:gridCol w:w="2076"/>
       </w:tblGrid>
       <w:tr>
         <w:trPr>
@@ -6173,7 +6168,7 @@
         </w:trPr>
         <w:tc>
           <w:tcPr>
-            <w:tcW w:type="dxa" w:w="993"/>
+            <w:tcW w:type="dxa" w:w="1354"/>
             <w:shd w:fill="156082" w:color="auto" w:val="clear"/>
             <w:tcMar>
               <w:top w:type="dxa" w:w="90"/>
@@ -6202,7 +6197,7 @@
         </w:tc>
         <w:tc>
           <w:tcPr>
-            <w:tcW w:type="dxa" w:w="2257"/>
+            <w:tcW w:type="dxa" w:w="1986"/>
             <w:shd w:fill="156082" w:color="auto" w:val="clear"/>
             <w:tcMar>
               <w:top w:type="dxa" w:w="90"/>
@@ -6231,7 +6226,7 @@
         </w:tc>
         <w:tc>
           <w:tcPr>
-            <w:tcW w:type="dxa" w:w="3701"/>
+            <w:tcW w:type="dxa" w:w="3610"/>
             <w:shd w:fill="156082" w:color="auto" w:val="clear"/>
             <w:tcMar>
               <w:top w:type="dxa" w:w="90"/>
@@ -6260,7 +6255,7 @@
         </w:tc>
         <w:tc>
           <w:tcPr>
-            <w:tcW w:type="dxa" w:w="2075"/>
+            <w:tcW w:type="dxa" w:w="2076"/>
             <w:shd w:fill="156082" w:color="auto" w:val="clear"/>
             <w:tcMar>
               <w:top w:type="dxa" w:w="90"/>
@@ -6294,36 +6289,36 @@
         </w:trPr>
         <w:tc>
           <w:tcPr>
-            <w:tcW w:type="dxa" w:w="993"/>
-            <w:shd w:fill="FFFFFF" w:color="auto" w:val="clear"/>
-            <w:tcMar>
-              <w:top w:type="dxa" w:w="90"/>
-              <w:left w:type="dxa" w:w="110"/>
-              <w:bottom w:type="dxa" w:w="90"/>
-              <w:right w:type="dxa" w:w="110"/>
-            </w:tcMar>
-            <w:vAlign w:val="top"/>
-          </w:tcPr>
-          <w:p>
-            <w:pPr>
-              <w:spacing w:after="0" w:before="0" w:line="252"/>
-            </w:pPr>
-            <w:r>
-              <w:rPr>
-                <w:rFonts w:ascii="Arial" w:cs="Arial" w:eastAsia="Arial" w:hAnsi="Arial"/>
-                <w:b w:val="false"/>
-                <w:bCs w:val="false"/>
-                <w:color w:val="000000"/>
-                <w:sz w:val="21"/>
-                <w:szCs w:val="21"/>
-              </w:rPr>
-              <w:t xml:space="preserve">Email</w:t>
-            </w:r>
-          </w:p>
-        </w:tc>
-        <w:tc>
-          <w:tcPr>
-            <w:tcW w:type="dxa" w:w="2257"/>
+            <w:tcW w:type="dxa" w:w="1354"/>
+            <w:shd w:fill="FFFFFF" w:color="auto" w:val="clear"/>
+            <w:tcMar>
+              <w:top w:type="dxa" w:w="90"/>
+              <w:left w:type="dxa" w:w="110"/>
+              <w:bottom w:type="dxa" w:w="90"/>
+              <w:right w:type="dxa" w:w="110"/>
+            </w:tcMar>
+            <w:vAlign w:val="top"/>
+          </w:tcPr>
+          <w:p>
+            <w:pPr>
+              <w:spacing w:after="0" w:before="0" w:line="252"/>
+            </w:pPr>
+            <w:r>
+              <w:rPr>
+                <w:rFonts w:ascii="Arial" w:cs="Arial" w:eastAsia="Arial" w:hAnsi="Arial"/>
+                <w:b w:val="false"/>
+                <w:bCs w:val="false"/>
+                <w:color w:val="000000"/>
+                <w:sz w:val="21"/>
+                <w:szCs w:val="21"/>
+              </w:rPr>
+              <w:t xml:space="preserve">Email (Bank)</w:t>
+            </w:r>
+          </w:p>
+        </w:tc>
+        <w:tc>
+          <w:tcPr>
+            <w:tcW w:type="dxa" w:w="1986"/>
             <w:shd w:fill="FFFFFF" w:color="auto" w:val="clear"/>
             <w:tcMar>
               <w:top w:type="dxa" w:w="90"/>
@@ -6352,7 +6347,7 @@
         </w:tc>
         <w:tc>
           <w:tcPr>
-            <w:tcW w:type="dxa" w:w="3701"/>
+            <w:tcW w:type="dxa" w:w="3610"/>
             <w:shd w:fill="FFFFFF" w:color="auto" w:val="clear"/>
             <w:tcMar>
               <w:top w:type="dxa" w:w="90"/>
@@ -6381,7 +6376,7 @@
         </w:tc>
         <w:tc>
           <w:tcPr>
-            <w:tcW w:type="dxa" w:w="2075"/>
+            <w:tcW w:type="dxa" w:w="2076"/>
             <w:shd w:fill="FFFFFF" w:color="auto" w:val="clear"/>
             <w:tcMar>
               <w:top w:type="dxa" w:w="90"/>
@@ -10265,13 +10260,68 @@
             <w:r>
               <w:rPr>
                 <w:rFonts w:ascii="Arial" w:cs="Arial" w:eastAsia="Arial" w:hAnsi="Arial"/>
-                <w:b w:val="false"/>
-                <w:bCs w:val="false"/>
-                <w:color w:val="000000"/>
-                <w:sz w:val="21"/>
-                <w:szCs w:val="21"/>
-              </w:rPr>
-              <w:t xml:space="preserve">Two new Bank-type email templates per product (revert approved / not approved) plus one new Customer-type template — approval after re-assessment, mirroring the standard approval message (section 6). English, banking tone, signing off as Reem Bank. The Compliance / Risk reject confirmation texts stay as they are — those rejections remain non-revertible.</w:t>
+                <w:b/>
+                <w:bCs/>
+                <w:color w:val="000000"/>
+                <w:sz w:val="21"/>
+                <w:szCs w:val="21"/>
+              </w:rPr>
+              <w:t xml:space="preserve">Three templates newly added in Communication Setup:</w:t>
+            </w:r>
+            <w:r>
+              <w:rPr>
+                <w:rFonts w:ascii="Arial" w:cs="Arial" w:eastAsia="Arial" w:hAnsi="Arial"/>
+                <w:b w:val="false"/>
+                <w:bCs w:val="false"/>
+                <w:color w:val="000000"/>
+                <w:sz w:val="21"/>
+                <w:szCs w:val="21"/>
+              </w:rPr>
+              <w:t xml:space="preserve"> two </w:t>
+            </w:r>
+            <w:r>
+              <w:rPr>
+                <w:rFonts w:ascii="Arial" w:cs="Arial" w:eastAsia="Arial" w:hAnsi="Arial"/>
+                <w:b/>
+                <w:bCs/>
+                <w:color w:val="000000"/>
+                <w:sz w:val="21"/>
+                <w:szCs w:val="21"/>
+              </w:rPr>
+              <w:t xml:space="preserve">Email (Bank)</w:t>
+            </w:r>
+            <w:r>
+              <w:rPr>
+                <w:rFonts w:ascii="Arial" w:cs="Arial" w:eastAsia="Arial" w:hAnsi="Arial"/>
+                <w:b w:val="false"/>
+                <w:bCs w:val="false"/>
+                <w:color w:val="000000"/>
+                <w:sz w:val="21"/>
+                <w:szCs w:val="21"/>
+              </w:rPr>
+              <w:t xml:space="preserve"> templates per product (revert approved / not approved) and one </w:t>
+            </w:r>
+            <w:r>
+              <w:rPr>
+                <w:rFonts w:ascii="Arial" w:cs="Arial" w:eastAsia="Arial" w:hAnsi="Arial"/>
+                <w:b/>
+                <w:bCs/>
+                <w:color w:val="000000"/>
+                <w:sz w:val="21"/>
+                <w:szCs w:val="21"/>
+              </w:rPr>
+              <w:t xml:space="preserve">Email (Customer)</w:t>
+            </w:r>
+            <w:r>
+              <w:rPr>
+                <w:rFonts w:ascii="Arial" w:cs="Arial" w:eastAsia="Arial" w:hAnsi="Arial"/>
+                <w:b w:val="false"/>
+                <w:bCs w:val="false"/>
+                <w:color w:val="000000"/>
+                <w:sz w:val="21"/>
+                <w:szCs w:val="21"/>
+              </w:rPr>
+              <w:t xml:space="preserve"> template (approval after re-assessment, mirroring the standard approval message — section 6). English, banking tone, signing off as Reem Bank. The Compliance / Risk reject confirmation texts stay as they are — those rejections remain non-revertible.</w:t>
             </w:r>
           </w:p>
         </w:tc>

</xml_diff>

<commit_message>
List in-scope rejection cases, one client email per re-assessment, dated cover
The feature overview and US now enumerate the five in-scope rejection
cases (R1 Credit user reject, R2 Existing DBR > 50% parking, R3 Gross
DBR > 100% parking, R4 fails all segmentations, R5 limit below Min
Boundary) with the not-revertible set alongside. Per the Credit User
note, the client receives exactly one email at the re-assessment
decision - Approve or Reject - with duplicate decision notifications
suppressed on the reopened run. The cover carries the date under V1.0
so document copies are distinguishable.

Co-Authored-By: Claude Fable 5 <noreply@anthropic.com>
Claude-Session: https://claude.ai/code/session_01GMyQEZm7CauvpgScBFz4Cf
</commit_message>
<xml_diff>
--- a/docs/brd/Appro_RF_Application_Revert_in_Super_Portal_v1.0.docx
+++ b/docs/brd/Appro_RF_Application_Revert_in_Super_Portal_v1.0.docx
@@ -83,7 +83,7 @@
     </w:p>
     <w:p>
       <w:pPr>
-        <w:spacing w:after="200"/>
+        <w:spacing w:after="60"/>
         <w:jc w:val="center"/>
       </w:pPr>
       <w:r>
@@ -96,6 +96,21 @@
           <w:szCs w:val="44"/>
         </w:rPr>
         <w:t xml:space="preserve">V1.0</w:t>
+      </w:r>
+    </w:p>
+    <w:p>
+      <w:pPr>
+        <w:spacing w:after="200"/>
+        <w:jc w:val="center"/>
+      </w:pPr>
+      <w:r>
+        <w:rPr>
+          <w:rFonts w:ascii="Arial" w:cs="Arial" w:eastAsia="Arial" w:hAnsi="Arial"/>
+          <w:color w:val="595959"/>
+          <w:sz w:val="22"/>
+          <w:szCs w:val="22"/>
+        </w:rPr>
+        <w:t xml:space="preserve">18 September 2026</w:t>
       </w:r>
     </w:p>
     <w:p>
@@ -663,7 +678,7 @@
           <w:sz w:val="22"/>
           <w:szCs w:val="22"/>
         </w:rPr>
-        <w:t xml:space="preserve"> (DBR safety nets, segmentation failure, approved limit below Min Boundary). Compliance, Risk and Sale queue rejections are </w:t>
+        <w:t xml:space="preserve">. The </w:t>
       </w:r>
       <w:r>
         <w:rPr>
@@ -674,7 +689,7 @@
           <w:sz w:val="22"/>
           <w:szCs w:val="22"/>
         </w:rPr>
-        <w:t xml:space="preserve">out of scope</w:t>
+        <w:t xml:space="preserve">in-scope rejection cases</w:t>
       </w:r>
       <w:r>
         <w:rPr>
@@ -685,7 +700,348 @@
           <w:sz w:val="22"/>
           <w:szCs w:val="22"/>
         </w:rPr>
+        <w:t xml:space="preserve"> are exactly the following five:</w:t>
+      </w:r>
+    </w:p>
+    <w:p>
+      <w:pPr>
+        <w:pStyle w:val="ListParagraph"/>
+        <w:numPr>
+          <w:ilvl w:val="0"/>
+          <w:numId w:val="1"/>
+        </w:numPr>
+        <w:spacing w:after="80" w:before="30" w:line="264"/>
+      </w:pPr>
+      <w:r>
+        <w:rPr>
+          <w:rFonts w:ascii="Arial" w:cs="Arial" w:eastAsia="Arial" w:hAnsi="Arial"/>
+          <w:b/>
+          <w:bCs/>
+          <w:color w:val="000000"/>
+          <w:sz w:val="22"/>
+          <w:szCs w:val="22"/>
+        </w:rPr>
+        <w:t xml:space="preserve">R1</w:t>
+      </w:r>
+      <w:r>
+        <w:rPr>
+          <w:rFonts w:ascii="Arial" w:cs="Arial" w:eastAsia="Arial" w:hAnsi="Arial"/>
+          <w:b w:val="false"/>
+          <w:bCs w:val="false"/>
+          <w:color w:val="000000"/>
+          <w:sz w:val="22"/>
+          <w:szCs w:val="22"/>
+        </w:rPr>
+        <w:t xml:space="preserve"> — Rejected by </w:t>
+      </w:r>
+      <w:r>
+        <w:rPr>
+          <w:rFonts w:ascii="Arial" w:cs="Arial" w:eastAsia="Arial" w:hAnsi="Arial"/>
+          <w:b/>
+          <w:bCs/>
+          <w:color w:val="000000"/>
+          <w:sz w:val="22"/>
+          <w:szCs w:val="22"/>
+        </w:rPr>
+        <w:t xml:space="preserve">Credit user</w:t>
+      </w:r>
+      <w:r>
+        <w:rPr>
+          <w:rFonts w:ascii="Arial" w:cs="Arial" w:eastAsia="Arial" w:hAnsi="Arial"/>
+          <w:b w:val="false"/>
+          <w:bCs w:val="false"/>
+          <w:color w:val="000000"/>
+          <w:sz w:val="22"/>
+          <w:szCs w:val="22"/>
+        </w:rPr>
+        <w:t xml:space="preserve"> in Credit Queue (L1–L3).</w:t>
+      </w:r>
+    </w:p>
+    <w:p>
+      <w:pPr>
+        <w:pStyle w:val="ListParagraph"/>
+        <w:numPr>
+          <w:ilvl w:val="0"/>
+          <w:numId w:val="1"/>
+        </w:numPr>
+        <w:spacing w:after="80" w:before="30" w:line="264"/>
+      </w:pPr>
+      <w:r>
+        <w:rPr>
+          <w:rFonts w:ascii="Arial" w:cs="Arial" w:eastAsia="Arial" w:hAnsi="Arial"/>
+          <w:b/>
+          <w:bCs/>
+          <w:color w:val="000000"/>
+          <w:sz w:val="22"/>
+          <w:szCs w:val="22"/>
+        </w:rPr>
+        <w:t xml:space="preserve">R2</w:t>
+      </w:r>
+      <w:r>
+        <w:rPr>
+          <w:rFonts w:ascii="Arial" w:cs="Arial" w:eastAsia="Arial" w:hAnsi="Arial"/>
+          <w:b w:val="false"/>
+          <w:bCs w:val="false"/>
+          <w:color w:val="000000"/>
+          <w:sz w:val="22"/>
+          <w:szCs w:val="22"/>
+        </w:rPr>
+        <w:t xml:space="preserve"> — Auto-rejected by System: </w:t>
+      </w:r>
+      <w:r>
+        <w:rPr>
+          <w:rFonts w:ascii="Arial" w:cs="Arial" w:eastAsia="Arial" w:hAnsi="Arial"/>
+          <w:b/>
+          <w:bCs/>
+          <w:color w:val="000000"/>
+          <w:sz w:val="22"/>
+          <w:szCs w:val="22"/>
+        </w:rPr>
+        <w:t xml:space="preserve">Existing DBR &gt; 50%</w:t>
+      </w:r>
+      <w:r>
+        <w:rPr>
+          <w:rFonts w:ascii="Arial" w:cs="Arial" w:eastAsia="Arial" w:hAnsi="Arial"/>
+          <w:b w:val="false"/>
+          <w:bCs w:val="false"/>
+          <w:color w:val="000000"/>
+          <w:sz w:val="22"/>
+          <w:szCs w:val="22"/>
+        </w:rPr>
+        <w:t xml:space="preserve"> after calculation </w:t>
+      </w:r>
+      <w:r>
+        <w:rPr>
+          <w:rFonts w:ascii="Arial" w:cs="Arial" w:eastAsia="Arial" w:hAnsi="Arial"/>
+          <w:i/>
+          <w:iCs/>
+          <w:color w:val="000000"/>
+          <w:sz w:val="22"/>
+          <w:szCs w:val="22"/>
+        </w:rPr>
+        <w:t xml:space="preserve">(parked into Credit Queue L1 under this change; a subsequent Credit rejection is then revertible as R1)</w:t>
+      </w:r>
+      <w:r>
+        <w:rPr>
+          <w:rFonts w:ascii="Arial" w:cs="Arial" w:eastAsia="Arial" w:hAnsi="Arial"/>
+          <w:b w:val="false"/>
+          <w:bCs w:val="false"/>
+          <w:color w:val="000000"/>
+          <w:sz w:val="22"/>
+          <w:szCs w:val="22"/>
+        </w:rPr>
         <w:t xml:space="preserve">.</w:t>
+      </w:r>
+    </w:p>
+    <w:p>
+      <w:pPr>
+        <w:pStyle w:val="ListParagraph"/>
+        <w:numPr>
+          <w:ilvl w:val="0"/>
+          <w:numId w:val="1"/>
+        </w:numPr>
+        <w:spacing w:after="80" w:before="30" w:line="264"/>
+      </w:pPr>
+      <w:r>
+        <w:rPr>
+          <w:rFonts w:ascii="Arial" w:cs="Arial" w:eastAsia="Arial" w:hAnsi="Arial"/>
+          <w:b/>
+          <w:bCs/>
+          <w:color w:val="000000"/>
+          <w:sz w:val="22"/>
+          <w:szCs w:val="22"/>
+        </w:rPr>
+        <w:t xml:space="preserve">R3</w:t>
+      </w:r>
+      <w:r>
+        <w:rPr>
+          <w:rFonts w:ascii="Arial" w:cs="Arial" w:eastAsia="Arial" w:hAnsi="Arial"/>
+          <w:b w:val="false"/>
+          <w:bCs w:val="false"/>
+          <w:color w:val="000000"/>
+          <w:sz w:val="22"/>
+          <w:szCs w:val="22"/>
+        </w:rPr>
+        <w:t xml:space="preserve"> — Auto-rejected by System: </w:t>
+      </w:r>
+      <w:r>
+        <w:rPr>
+          <w:rFonts w:ascii="Arial" w:cs="Arial" w:eastAsia="Arial" w:hAnsi="Arial"/>
+          <w:b/>
+          <w:bCs/>
+          <w:color w:val="000000"/>
+          <w:sz w:val="22"/>
+          <w:szCs w:val="22"/>
+        </w:rPr>
+        <w:t xml:space="preserve">Gross DBR &gt; 100%</w:t>
+      </w:r>
+      <w:r>
+        <w:rPr>
+          <w:rFonts w:ascii="Arial" w:cs="Arial" w:eastAsia="Arial" w:hAnsi="Arial"/>
+          <w:b w:val="false"/>
+          <w:bCs w:val="false"/>
+          <w:color w:val="000000"/>
+          <w:sz w:val="22"/>
+          <w:szCs w:val="22"/>
+        </w:rPr>
+        <w:t xml:space="preserve"> </w:t>
+      </w:r>
+      <w:r>
+        <w:rPr>
+          <w:rFonts w:ascii="Arial" w:cs="Arial" w:eastAsia="Arial" w:hAnsi="Arial"/>
+          <w:i/>
+          <w:iCs/>
+          <w:color w:val="000000"/>
+          <w:sz w:val="22"/>
+          <w:szCs w:val="22"/>
+        </w:rPr>
+        <w:t xml:space="preserve">(same parking treatment as R2)</w:t>
+      </w:r>
+      <w:r>
+        <w:rPr>
+          <w:rFonts w:ascii="Arial" w:cs="Arial" w:eastAsia="Arial" w:hAnsi="Arial"/>
+          <w:b w:val="false"/>
+          <w:bCs w:val="false"/>
+          <w:color w:val="000000"/>
+          <w:sz w:val="22"/>
+          <w:szCs w:val="22"/>
+        </w:rPr>
+        <w:t xml:space="preserve">.</w:t>
+      </w:r>
+    </w:p>
+    <w:p>
+      <w:pPr>
+        <w:pStyle w:val="ListParagraph"/>
+        <w:numPr>
+          <w:ilvl w:val="0"/>
+          <w:numId w:val="1"/>
+        </w:numPr>
+        <w:spacing w:after="80" w:before="30" w:line="264"/>
+      </w:pPr>
+      <w:r>
+        <w:rPr>
+          <w:rFonts w:ascii="Arial" w:cs="Arial" w:eastAsia="Arial" w:hAnsi="Arial"/>
+          <w:b/>
+          <w:bCs/>
+          <w:color w:val="000000"/>
+          <w:sz w:val="22"/>
+          <w:szCs w:val="22"/>
+        </w:rPr>
+        <w:t xml:space="preserve">R4</w:t>
+      </w:r>
+      <w:r>
+        <w:rPr>
+          <w:rFonts w:ascii="Arial" w:cs="Arial" w:eastAsia="Arial" w:hAnsi="Arial"/>
+          <w:b w:val="false"/>
+          <w:bCs w:val="false"/>
+          <w:color w:val="000000"/>
+          <w:sz w:val="22"/>
+          <w:szCs w:val="22"/>
+        </w:rPr>
+        <w:t xml:space="preserve"> — Auto-rejected by System: application </w:t>
+      </w:r>
+      <w:r>
+        <w:rPr>
+          <w:rFonts w:ascii="Arial" w:cs="Arial" w:eastAsia="Arial" w:hAnsi="Arial"/>
+          <w:b/>
+          <w:bCs/>
+          <w:color w:val="000000"/>
+          <w:sz w:val="22"/>
+          <w:szCs w:val="22"/>
+        </w:rPr>
+        <w:t xml:space="preserve">fails all segmentations</w:t>
+      </w:r>
+      <w:r>
+        <w:rPr>
+          <w:rFonts w:ascii="Arial" w:cs="Arial" w:eastAsia="Arial" w:hAnsi="Arial"/>
+          <w:b w:val="false"/>
+          <w:bCs w:val="false"/>
+          <w:color w:val="000000"/>
+          <w:sz w:val="22"/>
+          <w:szCs w:val="22"/>
+        </w:rPr>
+        <w:t xml:space="preserve"> (rejection logic unchanged).</w:t>
+      </w:r>
+    </w:p>
+    <w:p>
+      <w:pPr>
+        <w:pStyle w:val="ListParagraph"/>
+        <w:numPr>
+          <w:ilvl w:val="0"/>
+          <w:numId w:val="1"/>
+        </w:numPr>
+        <w:spacing w:after="80" w:before="30" w:line="264"/>
+      </w:pPr>
+      <w:r>
+        <w:rPr>
+          <w:rFonts w:ascii="Arial" w:cs="Arial" w:eastAsia="Arial" w:hAnsi="Arial"/>
+          <w:b/>
+          <w:bCs/>
+          <w:color w:val="000000"/>
+          <w:sz w:val="22"/>
+          <w:szCs w:val="22"/>
+        </w:rPr>
+        <w:t xml:space="preserve">R5</w:t>
+      </w:r>
+      <w:r>
+        <w:rPr>
+          <w:rFonts w:ascii="Arial" w:cs="Arial" w:eastAsia="Arial" w:hAnsi="Arial"/>
+          <w:b w:val="false"/>
+          <w:bCs w:val="false"/>
+          <w:color w:val="000000"/>
+          <w:sz w:val="22"/>
+          <w:szCs w:val="22"/>
+        </w:rPr>
+        <w:t xml:space="preserve"> — Auto-rejected by System: </w:t>
+      </w:r>
+      <w:r>
+        <w:rPr>
+          <w:rFonts w:ascii="Arial" w:cs="Arial" w:eastAsia="Arial" w:hAnsi="Arial"/>
+          <w:b/>
+          <w:bCs/>
+          <w:color w:val="000000"/>
+          <w:sz w:val="22"/>
+          <w:szCs w:val="22"/>
+        </w:rPr>
+        <w:t xml:space="preserve">approved limit below Min Boundary</w:t>
+      </w:r>
+      <w:r>
+        <w:rPr>
+          <w:rFonts w:ascii="Arial" w:cs="Arial" w:eastAsia="Arial" w:hAnsi="Arial"/>
+          <w:b w:val="false"/>
+          <w:bCs w:val="false"/>
+          <w:color w:val="000000"/>
+          <w:sz w:val="22"/>
+          <w:szCs w:val="22"/>
+        </w:rPr>
+        <w:t xml:space="preserve">, no deviation (rejection logic unchanged).</w:t>
+      </w:r>
+    </w:p>
+    <w:p>
+      <w:pPr>
+        <w:spacing w:after="120" w:before="40" w:line="264"/>
+      </w:pPr>
+      <w:r>
+        <w:rPr>
+          <w:rFonts w:ascii="Arial" w:cs="Arial" w:eastAsia="Arial" w:hAnsi="Arial"/>
+          <w:b/>
+          <w:bCs/>
+          <w:color w:val="000000"/>
+          <w:sz w:val="22"/>
+          <w:szCs w:val="22"/>
+        </w:rPr>
+        <w:t xml:space="preserve">Not revertible:</w:t>
+      </w:r>
+      <w:r>
+        <w:rPr>
+          <w:rFonts w:ascii="Arial" w:cs="Arial" w:eastAsia="Arial" w:hAnsi="Arial"/>
+          <w:b w:val="false"/>
+          <w:bCs w:val="false"/>
+          <w:color w:val="000000"/>
+          <w:sz w:val="22"/>
+          <w:szCs w:val="22"/>
+        </w:rPr>
+        <w:t xml:space="preserve"> rejections by Compliance Queue, Risk Queue or Sale Queue (no Credit root cause), and pre-decision terminations (pre-dedupe, no applicable product, AML, geo-fencing, EID-scan, EFR liveness) — see the restriction table below.</w:t>
       </w:r>
     </w:p>
     <w:tbl>
@@ -8447,7 +8803,7 @@
           <w:sz w:val="22"/>
           <w:szCs w:val="22"/>
         </w:rPr>
-        <w:t xml:space="preserve">Customer communication — final confirmation only:</w:t>
+        <w:t xml:space="preserve">Customer communication — final confirmation only, exactly one email (Credit User note):</w:t>
       </w:r>
       <w:r>
         <w:rPr>
@@ -8480,7 +8836,51 @@
           <w:sz w:val="22"/>
           <w:szCs w:val="22"/>
         </w:rPr>
-        <w:t xml:space="preserve"> notified of the reopen. The customer is informed only when the re-assessment completes: on approval, the customer receives the approval communication below — the same message as a normally approved application; on a repeat rejection, the standard rejection notification applies and the 30-day window restarts.</w:t>
+        <w:t xml:space="preserve"> notified of the reopen. When the re-assessment completes, the system sends the client </w:t>
+      </w:r>
+      <w:r>
+        <w:rPr>
+          <w:rFonts w:ascii="Arial" w:cs="Arial" w:eastAsia="Arial" w:hAnsi="Arial"/>
+          <w:b/>
+          <w:bCs/>
+          <w:color w:val="000000"/>
+          <w:sz w:val="22"/>
+          <w:szCs w:val="22"/>
+        </w:rPr>
+        <w:t xml:space="preserve">exactly one email</w:t>
+      </w:r>
+      <w:r>
+        <w:rPr>
+          <w:rFonts w:ascii="Arial" w:cs="Arial" w:eastAsia="Arial" w:hAnsi="Arial"/>
+          <w:b w:val="false"/>
+          <w:bCs w:val="false"/>
+          <w:color w:val="000000"/>
+          <w:sz w:val="22"/>
+          <w:szCs w:val="22"/>
+        </w:rPr>
+        <w:t xml:space="preserve">, whether the outcome is Approve or Reject: on approval, the Email (Customer) template below — the same message as a normally approved application; on a repeat rejection, the standard rejection notification, and the 30-day window restarts. The reopened run must </w:t>
+      </w:r>
+      <w:r>
+        <w:rPr>
+          <w:rFonts w:ascii="Arial" w:cs="Arial" w:eastAsia="Arial" w:hAnsi="Arial"/>
+          <w:b/>
+          <w:bCs/>
+          <w:color w:val="000000"/>
+          <w:sz w:val="22"/>
+          <w:szCs w:val="22"/>
+        </w:rPr>
+        <w:t xml:space="preserve">not</w:t>
+      </w:r>
+      <w:r>
+        <w:rPr>
+          <w:rFonts w:ascii="Arial" w:cs="Arial" w:eastAsia="Arial" w:hAnsi="Arial"/>
+          <w:b w:val="false"/>
+          <w:bCs w:val="false"/>
+          <w:color w:val="000000"/>
+          <w:sz w:val="22"/>
+          <w:szCs w:val="22"/>
+        </w:rPr>
+        <w:t xml:space="preserve"> double-send decision notifications to the client (the original rejection email has already gone out once).</w:t>
       </w:r>
     </w:p>
     <w:p>
@@ -8744,7 +9144,7 @@
                 <w:sz w:val="21"/>
                 <w:szCs w:val="21"/>
               </w:rPr>
-              <w:t xml:space="preserve">One time — when an application reopened via an approved revert is approved after re-assessment. New Customer-type template in Communication Setup, mirroring the standard approval message.</w:t>
+              <w:t xml:space="preserve">One time — when an application reopened via an approved revert is approved after re-assessment. Exactly one client email per re-assessment decision (on a repeat rejection, the standard rejection notification is sent instead — one email either way). Newly added in Communication Setup, mirroring the standard approval message.</w:t>
             </w:r>
           </w:p>
         </w:tc>
@@ -10321,7 +10721,29 @@
                 <w:sz w:val="21"/>
                 <w:szCs w:val="21"/>
               </w:rPr>
-              <w:t xml:space="preserve"> template (approval after re-assessment, mirroring the standard approval message — section 6). English, banking tone, signing off as Reem Bank. The Compliance / Risk reject confirmation texts stay as they are — those rejections remain non-revertible.</w:t>
+              <w:t xml:space="preserve"> template (approval after re-assessment, mirroring the standard approval message — section 6). English, banking tone, signing off as Reem Bank. </w:t>
+            </w:r>
+            <w:r>
+              <w:rPr>
+                <w:rFonts w:ascii="Arial" w:cs="Arial" w:eastAsia="Arial" w:hAnsi="Arial"/>
+                <w:b/>
+                <w:bCs/>
+                <w:color w:val="000000"/>
+                <w:sz w:val="21"/>
+                <w:szCs w:val="21"/>
+              </w:rPr>
+              <w:t xml:space="preserve">Exactly one client email per re-assessment decision</w:t>
+            </w:r>
+            <w:r>
+              <w:rPr>
+                <w:rFonts w:ascii="Arial" w:cs="Arial" w:eastAsia="Arial" w:hAnsi="Arial"/>
+                <w:b w:val="false"/>
+                <w:bCs w:val="false"/>
+                <w:color w:val="000000"/>
+                <w:sz w:val="21"/>
+                <w:szCs w:val="21"/>
+              </w:rPr>
+              <w:t xml:space="preserve"> — Approve or Reject — with duplicate decision notifications suppressed on the reopened run. The Compliance / Risk reject confirmation texts stay as they are — those rejections remain non-revertible.</w:t>
             </w:r>
           </w:p>
         </w:tc>

</xml_diff>

<commit_message>
Final BRD with board-scan impacts, Hailey BA skill, RB knowledge base
The RF board scan feeds the spec: email audience labels follow the
portal's Client/Bank classification (per the Email Type column change
in delivery), the audit-trail impact records the dependency on the
Financial-DBR audit fix, and the queue impact calls for alignment with
the in-flight drop-point and two-DBR calculation changes. The US gains
a ticket-mapped Dependencies section; the cover is dated 19 September.

New: .claude/skills/hailey-ba-us-brd/SKILL.md codifies the PO working
agreements from this engagement (Set 1 - US/BRD), and
docs/RB_KNOWLEDGE_BASE.md is the KT reference for other agents -
platform, queues, decisioning/DBR, audit and email conventions, the
cancellation pattern, the Revert feature, the portal design system,
the deliverable house style and the composite toolchain.

Co-Authored-By: Claude Fable 5 <noreply@anthropic.com>
Claude-Session: https://claude.ai/code/session_01GMyQEZm7CauvpgScBFz4Cf
</commit_message>
<xml_diff>
--- a/docs/brd/Appro_RF_Application_Revert_in_Super_Portal_v1.0.docx
+++ b/docs/brd/Appro_RF_Application_Revert_in_Super_Portal_v1.0.docx
@@ -110,7 +110,7 @@
           <w:sz w:val="22"/>
           <w:szCs w:val="22"/>
         </w:rPr>
-        <w:t xml:space="preserve">18 September 2026</w:t>
+        <w:t xml:space="preserve">19 September 2026</w:t>
       </w:r>
     </w:p>
     <w:p>
@@ -8858,7 +8858,7 @@
           <w:sz w:val="22"/>
           <w:szCs w:val="22"/>
         </w:rPr>
-        <w:t xml:space="preserve">, whether the outcome is Approve or Reject: on approval, the Email (Customer) template below — the same message as a normally approved application; on a repeat rejection, the standard rejection notification, and the 30-day window restarts. The reopened run must </w:t>
+        <w:t xml:space="preserve">, whether the outcome is Approve or Reject: on approval, the Email (Client) template below — the same message as a normally approved application; on a repeat rejection, the standard rejection notification, and the 30-day window restarts. The reopened run must </w:t>
       </w:r>
       <w:r>
         <w:rPr>
@@ -9057,7 +9057,7 @@
                 <w:sz w:val="21"/>
                 <w:szCs w:val="21"/>
               </w:rPr>
-              <w:t xml:space="preserve">Email (Customer)</w:t>
+              <w:t xml:space="preserve">Email (Client)</w:t>
             </w:r>
           </w:p>
         </w:tc>
@@ -10477,7 +10477,7 @@
                 <w:sz w:val="21"/>
                 <w:szCs w:val="21"/>
               </w:rPr>
-              <w:t xml:space="preserve">One new queue (Revert Queue) in the Queue menu and the Manually Queue role section. The drop-points matrix gains a new entry (approved revert → Credit Queue L1), plus the parking of both DBR safety nets (Existing DBR &gt; 50% and Gross DBR &gt; 100%) → Credit Queue L1, which increases Credit Queue volume for every breach — not only reverted cases. Parked cases must carry the completed Rule Engine and Limit Assignment results into the queue view.</w:t>
+              <w:t xml:space="preserve">One new queue (Revert Queue) in the Queue menu and the Manually Queue role section. The drop-points matrix gains a new entry (approved revert → Credit Queue L1), plus the parking of both DBR safety nets (Existing DBR &gt; 50% and Gross DBR &gt; 100%) → Credit Queue L1, which increases Credit Queue volume for every breach — not only reverted cases. Parked cases must carry the completed Rule Engine and Limit Assignment results into the queue view. The new parking drop points must be aligned with the drop-point / Failed Reason updates currently in delivery, and the DBR thresholds with the in-flight two-DBR calculation change.</w:t>
             </w:r>
           </w:p>
         </w:tc>
@@ -10603,7 +10603,7 @@
                 <w:sz w:val="21"/>
                 <w:szCs w:val="21"/>
               </w:rPr>
-              <w:t xml:space="preserve">Three new audit steps — 'Manual revert process', 'Revert Queue', 'Auto Revert Approval on timeout' (mirroring cancellation's 'Auto Cancellation on timeout') — each writing the full standard field set. The original rejection record is never modified.</w:t>
+              <w:t xml:space="preserve">Three new audit steps — 'Manual revert process', 'Revert Queue', 'Auto Revert Approval on timeout' (mirroring cancellation's 'Auto Cancellation on timeout') — each writing the full standard field set. The original rejection record is never modified. Revertibility is derived from the audit step recorded at rejection, so the known defect in the audit trail written for Financial-DBR rejections must be resolved before this feature relies on it.</w:t>
             </w:r>
           </w:p>
         </w:tc>
@@ -10710,7 +10710,7 @@
                 <w:sz w:val="21"/>
                 <w:szCs w:val="21"/>
               </w:rPr>
-              <w:t xml:space="preserve">Email (Customer)</w:t>
+              <w:t xml:space="preserve">Email (Client)</w:t>
             </w:r>
             <w:r>
               <w:rPr>
@@ -10938,11 +10938,6 @@
         </w:tc>
       </w:tr>
     </w:tbl>
-    <w:p>
-      <w:r>
-        <w:br w:type="page"/>
-      </w:r>
-    </w:p>
     <w:p>
       <w:pPr>
         <w:pStyle w:val="Heading1"/>

</xml_diff>

<commit_message>
Visual-first impact analysis: reference screen beside every impact area
The BRD impact analysis becomes an Area | Impact | Screen table - each
row carries a captioned crop of the real module it affects (Role
Management permissions, queue menu, email-template list with the
Client/Bank type column, Report Enquiry, Strategies Versions menu, the
application history steps) plus two portal-styled mini-diagrams for the
status transition and the services map. The US impact table gains the
same Screen column, and the visual-first expectation is codified in the
Hailey BA skill and the knowledge base.

Co-Authored-By: Claude Fable 5 <noreply@anthropic.com>
Claude-Session: https://claude.ai/code/session_01GMyQEZm7CauvpgScBFz4Cf
</commit_message>
<xml_diff>
--- a/docs/brd/Appro_RF_Application_Revert_in_Super_Portal_v1.0.docx
+++ b/docs/brd/Appro_RF_Application_Revert_in_Super_Portal_v1.0.docx
@@ -10289,8 +10289,9 @@
         </w:tblBorders>
       </w:tblPr>
       <w:tblGrid>
-        <w:gridCol w:w="1986"/>
-        <w:gridCol w:w="7040"/>
+        <w:gridCol w:w="1715"/>
+        <w:gridCol w:w="4062"/>
+        <w:gridCol w:w="3249"/>
       </w:tblGrid>
       <w:tr>
         <w:trPr>
@@ -10299,7 +10300,7 @@
         </w:trPr>
         <w:tc>
           <w:tcPr>
-            <w:tcW w:type="dxa" w:w="1986"/>
+            <w:tcW w:type="dxa" w:w="1715"/>
             <w:shd w:fill="156082" w:color="auto" w:val="clear"/>
             <w:tcMar>
               <w:top w:type="dxa" w:w="90"/>
@@ -10328,7 +10329,7 @@
         </w:tc>
         <w:tc>
           <w:tcPr>
-            <w:tcW w:type="dxa" w:w="7040"/>
+            <w:tcW w:type="dxa" w:w="4062"/>
             <w:shd w:fill="156082" w:color="auto" w:val="clear"/>
             <w:tcMar>
               <w:top w:type="dxa" w:w="90"/>
@@ -10352,6 +10353,35 @@
                 <w:szCs w:val="21"/>
               </w:rPr>
               <w:t xml:space="preserve">Impact</w:t>
+            </w:r>
+          </w:p>
+        </w:tc>
+        <w:tc>
+          <w:tcPr>
+            <w:tcW w:type="dxa" w:w="3249"/>
+            <w:shd w:fill="156082" w:color="auto" w:val="clear"/>
+            <w:tcMar>
+              <w:top w:type="dxa" w:w="90"/>
+              <w:left w:type="dxa" w:w="110"/>
+              <w:bottom w:type="dxa" w:w="90"/>
+              <w:right w:type="dxa" w:w="110"/>
+            </w:tcMar>
+            <w:vAlign w:val="top"/>
+          </w:tcPr>
+          <w:p>
+            <w:pPr>
+              <w:spacing w:after="0" w:before="0" w:line="252"/>
+            </w:pPr>
+            <w:r>
+              <w:rPr>
+                <w:rFonts w:ascii="Arial" w:cs="Arial" w:eastAsia="Arial" w:hAnsi="Arial"/>
+                <w:b/>
+                <w:bCs/>
+                <w:color w:val="FFFFFF"/>
+                <w:sz w:val="21"/>
+                <w:szCs w:val="21"/>
+              </w:rPr>
+              <w:t xml:space="preserve">Screen</w:t>
             </w:r>
           </w:p>
         </w:tc>
@@ -10362,7 +10392,7 @@
         </w:trPr>
         <w:tc>
           <w:tcPr>
-            <w:tcW w:type="dxa" w:w="1986"/>
+            <w:tcW w:type="dxa" w:w="1715"/>
             <w:shd w:fill="FFFFFF" w:color="auto" w:val="clear"/>
             <w:tcMar>
               <w:top w:type="dxa" w:w="90"/>
@@ -10391,7 +10421,7 @@
         </w:tc>
         <w:tc>
           <w:tcPr>
-            <w:tcW w:type="dxa" w:w="7040"/>
+            <w:tcW w:type="dxa" w:w="4062"/>
             <w:shd w:fill="FFFFFF" w:color="auto" w:val="clear"/>
             <w:tcMar>
               <w:top w:type="dxa" w:w="90"/>
@@ -10415,6 +10445,79 @@
                 <w:szCs w:val="21"/>
               </w:rPr>
               <w:t xml:space="preserve">Six new permission entries, per product: [CC]/[PL] × 'Revert Application' (Enquiry &gt; Application Enquiry) and [CC]/[PL] × View / Evaluate Application (Manually Queue &gt; Revert Queue). Each is a distinct right — bundling permissions that cover different actions has previously required production hotfixes. The Permission Matrix reference page must be updated.</w:t>
+            </w:r>
+          </w:p>
+        </w:tc>
+        <w:tc>
+          <w:tcPr>
+            <w:tcW w:type="dxa" w:w="3249"/>
+            <w:tcMar>
+              <w:top w:type="dxa" w:w="90"/>
+              <w:left w:type="dxa" w:w="110"/>
+              <w:bottom w:type="dxa" w:w="90"/>
+              <w:right w:type="dxa" w:w="110"/>
+            </w:tcMar>
+            <w:vAlign w:val="center"/>
+          </w:tcPr>
+          <w:p>
+            <w:pPr>
+              <w:spacing w:after="40" w:before="0"/>
+              <w:jc w:val="center"/>
+            </w:pPr>
+            <w:r>
+              <w:drawing>
+                <wp:inline distT="0" distB="0" distL="0" distR="0">
+                  <wp:extent cx="1809750" cy="495300"/>
+                  <wp:effectExtent t="0" r="0" b="0" l="0"/>
+                  <wp:docPr id="1" name="" descr="" title=""/>
+                  <wp:cNvGraphicFramePr>
+                    <a:graphicFrameLocks xmlns:a="http://schemas.openxmlformats.org/drawingml/2006/main" noChangeAspect="1"/>
+                  </wp:cNvGraphicFramePr>
+                  <a:graphic xmlns:a="http://schemas.openxmlformats.org/drawingml/2006/main">
+                    <a:graphicData uri="http://schemas.openxmlformats.org/drawingml/2006/picture">
+                      <pic:pic xmlns:pic="http://schemas.openxmlformats.org/drawingml/2006/picture">
+                        <pic:nvPicPr>
+                          <pic:cNvPr id="0" name="" descr=""/>
+                          <pic:cNvPicPr>
+                            <a:picLocks noChangeAspect="1" noChangeArrowheads="1"/>
+                          </pic:cNvPicPr>
+                        </pic:nvPicPr>
+                        <pic:blipFill>
+                          <a:blip r:embed="rId19" cstate="none"/>
+                          <a:srcRect/>
+                          <a:stretch>
+                            <a:fillRect/>
+                          </a:stretch>
+                        </pic:blipFill>
+                        <pic:spPr bwMode="auto">
+                          <a:xfrm>
+                            <a:off x="0" y="0"/>
+                            <a:ext cx="1809750" cy="495300"/>
+                          </a:xfrm>
+                          <a:prstGeom prst="rect">
+                            <a:avLst/>
+                          </a:prstGeom>
+                        </pic:spPr>
+                      </pic:pic>
+                    </a:graphicData>
+                  </a:graphic>
+                </wp:inline>
+              </w:drawing>
+            </w:r>
+          </w:p>
+          <w:p>
+            <w:pPr>
+              <w:spacing w:after="0" w:before="0"/>
+              <w:jc w:val="center"/>
+            </w:pPr>
+            <w:r>
+              <w:rPr>
+                <w:rFonts w:ascii="Arial" w:cs="Arial" w:eastAsia="Arial" w:hAnsi="Arial"/>
+                <w:color w:val="595959"/>
+                <w:sz w:val="17"/>
+                <w:szCs w:val="17"/>
+              </w:rPr>
+              <w:t xml:space="preserve">Role Management › Application Enquiry (SC1)</w:t>
             </w:r>
           </w:p>
         </w:tc>
@@ -10425,7 +10528,7 @@
         </w:trPr>
         <w:tc>
           <w:tcPr>
-            <w:tcW w:type="dxa" w:w="1986"/>
+            <w:tcW w:type="dxa" w:w="1715"/>
             <w:shd w:fill="FFFFFF" w:color="auto" w:val="clear"/>
             <w:tcMar>
               <w:top w:type="dxa" w:w="90"/>
@@ -10454,7 +10557,7 @@
         </w:tc>
         <w:tc>
           <w:tcPr>
-            <w:tcW w:type="dxa" w:w="7040"/>
+            <w:tcW w:type="dxa" w:w="4062"/>
             <w:shd w:fill="FFFFFF" w:color="auto" w:val="clear"/>
             <w:tcMar>
               <w:top w:type="dxa" w:w="90"/>
@@ -10478,6 +10581,79 @@
                 <w:szCs w:val="21"/>
               </w:rPr>
               <w:t xml:space="preserve">One new queue (Revert Queue) in the Queue menu and the Manually Queue role section. The drop-points matrix gains a new entry (approved revert → Credit Queue L1), plus the parking of both DBR safety nets (Existing DBR &gt; 50% and Gross DBR &gt; 100%) → Credit Queue L1, which increases Credit Queue volume for every breach — not only reverted cases. Parked cases must carry the completed Rule Engine and Limit Assignment results into the queue view. The new parking drop points must be aligned with the drop-point / Failed Reason updates currently in delivery, and the DBR thresholds with the in-flight two-DBR calculation change.</w:t>
+            </w:r>
+          </w:p>
+        </w:tc>
+        <w:tc>
+          <w:tcPr>
+            <w:tcW w:type="dxa" w:w="3249"/>
+            <w:tcMar>
+              <w:top w:type="dxa" w:w="90"/>
+              <w:left w:type="dxa" w:w="110"/>
+              <w:bottom w:type="dxa" w:w="90"/>
+              <w:right w:type="dxa" w:w="110"/>
+            </w:tcMar>
+            <w:vAlign w:val="center"/>
+          </w:tcPr>
+          <w:p>
+            <w:pPr>
+              <w:spacing w:after="40" w:before="0"/>
+              <w:jc w:val="center"/>
+            </w:pPr>
+            <w:r>
+              <w:drawing>
+                <wp:inline distT="0" distB="0" distL="0" distR="0">
+                  <wp:extent cx="1809750" cy="828675"/>
+                  <wp:effectExtent t="0" r="0" b="0" l="0"/>
+                  <wp:docPr id="1" name="" descr="" title=""/>
+                  <wp:cNvGraphicFramePr>
+                    <a:graphicFrameLocks xmlns:a="http://schemas.openxmlformats.org/drawingml/2006/main" noChangeAspect="1"/>
+                  </wp:cNvGraphicFramePr>
+                  <a:graphic xmlns:a="http://schemas.openxmlformats.org/drawingml/2006/main">
+                    <a:graphicData uri="http://schemas.openxmlformats.org/drawingml/2006/picture">
+                      <pic:pic xmlns:pic="http://schemas.openxmlformats.org/drawingml/2006/picture">
+                        <pic:nvPicPr>
+                          <pic:cNvPr id="0" name="" descr=""/>
+                          <pic:cNvPicPr>
+                            <a:picLocks noChangeAspect="1" noChangeArrowheads="1"/>
+                          </pic:cNvPicPr>
+                        </pic:nvPicPr>
+                        <pic:blipFill>
+                          <a:blip r:embed="rId20" cstate="none"/>
+                          <a:srcRect/>
+                          <a:stretch>
+                            <a:fillRect/>
+                          </a:stretch>
+                        </pic:blipFill>
+                        <pic:spPr bwMode="auto">
+                          <a:xfrm>
+                            <a:off x="0" y="0"/>
+                            <a:ext cx="1809750" cy="828675"/>
+                          </a:xfrm>
+                          <a:prstGeom prst="rect">
+                            <a:avLst/>
+                          </a:prstGeom>
+                        </pic:spPr>
+                      </pic:pic>
+                    </a:graphicData>
+                  </a:graphic>
+                </wp:inline>
+              </w:drawing>
+            </w:r>
+          </w:p>
+          <w:p>
+            <w:pPr>
+              <w:spacing w:after="0" w:before="0"/>
+              <w:jc w:val="center"/>
+            </w:pPr>
+            <w:r>
+              <w:rPr>
+                <w:rFonts w:ascii="Arial" w:cs="Arial" w:eastAsia="Arial" w:hAnsi="Arial"/>
+                <w:color w:val="595959"/>
+                <w:sz w:val="17"/>
+                <w:szCs w:val="17"/>
+              </w:rPr>
+              <w:t xml:space="preserve">Queue menu — Revert Queue (SC4)</w:t>
             </w:r>
           </w:p>
         </w:tc>
@@ -10488,7 +10664,7 @@
         </w:trPr>
         <w:tc>
           <w:tcPr>
-            <w:tcW w:type="dxa" w:w="1986"/>
+            <w:tcW w:type="dxa" w:w="1715"/>
             <w:shd w:fill="FFFFFF" w:color="auto" w:val="clear"/>
             <w:tcMar>
               <w:top w:type="dxa" w:w="90"/>
@@ -10517,7 +10693,7 @@
         </w:tc>
         <w:tc>
           <w:tcPr>
-            <w:tcW w:type="dxa" w:w="7040"/>
+            <w:tcW w:type="dxa" w:w="4062"/>
             <w:shd w:fill="FFFFFF" w:color="auto" w:val="clear"/>
             <w:tcMar>
               <w:top w:type="dxa" w:w="90"/>
@@ -10541,6 +10717,79 @@
                 <w:szCs w:val="21"/>
               </w:rPr>
               <w:t xml:space="preserve">No new Application Status is introduced (Revert_App flag only, mirroring Cancel_App), so the mobile application requires no change and never displays a state that misrepresents the case.</w:t>
+            </w:r>
+          </w:p>
+        </w:tc>
+        <w:tc>
+          <w:tcPr>
+            <w:tcW w:type="dxa" w:w="3249"/>
+            <w:tcMar>
+              <w:top w:type="dxa" w:w="90"/>
+              <w:left w:type="dxa" w:w="110"/>
+              <w:bottom w:type="dxa" w:w="90"/>
+              <w:right w:type="dxa" w:w="110"/>
+            </w:tcMar>
+            <w:vAlign w:val="center"/>
+          </w:tcPr>
+          <w:p>
+            <w:pPr>
+              <w:spacing w:after="40" w:before="0"/>
+              <w:jc w:val="center"/>
+            </w:pPr>
+            <w:r>
+              <w:drawing>
+                <wp:inline distT="0" distB="0" distL="0" distR="0">
+                  <wp:extent cx="1809750" cy="514350"/>
+                  <wp:effectExtent t="0" r="0" b="0" l="0"/>
+                  <wp:docPr id="1" name="" descr="" title=""/>
+                  <wp:cNvGraphicFramePr>
+                    <a:graphicFrameLocks xmlns:a="http://schemas.openxmlformats.org/drawingml/2006/main" noChangeAspect="1"/>
+                  </wp:cNvGraphicFramePr>
+                  <a:graphic xmlns:a="http://schemas.openxmlformats.org/drawingml/2006/main">
+                    <a:graphicData uri="http://schemas.openxmlformats.org/drawingml/2006/picture">
+                      <pic:pic xmlns:pic="http://schemas.openxmlformats.org/drawingml/2006/picture">
+                        <pic:nvPicPr>
+                          <pic:cNvPr id="0" name="" descr=""/>
+                          <pic:cNvPicPr>
+                            <a:picLocks noChangeAspect="1" noChangeArrowheads="1"/>
+                          </pic:cNvPicPr>
+                        </pic:nvPicPr>
+                        <pic:blipFill>
+                          <a:blip r:embed="rId21" cstate="none"/>
+                          <a:srcRect/>
+                          <a:stretch>
+                            <a:fillRect/>
+                          </a:stretch>
+                        </pic:blipFill>
+                        <pic:spPr bwMode="auto">
+                          <a:xfrm>
+                            <a:off x="0" y="0"/>
+                            <a:ext cx="1809750" cy="514350"/>
+                          </a:xfrm>
+                          <a:prstGeom prst="rect">
+                            <a:avLst/>
+                          </a:prstGeom>
+                        </pic:spPr>
+                      </pic:pic>
+                    </a:graphicData>
+                  </a:graphic>
+                </wp:inline>
+              </w:drawing>
+            </w:r>
+          </w:p>
+          <w:p>
+            <w:pPr>
+              <w:spacing w:after="0" w:before="0"/>
+              <w:jc w:val="center"/>
+            </w:pPr>
+            <w:r>
+              <w:rPr>
+                <w:rFonts w:ascii="Arial" w:cs="Arial" w:eastAsia="Arial" w:hAnsi="Arial"/>
+                <w:color w:val="595959"/>
+                <w:sz w:val="17"/>
+                <w:szCs w:val="17"/>
+              </w:rPr>
+              <w:t xml:space="preserve">Status transition on approved revert</w:t>
             </w:r>
           </w:p>
         </w:tc>
@@ -10551,7 +10800,7 @@
         </w:trPr>
         <w:tc>
           <w:tcPr>
-            <w:tcW w:type="dxa" w:w="1986"/>
+            <w:tcW w:type="dxa" w:w="1715"/>
             <w:shd w:fill="FFFFFF" w:color="auto" w:val="clear"/>
             <w:tcMar>
               <w:top w:type="dxa" w:w="90"/>
@@ -10580,7 +10829,7 @@
         </w:tc>
         <w:tc>
           <w:tcPr>
-            <w:tcW w:type="dxa" w:w="7040"/>
+            <w:tcW w:type="dxa" w:w="4062"/>
             <w:shd w:fill="FFFFFF" w:color="auto" w:val="clear"/>
             <w:tcMar>
               <w:top w:type="dxa" w:w="90"/>
@@ -10604,6 +10853,79 @@
                 <w:szCs w:val="21"/>
               </w:rPr>
               <w:t xml:space="preserve">Three new audit steps — 'Manual revert process', 'Revert Queue', 'Auto Revert Approval on timeout' (mirroring cancellation's 'Auto Cancellation on timeout') — each writing the full standard field set. The original rejection record is never modified. Revertibility is derived from the audit step recorded at rejection, so the known defect in the audit trail written for Financial-DBR rejections must be resolved before this feature relies on it.</w:t>
+            </w:r>
+          </w:p>
+        </w:tc>
+        <w:tc>
+          <w:tcPr>
+            <w:tcW w:type="dxa" w:w="3249"/>
+            <w:tcMar>
+              <w:top w:type="dxa" w:w="90"/>
+              <w:left w:type="dxa" w:w="110"/>
+              <w:bottom w:type="dxa" w:w="90"/>
+              <w:right w:type="dxa" w:w="110"/>
+            </w:tcMar>
+            <w:vAlign w:val="center"/>
+          </w:tcPr>
+          <w:p>
+            <w:pPr>
+              <w:spacing w:after="40" w:before="0"/>
+              <w:jc w:val="center"/>
+            </w:pPr>
+            <w:r>
+              <w:drawing>
+                <wp:inline distT="0" distB="0" distL="0" distR="0">
+                  <wp:extent cx="1809750" cy="466725"/>
+                  <wp:effectExtent t="0" r="0" b="0" l="0"/>
+                  <wp:docPr id="1" name="" descr="" title=""/>
+                  <wp:cNvGraphicFramePr>
+                    <a:graphicFrameLocks xmlns:a="http://schemas.openxmlformats.org/drawingml/2006/main" noChangeAspect="1"/>
+                  </wp:cNvGraphicFramePr>
+                  <a:graphic xmlns:a="http://schemas.openxmlformats.org/drawingml/2006/main">
+                    <a:graphicData uri="http://schemas.openxmlformats.org/drawingml/2006/picture">
+                      <pic:pic xmlns:pic="http://schemas.openxmlformats.org/drawingml/2006/picture">
+                        <pic:nvPicPr>
+                          <pic:cNvPr id="0" name="" descr=""/>
+                          <pic:cNvPicPr>
+                            <a:picLocks noChangeAspect="1" noChangeArrowheads="1"/>
+                          </pic:cNvPicPr>
+                        </pic:nvPicPr>
+                        <pic:blipFill>
+                          <a:blip r:embed="rId22" cstate="none"/>
+                          <a:srcRect/>
+                          <a:stretch>
+                            <a:fillRect/>
+                          </a:stretch>
+                        </pic:blipFill>
+                        <pic:spPr bwMode="auto">
+                          <a:xfrm>
+                            <a:off x="0" y="0"/>
+                            <a:ext cx="1809750" cy="466725"/>
+                          </a:xfrm>
+                          <a:prstGeom prst="rect">
+                            <a:avLst/>
+                          </a:prstGeom>
+                        </pic:spPr>
+                      </pic:pic>
+                    </a:graphicData>
+                  </a:graphic>
+                </wp:inline>
+              </w:drawing>
+            </w:r>
+          </w:p>
+          <w:p>
+            <w:pPr>
+              <w:spacing w:after="0" w:before="0"/>
+              <w:jc w:val="center"/>
+            </w:pPr>
+            <w:r>
+              <w:rPr>
+                <w:rFonts w:ascii="Arial" w:cs="Arial" w:eastAsia="Arial" w:hAnsi="Arial"/>
+                <w:color w:val="595959"/>
+                <w:sz w:val="17"/>
+                <w:szCs w:val="17"/>
+              </w:rPr>
+              <w:t xml:space="preserve">Application history steps — Application Enquiry</w:t>
             </w:r>
           </w:p>
         </w:tc>
@@ -10614,7 +10936,7 @@
         </w:trPr>
         <w:tc>
           <w:tcPr>
-            <w:tcW w:type="dxa" w:w="1986"/>
+            <w:tcW w:type="dxa" w:w="1715"/>
             <w:shd w:fill="FFFFFF" w:color="auto" w:val="clear"/>
             <w:tcMar>
               <w:top w:type="dxa" w:w="90"/>
@@ -10643,7 +10965,7 @@
         </w:tc>
         <w:tc>
           <w:tcPr>
-            <w:tcW w:type="dxa" w:w="7040"/>
+            <w:tcW w:type="dxa" w:w="4062"/>
             <w:shd w:fill="FFFFFF" w:color="auto" w:val="clear"/>
             <w:tcMar>
               <w:top w:type="dxa" w:w="90"/>
@@ -10744,6 +11066,79 @@
                 <w:szCs w:val="21"/>
               </w:rPr>
               <w:t xml:space="preserve"> — Approve or Reject — with duplicate decision notifications suppressed on the reopened run. The Compliance / Risk reject confirmation texts stay as they are — those rejections remain non-revertible.</w:t>
+            </w:r>
+          </w:p>
+        </w:tc>
+        <w:tc>
+          <w:tcPr>
+            <w:tcW w:type="dxa" w:w="3249"/>
+            <w:tcMar>
+              <w:top w:type="dxa" w:w="90"/>
+              <w:left w:type="dxa" w:w="110"/>
+              <w:bottom w:type="dxa" w:w="90"/>
+              <w:right w:type="dxa" w:w="110"/>
+            </w:tcMar>
+            <w:vAlign w:val="center"/>
+          </w:tcPr>
+          <w:p>
+            <w:pPr>
+              <w:spacing w:after="40" w:before="0"/>
+              <w:jc w:val="center"/>
+            </w:pPr>
+            <w:r>
+              <w:drawing>
+                <wp:inline distT="0" distB="0" distL="0" distR="0">
+                  <wp:extent cx="1809750" cy="695325"/>
+                  <wp:effectExtent t="0" r="0" b="0" l="0"/>
+                  <wp:docPr id="1" name="" descr="" title=""/>
+                  <wp:cNvGraphicFramePr>
+                    <a:graphicFrameLocks xmlns:a="http://schemas.openxmlformats.org/drawingml/2006/main" noChangeAspect="1"/>
+                  </wp:cNvGraphicFramePr>
+                  <a:graphic xmlns:a="http://schemas.openxmlformats.org/drawingml/2006/main">
+                    <a:graphicData uri="http://schemas.openxmlformats.org/drawingml/2006/picture">
+                      <pic:pic xmlns:pic="http://schemas.openxmlformats.org/drawingml/2006/picture">
+                        <pic:nvPicPr>
+                          <pic:cNvPr id="0" name="" descr=""/>
+                          <pic:cNvPicPr>
+                            <a:picLocks noChangeAspect="1" noChangeArrowheads="1"/>
+                          </pic:cNvPicPr>
+                        </pic:nvPicPr>
+                        <pic:blipFill>
+                          <a:blip r:embed="rId23" cstate="none"/>
+                          <a:srcRect/>
+                          <a:stretch>
+                            <a:fillRect/>
+                          </a:stretch>
+                        </pic:blipFill>
+                        <pic:spPr bwMode="auto">
+                          <a:xfrm>
+                            <a:off x="0" y="0"/>
+                            <a:ext cx="1809750" cy="695325"/>
+                          </a:xfrm>
+                          <a:prstGeom prst="rect">
+                            <a:avLst/>
+                          </a:prstGeom>
+                        </pic:spPr>
+                      </pic:pic>
+                    </a:graphicData>
+                  </a:graphic>
+                </wp:inline>
+              </w:drawing>
+            </w:r>
+          </w:p>
+          <w:p>
+            <w:pPr>
+              <w:spacing w:after="0" w:before="0"/>
+              <w:jc w:val="center"/>
+            </w:pPr>
+            <w:r>
+              <w:rPr>
+                <w:rFonts w:ascii="Arial" w:cs="Arial" w:eastAsia="Arial" w:hAnsi="Arial"/>
+                <w:color w:val="595959"/>
+                <w:sz w:val="17"/>
+                <w:szCs w:val="17"/>
+              </w:rPr>
+              <w:t xml:space="preserve">Communication Setup › Email Templates — Type: Client / Bank</w:t>
             </w:r>
           </w:p>
         </w:tc>
@@ -10754,7 +11149,7 @@
         </w:trPr>
         <w:tc>
           <w:tcPr>
-            <w:tcW w:type="dxa" w:w="1986"/>
+            <w:tcW w:type="dxa" w:w="1715"/>
             <w:shd w:fill="FFFFFF" w:color="auto" w:val="clear"/>
             <w:tcMar>
               <w:top w:type="dxa" w:w="90"/>
@@ -10783,7 +11178,7 @@
         </w:tc>
         <w:tc>
           <w:tcPr>
-            <w:tcW w:type="dxa" w:w="7040"/>
+            <w:tcW w:type="dxa" w:w="4062"/>
             <w:shd w:fill="FFFFFF" w:color="auto" w:val="clear"/>
             <w:tcMar>
               <w:top w:type="dxa" w:w="90"/>
@@ -10807,6 +11202,79 @@
                 <w:szCs w:val="21"/>
               </w:rPr>
               <w:t xml:space="preserve">WIP, Exception, Policy Exception, E2E and Approved Transactions reports must handle reopened cases: rejection counts become mutable, E2E must not double-count the second pass, and an approval after revert should be identifiable as such.</w:t>
+            </w:r>
+          </w:p>
+        </w:tc>
+        <w:tc>
+          <w:tcPr>
+            <w:tcW w:type="dxa" w:w="3249"/>
+            <w:tcMar>
+              <w:top w:type="dxa" w:w="90"/>
+              <w:left w:type="dxa" w:w="110"/>
+              <w:bottom w:type="dxa" w:w="90"/>
+              <w:right w:type="dxa" w:w="110"/>
+            </w:tcMar>
+            <w:vAlign w:val="center"/>
+          </w:tcPr>
+          <w:p>
+            <w:pPr>
+              <w:spacing w:after="40" w:before="0"/>
+              <w:jc w:val="center"/>
+            </w:pPr>
+            <w:r>
+              <w:drawing>
+                <wp:inline distT="0" distB="0" distL="0" distR="0">
+                  <wp:extent cx="1809750" cy="457200"/>
+                  <wp:effectExtent t="0" r="0" b="0" l="0"/>
+                  <wp:docPr id="1" name="" descr="" title=""/>
+                  <wp:cNvGraphicFramePr>
+                    <a:graphicFrameLocks xmlns:a="http://schemas.openxmlformats.org/drawingml/2006/main" noChangeAspect="1"/>
+                  </wp:cNvGraphicFramePr>
+                  <a:graphic xmlns:a="http://schemas.openxmlformats.org/drawingml/2006/main">
+                    <a:graphicData uri="http://schemas.openxmlformats.org/drawingml/2006/picture">
+                      <pic:pic xmlns:pic="http://schemas.openxmlformats.org/drawingml/2006/picture">
+                        <pic:nvPicPr>
+                          <pic:cNvPr id="0" name="" descr=""/>
+                          <pic:cNvPicPr>
+                            <a:picLocks noChangeAspect="1" noChangeArrowheads="1"/>
+                          </pic:cNvPicPr>
+                        </pic:nvPicPr>
+                        <pic:blipFill>
+                          <a:blip r:embed="rId24" cstate="none"/>
+                          <a:srcRect/>
+                          <a:stretch>
+                            <a:fillRect/>
+                          </a:stretch>
+                        </pic:blipFill>
+                        <pic:spPr bwMode="auto">
+                          <a:xfrm>
+                            <a:off x="0" y="0"/>
+                            <a:ext cx="1809750" cy="457200"/>
+                          </a:xfrm>
+                          <a:prstGeom prst="rect">
+                            <a:avLst/>
+                          </a:prstGeom>
+                        </pic:spPr>
+                      </pic:pic>
+                    </a:graphicData>
+                  </a:graphic>
+                </wp:inline>
+              </w:drawing>
+            </w:r>
+          </w:p>
+          <w:p>
+            <w:pPr>
+              <w:spacing w:after="0" w:before="0"/>
+              <w:jc w:val="center"/>
+            </w:pPr>
+            <w:r>
+              <w:rPr>
+                <w:rFonts w:ascii="Arial" w:cs="Arial" w:eastAsia="Arial" w:hAnsi="Arial"/>
+                <w:color w:val="595959"/>
+                <w:sz w:val="17"/>
+                <w:szCs w:val="17"/>
+              </w:rPr>
+              <w:t xml:space="preserve">Enquiry › Report Enquiry</w:t>
             </w:r>
           </w:p>
         </w:tc>
@@ -10817,7 +11285,7 @@
         </w:trPr>
         <w:tc>
           <w:tcPr>
-            <w:tcW w:type="dxa" w:w="1986"/>
+            <w:tcW w:type="dxa" w:w="1715"/>
             <w:shd w:fill="FFFFFF" w:color="auto" w:val="clear"/>
             <w:tcMar>
               <w:top w:type="dxa" w:w="90"/>
@@ -10846,7 +11314,7 @@
         </w:tc>
         <w:tc>
           <w:tcPr>
-            <w:tcW w:type="dxa" w:w="7040"/>
+            <w:tcW w:type="dxa" w:w="4062"/>
             <w:shd w:fill="FFFFFF" w:color="auto" w:val="clear"/>
             <w:tcMar>
               <w:top w:type="dxa" w:w="90"/>
@@ -10870,6 +11338,79 @@
                 <w:szCs w:val="21"/>
               </w:rPr>
               <w:t xml:space="preserve">backoffice-service, application-service, queue-service, user-service, audit-trail-service, notification-service, scheduler-service (timeout job) and work-flow-service. The workflow engine is the key estimation item: a rejected application’s process instance has ended, and reverting requires resuming it or re-instantiating at the queue task.</w:t>
+            </w:r>
+          </w:p>
+        </w:tc>
+        <w:tc>
+          <w:tcPr>
+            <w:tcW w:type="dxa" w:w="3249"/>
+            <w:tcMar>
+              <w:top w:type="dxa" w:w="90"/>
+              <w:left w:type="dxa" w:w="110"/>
+              <w:bottom w:type="dxa" w:w="90"/>
+              <w:right w:type="dxa" w:w="110"/>
+            </w:tcMar>
+            <w:vAlign w:val="center"/>
+          </w:tcPr>
+          <w:p>
+            <w:pPr>
+              <w:spacing w:after="40" w:before="0"/>
+              <w:jc w:val="center"/>
+            </w:pPr>
+            <w:r>
+              <w:drawing>
+                <wp:inline distT="0" distB="0" distL="0" distR="0">
+                  <wp:extent cx="1809750" cy="809625"/>
+                  <wp:effectExtent t="0" r="0" b="0" l="0"/>
+                  <wp:docPr id="1" name="" descr="" title=""/>
+                  <wp:cNvGraphicFramePr>
+                    <a:graphicFrameLocks xmlns:a="http://schemas.openxmlformats.org/drawingml/2006/main" noChangeAspect="1"/>
+                  </wp:cNvGraphicFramePr>
+                  <a:graphic xmlns:a="http://schemas.openxmlformats.org/drawingml/2006/main">
+                    <a:graphicData uri="http://schemas.openxmlformats.org/drawingml/2006/picture">
+                      <pic:pic xmlns:pic="http://schemas.openxmlformats.org/drawingml/2006/picture">
+                        <pic:nvPicPr>
+                          <pic:cNvPr id="0" name="" descr=""/>
+                          <pic:cNvPicPr>
+                            <a:picLocks noChangeAspect="1" noChangeArrowheads="1"/>
+                          </pic:cNvPicPr>
+                        </pic:nvPicPr>
+                        <pic:blipFill>
+                          <a:blip r:embed="rId25" cstate="none"/>
+                          <a:srcRect/>
+                          <a:stretch>
+                            <a:fillRect/>
+                          </a:stretch>
+                        </pic:blipFill>
+                        <pic:spPr bwMode="auto">
+                          <a:xfrm>
+                            <a:off x="0" y="0"/>
+                            <a:ext cx="1809750" cy="809625"/>
+                          </a:xfrm>
+                          <a:prstGeom prst="rect">
+                            <a:avLst/>
+                          </a:prstGeom>
+                        </pic:spPr>
+                      </pic:pic>
+                    </a:graphicData>
+                  </a:graphic>
+                </wp:inline>
+              </w:drawing>
+            </w:r>
+          </w:p>
+          <w:p>
+            <w:pPr>
+              <w:spacing w:after="0" w:before="0"/>
+              <w:jc w:val="center"/>
+            </w:pPr>
+            <w:r>
+              <w:rPr>
+                <w:rFonts w:ascii="Arial" w:cs="Arial" w:eastAsia="Arial" w:hAnsi="Arial"/>
+                <w:color w:val="595959"/>
+                <w:sz w:val="17"/>
+                <w:szCs w:val="17"/>
+              </w:rPr>
+              <w:t xml:space="preserve">Services touched — workflow engine is the key item</w:t>
             </w:r>
           </w:p>
         </w:tc>
@@ -10880,7 +11421,7 @@
         </w:trPr>
         <w:tc>
           <w:tcPr>
-            <w:tcW w:type="dxa" w:w="1986"/>
+            <w:tcW w:type="dxa" w:w="1715"/>
             <w:shd w:fill="FFFFFF" w:color="auto" w:val="clear"/>
             <w:tcMar>
               <w:top w:type="dxa" w:w="90"/>
@@ -10909,7 +11450,7 @@
         </w:tc>
         <w:tc>
           <w:tcPr>
-            <w:tcW w:type="dxa" w:w="7040"/>
+            <w:tcW w:type="dxa" w:w="4062"/>
             <w:shd w:fill="FFFFFF" w:color="auto" w:val="clear"/>
             <w:tcMar>
               <w:top w:type="dxa" w:w="90"/>
@@ -10933,6 +11474,79 @@
                 <w:szCs w:val="21"/>
               </w:rPr>
               <w:t xml:space="preserve">Post-revert re-decisioning evaluates against the currently published Strategy / Score Check / Income Multiplier versions — which is the point of the feature — and the audit trail should record which published version was applied.</w:t>
+            </w:r>
+          </w:p>
+        </w:tc>
+        <w:tc>
+          <w:tcPr>
+            <w:tcW w:type="dxa" w:w="3249"/>
+            <w:tcMar>
+              <w:top w:type="dxa" w:w="90"/>
+              <w:left w:type="dxa" w:w="110"/>
+              <w:bottom w:type="dxa" w:w="90"/>
+              <w:right w:type="dxa" w:w="110"/>
+            </w:tcMar>
+            <w:vAlign w:val="center"/>
+          </w:tcPr>
+          <w:p>
+            <w:pPr>
+              <w:spacing w:after="40" w:before="0"/>
+              <w:jc w:val="center"/>
+            </w:pPr>
+            <w:r>
+              <w:drawing>
+                <wp:inline distT="0" distB="0" distL="0" distR="0">
+                  <wp:extent cx="1809750" cy="1019175"/>
+                  <wp:effectExtent t="0" r="0" b="0" l="0"/>
+                  <wp:docPr id="1" name="" descr="" title=""/>
+                  <wp:cNvGraphicFramePr>
+                    <a:graphicFrameLocks xmlns:a="http://schemas.openxmlformats.org/drawingml/2006/main" noChangeAspect="1"/>
+                  </wp:cNvGraphicFramePr>
+                  <a:graphic xmlns:a="http://schemas.openxmlformats.org/drawingml/2006/main">
+                    <a:graphicData uri="http://schemas.openxmlformats.org/drawingml/2006/picture">
+                      <pic:pic xmlns:pic="http://schemas.openxmlformats.org/drawingml/2006/picture">
+                        <pic:nvPicPr>
+                          <pic:cNvPr id="0" name="" descr=""/>
+                          <pic:cNvPicPr>
+                            <a:picLocks noChangeAspect="1" noChangeArrowheads="1"/>
+                          </pic:cNvPicPr>
+                        </pic:nvPicPr>
+                        <pic:blipFill>
+                          <a:blip r:embed="rId26" cstate="none"/>
+                          <a:srcRect/>
+                          <a:stretch>
+                            <a:fillRect/>
+                          </a:stretch>
+                        </pic:blipFill>
+                        <pic:spPr bwMode="auto">
+                          <a:xfrm>
+                            <a:off x="0" y="0"/>
+                            <a:ext cx="1809750" cy="1019175"/>
+                          </a:xfrm>
+                          <a:prstGeom prst="rect">
+                            <a:avLst/>
+                          </a:prstGeom>
+                        </pic:spPr>
+                      </pic:pic>
+                    </a:graphicData>
+                  </a:graphic>
+                </wp:inline>
+              </w:drawing>
+            </w:r>
+          </w:p>
+          <w:p>
+            <w:pPr>
+              <w:spacing w:after="0" w:before="0"/>
+              <w:jc w:val="center"/>
+            </w:pPr>
+            <w:r>
+              <w:rPr>
+                <w:rFonts w:ascii="Arial" w:cs="Arial" w:eastAsia="Arial" w:hAnsi="Arial"/>
+                <w:color w:val="595959"/>
+                <w:sz w:val="17"/>
+                <w:szCs w:val="17"/>
+              </w:rPr>
+              <w:t xml:space="preserve">Strategies › Versions / Audit Trails menu</w:t>
             </w:r>
           </w:p>
         </w:tc>

</xml_diff>

<commit_message>
Customer resume screens, re-assessment rejection email, enquiry status view
Section 6 now shows the real mobile holding screens (SC7/SC8): after an
approved revert the customer resumes onto the application-under-process
screen, never the rejection screen or a new flow. The re-rejected case
also emails the client, via a second Email (Client) template that
mentions the further review - four templates newly added in
Communication Setup, still exactly one client email per decision.
Section 2 states what Application Enquiry displays after reverting
(Rejected while pending, Awaiting Credit Approval after approval), and
the confirmed Revert_App flag question leaves the open list.

Co-Authored-By: Claude Fable 5 <noreply@anthropic.com>
Claude-Session: https://claude.ai/code/session_01GMyQEZm7CauvpgScBFz4Cf
</commit_message>
<xml_diff>
--- a/docs/brd/Appro_RF_Application_Revert_in_Super_Portal_v1.0.docx
+++ b/docs/brd/Appro_RF_Application_Revert_in_Super_Portal_v1.0.docx
@@ -3443,6 +3443,126 @@
     </w:p>
     <w:p>
       <w:pPr>
+        <w:pStyle w:val="ListParagraph"/>
+        <w:numPr>
+          <w:ilvl w:val="0"/>
+          <w:numId w:val="1"/>
+        </w:numPr>
+        <w:spacing w:after="80" w:before="30" w:line="264"/>
+      </w:pPr>
+      <w:r>
+        <w:rPr>
+          <w:rFonts w:ascii="Arial" w:cs="Arial" w:eastAsia="Arial" w:hAnsi="Arial"/>
+          <w:b/>
+          <w:bCs/>
+          <w:color w:val="000000"/>
+          <w:sz w:val="22"/>
+          <w:szCs w:val="22"/>
+        </w:rPr>
+        <w:t xml:space="preserve">Status shown in Application Enquiry after reverting:</w:t>
+      </w:r>
+      <w:r>
+        <w:rPr>
+          <w:rFonts w:ascii="Arial" w:cs="Arial" w:eastAsia="Arial" w:hAnsi="Arial"/>
+          <w:b w:val="false"/>
+          <w:bCs w:val="false"/>
+          <w:color w:val="000000"/>
+          <w:sz w:val="22"/>
+          <w:szCs w:val="22"/>
+        </w:rPr>
+        <w:t xml:space="preserve"> while the revert request is pending, the Application Details view continues to show Application Status = </w:t>
+      </w:r>
+      <w:r>
+        <w:rPr>
+          <w:rFonts w:ascii="Arial" w:cs="Arial" w:eastAsia="Arial" w:hAnsi="Arial"/>
+          <w:b/>
+          <w:bCs/>
+          <w:color w:val="000000"/>
+          <w:sz w:val="22"/>
+          <w:szCs w:val="22"/>
+        </w:rPr>
+        <w:t xml:space="preserve">'Rejected'</w:t>
+      </w:r>
+      <w:r>
+        <w:rPr>
+          <w:rFonts w:ascii="Arial" w:cs="Arial" w:eastAsia="Arial" w:hAnsi="Arial"/>
+          <w:b w:val="false"/>
+          <w:bCs w:val="false"/>
+          <w:color w:val="000000"/>
+          <w:sz w:val="22"/>
+          <w:szCs w:val="22"/>
+        </w:rPr>
+        <w:t xml:space="preserve"> (Revert_App = TRUE; the Revert button is disabled because a request is pending). Once the revert is </w:t>
+      </w:r>
+      <w:r>
+        <w:rPr>
+          <w:rFonts w:ascii="Arial" w:cs="Arial" w:eastAsia="Arial" w:hAnsi="Arial"/>
+          <w:b/>
+          <w:bCs/>
+          <w:color w:val="000000"/>
+          <w:sz w:val="22"/>
+          <w:szCs w:val="22"/>
+        </w:rPr>
+        <w:t xml:space="preserve">approved</w:t>
+      </w:r>
+      <w:r>
+        <w:rPr>
+          <w:rFonts w:ascii="Arial" w:cs="Arial" w:eastAsia="Arial" w:hAnsi="Arial"/>
+          <w:b w:val="false"/>
+          <w:bCs w:val="false"/>
+          <w:color w:val="000000"/>
+          <w:sz w:val="22"/>
+          <w:szCs w:val="22"/>
+        </w:rPr>
+        <w:t xml:space="preserve"> — by the Checker or by the System on timeout — Application Enquiry displays </w:t>
+      </w:r>
+      <w:r>
+        <w:rPr>
+          <w:rFonts w:ascii="Arial" w:cs="Arial" w:eastAsia="Arial" w:hAnsi="Arial"/>
+          <w:b/>
+          <w:bCs/>
+          <w:color w:val="000000"/>
+          <w:sz w:val="22"/>
+          <w:szCs w:val="22"/>
+        </w:rPr>
+        <w:t xml:space="preserve">'Awaiting Credit Approval'</w:t>
+      </w:r>
+      <w:r>
+        <w:rPr>
+          <w:rFonts w:ascii="Arial" w:cs="Arial" w:eastAsia="Arial" w:hAnsi="Arial"/>
+          <w:b w:val="false"/>
+          <w:bCs w:val="false"/>
+          <w:color w:val="000000"/>
+          <w:sz w:val="22"/>
+          <w:szCs w:val="22"/>
+        </w:rPr>
+        <w:t xml:space="preserve">, the application history shows the revert audit steps (section 3 and 4.3), and the Revert button is no longer available since the status is no longer 'Rejected'. If the revert is </w:t>
+      </w:r>
+      <w:r>
+        <w:rPr>
+          <w:rFonts w:ascii="Arial" w:cs="Arial" w:eastAsia="Arial" w:hAnsi="Arial"/>
+          <w:b/>
+          <w:bCs/>
+          <w:color w:val="000000"/>
+          <w:sz w:val="22"/>
+          <w:szCs w:val="22"/>
+        </w:rPr>
+        <w:t xml:space="preserve">rejected</w:t>
+      </w:r>
+      <w:r>
+        <w:rPr>
+          <w:rFonts w:ascii="Arial" w:cs="Arial" w:eastAsia="Arial" w:hAnsi="Arial"/>
+          <w:b w:val="false"/>
+          <w:bCs w:val="false"/>
+          <w:color w:val="000000"/>
+          <w:sz w:val="22"/>
+          <w:szCs w:val="22"/>
+        </w:rPr>
+        <w:t xml:space="preserve">, the view stays 'Rejected' and the Revert button is enabled again for a fresh request.</w:t>
+      </w:r>
+    </w:p>
+    <w:p>
+      <w:pPr>
         <w:spacing w:after="60"/>
       </w:pPr>
     </w:p>
@@ -8695,7 +8815,7 @@
           <w:sz w:val="22"/>
           <w:szCs w:val="22"/>
         </w:rPr>
-        <w:t xml:space="preserve">After an approved revert:</w:t>
+        <w:t xml:space="preserve">After an approved revert — resume back to the “under process” screen:</w:t>
       </w:r>
       <w:r>
         <w:rPr>
@@ -8706,7 +8826,7 @@
           <w:sz w:val="22"/>
           <w:szCs w:val="22"/>
         </w:rPr>
-        <w:t xml:space="preserve"> the application is in-flight again in a queue, so the pre-dedupe </w:t>
+        <w:t xml:space="preserve"> the application is in-flight again in Credit Queue, so the pre-dedupe </w:t>
       </w:r>
       <w:r>
         <w:rPr>
@@ -8728,7 +8848,136 @@
           <w:sz w:val="22"/>
           <w:szCs w:val="22"/>
         </w:rPr>
-        <w:t xml:space="preserve"> check blocks a new same-product application (correct and unchanged). If the customer resumes the journey, they must land at the correct point — regression required on resume behaviour.</w:t>
+        <w:t xml:space="preserve"> check blocks a new same-product application (correct and unchanged). A customer who resumes the journey in the app lands on the standard </w:t>
+      </w:r>
+      <w:r>
+        <w:rPr>
+          <w:rFonts w:ascii="Arial" w:cs="Arial" w:eastAsia="Arial" w:hAnsi="Arial"/>
+          <w:b/>
+          <w:bCs/>
+          <w:color w:val="000000"/>
+          <w:sz w:val="22"/>
+          <w:szCs w:val="22"/>
+        </w:rPr>
+        <w:t xml:space="preserve">application under process</w:t>
+      </w:r>
+      <w:r>
+        <w:rPr>
+          <w:rFonts w:ascii="Arial" w:cs="Arial" w:eastAsia="Arial" w:hAnsi="Arial"/>
+          <w:b w:val="false"/>
+          <w:bCs w:val="false"/>
+          <w:color w:val="000000"/>
+          <w:sz w:val="22"/>
+          <w:szCs w:val="22"/>
+        </w:rPr>
+        <w:t xml:space="preserve"> holding screen — “Thanks for choosing Reem Bank &lt;Product&gt; — Your request is under process with the reference &lt;Application ID&gt;” (SC7 / SC8 below) — not on the rejection screen and not into a new application flow. Regression required on this resume behaviour.</w:t>
+      </w:r>
+    </w:p>
+    <w:p>
+      <w:pPr>
+        <w:spacing w:after="60" w:before="120"/>
+        <w:jc w:val="center"/>
+      </w:pPr>
+      <w:r>
+        <w:drawing>
+          <wp:inline distT="0" distB="0" distL="0" distR="0">
+            <wp:extent cx="1428750" cy="2819400"/>
+            <wp:effectExtent t="0" r="0" b="0" l="0"/>
+            <wp:docPr id="1" name="" descr="" title=""/>
+            <wp:cNvGraphicFramePr>
+              <a:graphicFrameLocks xmlns:a="http://schemas.openxmlformats.org/drawingml/2006/main" noChangeAspect="1"/>
+            </wp:cNvGraphicFramePr>
+            <a:graphic xmlns:a="http://schemas.openxmlformats.org/drawingml/2006/main">
+              <a:graphicData uri="http://schemas.openxmlformats.org/drawingml/2006/picture">
+                <pic:pic xmlns:pic="http://schemas.openxmlformats.org/drawingml/2006/picture">
+                  <pic:nvPicPr>
+                    <pic:cNvPr id="0" name="" descr=""/>
+                    <pic:cNvPicPr>
+                      <a:picLocks noChangeAspect="1" noChangeArrowheads="1"/>
+                    </pic:cNvPicPr>
+                  </pic:nvPicPr>
+                  <pic:blipFill>
+                    <a:blip r:embed="rId19" cstate="none"/>
+                    <a:srcRect/>
+                    <a:stretch>
+                      <a:fillRect/>
+                    </a:stretch>
+                  </pic:blipFill>
+                  <pic:spPr bwMode="auto">
+                    <a:xfrm>
+                      <a:off x="0" y="0"/>
+                      <a:ext cx="1428750" cy="2819400"/>
+                    </a:xfrm>
+                    <a:prstGeom prst="rect">
+                      <a:avLst/>
+                    </a:prstGeom>
+                  </pic:spPr>
+                </pic:pic>
+              </a:graphicData>
+            </a:graphic>
+          </wp:inline>
+        </w:drawing>
+      </w:r>
+      <w:r>
+        <w:rPr>
+          <w:rFonts w:ascii="Arial" w:cs="Arial" w:eastAsia="Arial" w:hAnsi="Arial"/>
+        </w:rPr>
+        <w:t xml:space="preserve">      </w:t>
+      </w:r>
+      <w:r>
+        <w:drawing>
+          <wp:inline distT="0" distB="0" distL="0" distR="0">
+            <wp:extent cx="1428750" cy="2886075"/>
+            <wp:effectExtent t="0" r="0" b="0" l="0"/>
+            <wp:docPr id="1" name="" descr="" title=""/>
+            <wp:cNvGraphicFramePr>
+              <a:graphicFrameLocks xmlns:a="http://schemas.openxmlformats.org/drawingml/2006/main" noChangeAspect="1"/>
+            </wp:cNvGraphicFramePr>
+            <a:graphic xmlns:a="http://schemas.openxmlformats.org/drawingml/2006/main">
+              <a:graphicData uri="http://schemas.openxmlformats.org/drawingml/2006/picture">
+                <pic:pic xmlns:pic="http://schemas.openxmlformats.org/drawingml/2006/picture">
+                  <pic:nvPicPr>
+                    <pic:cNvPr id="0" name="" descr=""/>
+                    <pic:cNvPicPr>
+                      <a:picLocks noChangeAspect="1" noChangeArrowheads="1"/>
+                    </pic:cNvPicPr>
+                  </pic:nvPicPr>
+                  <pic:blipFill>
+                    <a:blip r:embed="rId20" cstate="none"/>
+                    <a:srcRect/>
+                    <a:stretch>
+                      <a:fillRect/>
+                    </a:stretch>
+                  </pic:blipFill>
+                  <pic:spPr bwMode="auto">
+                    <a:xfrm>
+                      <a:off x="0" y="0"/>
+                      <a:ext cx="1428750" cy="2886075"/>
+                    </a:xfrm>
+                    <a:prstGeom prst="rect">
+                      <a:avLst/>
+                    </a:prstGeom>
+                  </pic:spPr>
+                </pic:pic>
+              </a:graphicData>
+            </a:graphic>
+          </wp:inline>
+        </w:drawing>
+      </w:r>
+    </w:p>
+    <w:p>
+      <w:pPr>
+        <w:spacing w:after="220" w:before="0"/>
+        <w:jc w:val="center"/>
+      </w:pPr>
+      <w:r>
+        <w:rPr>
+          <w:rFonts w:ascii="Arial" w:cs="Arial" w:eastAsia="Arial" w:hAnsi="Arial"/>
+          <w:color w:val="000000"/>
+          <w:sz w:val="22"/>
+          <w:szCs w:val="22"/>
+        </w:rPr>
+        <w:t xml:space="preserve">SC7 / SC8: Customer resume after an approved revert — application under process (CC / PL)</w:t>
       </w:r>
     </w:p>
     <w:p>
@@ -8858,7 +9107,51 @@
           <w:sz w:val="22"/>
           <w:szCs w:val="22"/>
         </w:rPr>
-        <w:t xml:space="preserve">, whether the outcome is Approve or Reject: on approval, the Email (Client) template below — the same message as a normally approved application; on a repeat rejection, the standard rejection notification, and the 30-day window restarts. The reopened run must </w:t>
+        <w:t xml:space="preserve">, whether the outcome is Approve or Reject — and </w:t>
+      </w:r>
+      <w:r>
+        <w:rPr>
+          <w:rFonts w:ascii="Arial" w:cs="Arial" w:eastAsia="Arial" w:hAnsi="Arial"/>
+          <w:b/>
+          <w:bCs/>
+          <w:color w:val="000000"/>
+          <w:sz w:val="22"/>
+          <w:szCs w:val="22"/>
+        </w:rPr>
+        <w:t xml:space="preserve">both templates mention the further review (re-assessment)</w:t>
+      </w:r>
+      <w:r>
+        <w:rPr>
+          <w:rFonts w:ascii="Arial" w:cs="Arial" w:eastAsia="Arial" w:hAnsi="Arial"/>
+          <w:b w:val="false"/>
+          <w:bCs w:val="false"/>
+          <w:color w:val="000000"/>
+          <w:sz w:val="22"/>
+          <w:szCs w:val="22"/>
+        </w:rPr>
+        <w:t xml:space="preserve">: on approval, the first Email (Client) template below; on a </w:t>
+      </w:r>
+      <w:r>
+        <w:rPr>
+          <w:rFonts w:ascii="Arial" w:cs="Arial" w:eastAsia="Arial" w:hAnsi="Arial"/>
+          <w:b/>
+          <w:bCs/>
+          <w:color w:val="000000"/>
+          <w:sz w:val="22"/>
+          <w:szCs w:val="22"/>
+        </w:rPr>
+        <w:t xml:space="preserve">repeat rejection, the client is also emailed</w:t>
+      </w:r>
+      <w:r>
+        <w:rPr>
+          <w:rFonts w:ascii="Arial" w:cs="Arial" w:eastAsia="Arial" w:hAnsi="Arial"/>
+          <w:b w:val="false"/>
+          <w:bCs w:val="false"/>
+          <w:color w:val="000000"/>
+          <w:sz w:val="22"/>
+          <w:szCs w:val="22"/>
+        </w:rPr>
+        <w:t xml:space="preserve">, using the second template below (not the generic first-rejection notification), and the 30-day window restarts. The reopened run must </w:t>
       </w:r>
       <w:r>
         <w:rPr>
@@ -9144,7 +9437,172 @@
                 <w:sz w:val="21"/>
                 <w:szCs w:val="21"/>
               </w:rPr>
-              <w:t xml:space="preserve">One time — when an application reopened via an approved revert is approved after re-assessment. Exactly one client email per re-assessment decision (on a repeat rejection, the standard rejection notification is sent instead — one email either way). Newly added in Communication Setup, mirroring the standard approval message.</w:t>
+              <w:t xml:space="preserve">One time — when an application reopened via an approved revert is </w:t>
+            </w:r>
+            <w:r>
+              <w:rPr>
+                <w:rFonts w:ascii="Arial" w:cs="Arial" w:eastAsia="Arial" w:hAnsi="Arial"/>
+                <w:b/>
+                <w:bCs/>
+                <w:color w:val="000000"/>
+                <w:sz w:val="21"/>
+                <w:szCs w:val="21"/>
+              </w:rPr>
+              <w:t xml:space="preserve">approved</w:t>
+            </w:r>
+            <w:r>
+              <w:rPr>
+                <w:rFonts w:ascii="Arial" w:cs="Arial" w:eastAsia="Arial" w:hAnsi="Arial"/>
+                <w:b w:val="false"/>
+                <w:bCs w:val="false"/>
+                <w:color w:val="000000"/>
+                <w:sz w:val="21"/>
+                <w:szCs w:val="21"/>
+              </w:rPr>
+              <w:t xml:space="preserve"> after re-assessment. Newly added in Communication Setup, mirroring the standard approval message.</w:t>
+            </w:r>
+          </w:p>
+        </w:tc>
+      </w:tr>
+      <w:tr>
+        <w:trPr>
+          <w:cantSplit/>
+        </w:trPr>
+        <w:tc>
+          <w:tcPr>
+            <w:tcW w:type="dxa" w:w="1354"/>
+            <w:shd w:fill="FFFFFF" w:color="auto" w:val="clear"/>
+            <w:tcMar>
+              <w:top w:type="dxa" w:w="90"/>
+              <w:left w:type="dxa" w:w="110"/>
+              <w:bottom w:type="dxa" w:w="90"/>
+              <w:right w:type="dxa" w:w="110"/>
+            </w:tcMar>
+            <w:vAlign w:val="top"/>
+          </w:tcPr>
+          <w:p>
+            <w:pPr>
+              <w:spacing w:after="0" w:before="0" w:line="252"/>
+            </w:pPr>
+            <w:r>
+              <w:rPr>
+                <w:rFonts w:ascii="Arial" w:cs="Arial" w:eastAsia="Arial" w:hAnsi="Arial"/>
+                <w:b w:val="false"/>
+                <w:bCs w:val="false"/>
+                <w:color w:val="000000"/>
+                <w:sz w:val="21"/>
+                <w:szCs w:val="21"/>
+              </w:rPr>
+              <w:t xml:space="preserve">Email (Client)</w:t>
+            </w:r>
+          </w:p>
+        </w:tc>
+        <w:tc>
+          <w:tcPr>
+            <w:tcW w:type="dxa" w:w="1986"/>
+            <w:shd w:fill="FFFFFF" w:color="auto" w:val="clear"/>
+            <w:tcMar>
+              <w:top w:type="dxa" w:w="90"/>
+              <w:left w:type="dxa" w:w="110"/>
+              <w:bottom w:type="dxa" w:w="90"/>
+              <w:right w:type="dxa" w:w="110"/>
+            </w:tcMar>
+            <w:vAlign w:val="top"/>
+          </w:tcPr>
+          <w:p>
+            <w:pPr>
+              <w:spacing w:after="0" w:before="0" w:line="252"/>
+            </w:pPr>
+            <w:r>
+              <w:rPr>
+                <w:rFonts w:ascii="Arial" w:cs="Arial" w:eastAsia="Arial" w:hAnsi="Arial"/>
+                <w:b w:val="false"/>
+                <w:bCs w:val="false"/>
+                <w:color w:val="000000"/>
+                <w:sz w:val="21"/>
+                <w:szCs w:val="21"/>
+              </w:rPr>
+              <w:t xml:space="preserve">Reem Bank — Update on your application %%APPLICATION_ID%%</w:t>
+            </w:r>
+          </w:p>
+        </w:tc>
+        <w:tc>
+          <w:tcPr>
+            <w:tcW w:type="dxa" w:w="3610"/>
+            <w:shd w:fill="FFFFFF" w:color="auto" w:val="clear"/>
+            <w:tcMar>
+              <w:top w:type="dxa" w:w="90"/>
+              <w:left w:type="dxa" w:w="110"/>
+              <w:bottom w:type="dxa" w:w="90"/>
+              <w:right w:type="dxa" w:w="110"/>
+            </w:tcMar>
+            <w:vAlign w:val="top"/>
+          </w:tcPr>
+          <w:p>
+            <w:pPr>
+              <w:spacing w:after="0" w:before="0" w:line="252"/>
+            </w:pPr>
+            <w:r>
+              <w:rPr>
+                <w:rFonts w:ascii="Arial" w:cs="Arial" w:eastAsia="Arial" w:hAnsi="Arial"/>
+                <w:b w:val="false"/>
+                <w:bCs w:val="false"/>
+                <w:color w:val="000000"/>
+                <w:sz w:val="21"/>
+                <w:szCs w:val="21"/>
+              </w:rPr>
+              <w:t xml:space="preserve">Dear %%CUSTOMER_NAME%%, Following a further review of your %%PRODUCT_TYPE%% application %%APPLICATION_ID%%, we regret to inform you that your application has not been approved on this occasion. You may submit a new application after 30 days from the date of this decision. Thank you for your interest in Reem Bank. Best Regards, Reem Bank</w:t>
+            </w:r>
+          </w:p>
+        </w:tc>
+        <w:tc>
+          <w:tcPr>
+            <w:tcW w:type="dxa" w:w="2076"/>
+            <w:shd w:fill="FFFFFF" w:color="auto" w:val="clear"/>
+            <w:tcMar>
+              <w:top w:type="dxa" w:w="90"/>
+              <w:left w:type="dxa" w:w="110"/>
+              <w:bottom w:type="dxa" w:w="90"/>
+              <w:right w:type="dxa" w:w="110"/>
+            </w:tcMar>
+            <w:vAlign w:val="top"/>
+          </w:tcPr>
+          <w:p>
+            <w:pPr>
+              <w:spacing w:after="0" w:before="0" w:line="252"/>
+            </w:pPr>
+            <w:r>
+              <w:rPr>
+                <w:rFonts w:ascii="Arial" w:cs="Arial" w:eastAsia="Arial" w:hAnsi="Arial"/>
+                <w:b w:val="false"/>
+                <w:bCs w:val="false"/>
+                <w:color w:val="000000"/>
+                <w:sz w:val="21"/>
+                <w:szCs w:val="21"/>
+              </w:rPr>
+              <w:t xml:space="preserve">One time — when an application reopened via an approved revert is </w:t>
+            </w:r>
+            <w:r>
+              <w:rPr>
+                <w:rFonts w:ascii="Arial" w:cs="Arial" w:eastAsia="Arial" w:hAnsi="Arial"/>
+                <w:b/>
+                <w:bCs/>
+                <w:color w:val="000000"/>
+                <w:sz w:val="21"/>
+                <w:szCs w:val="21"/>
+              </w:rPr>
+              <w:t xml:space="preserve">rejected again</w:t>
+            </w:r>
+            <w:r>
+              <w:rPr>
+                <w:rFonts w:ascii="Arial" w:cs="Arial" w:eastAsia="Arial" w:hAnsi="Arial"/>
+                <w:b w:val="false"/>
+                <w:bCs w:val="false"/>
+                <w:color w:val="000000"/>
+                <w:sz w:val="21"/>
+                <w:szCs w:val="21"/>
+              </w:rPr>
+              <w:t xml:space="preserve"> after re-assessment (replaces the generic rejection notification for this case). Exactly one client email per re-assessment decision — one email either way.</w:t>
             </w:r>
           </w:p>
         </w:tc>
@@ -10232,7 +10690,7 @@
                 <w:sz w:val="21"/>
                 <w:szCs w:val="21"/>
               </w:rPr>
-              <w:t xml:space="preserve">Application re-decisioned against the currently published credit policy; on approval the customer receives the approval communication (section 6), on rejection the 30-day window restarts</w:t>
+              <w:t xml:space="preserve">Application re-decisioned against the currently published credit policy; the client receives exactly one re-assessment email either way — approval or rejection (section 6); on rejection the 30-day window restarts</w:t>
             </w:r>
           </w:p>
         </w:tc>
@@ -10468,278 +10926,6 @@
               <w:drawing>
                 <wp:inline distT="0" distB="0" distL="0" distR="0">
                   <wp:extent cx="1809750" cy="495300"/>
-                  <wp:effectExtent t="0" r="0" b="0" l="0"/>
-                  <wp:docPr id="1" name="" descr="" title=""/>
-                  <wp:cNvGraphicFramePr>
-                    <a:graphicFrameLocks xmlns:a="http://schemas.openxmlformats.org/drawingml/2006/main" noChangeAspect="1"/>
-                  </wp:cNvGraphicFramePr>
-                  <a:graphic xmlns:a="http://schemas.openxmlformats.org/drawingml/2006/main">
-                    <a:graphicData uri="http://schemas.openxmlformats.org/drawingml/2006/picture">
-                      <pic:pic xmlns:pic="http://schemas.openxmlformats.org/drawingml/2006/picture">
-                        <pic:nvPicPr>
-                          <pic:cNvPr id="0" name="" descr=""/>
-                          <pic:cNvPicPr>
-                            <a:picLocks noChangeAspect="1" noChangeArrowheads="1"/>
-                          </pic:cNvPicPr>
-                        </pic:nvPicPr>
-                        <pic:blipFill>
-                          <a:blip r:embed="rId19" cstate="none"/>
-                          <a:srcRect/>
-                          <a:stretch>
-                            <a:fillRect/>
-                          </a:stretch>
-                        </pic:blipFill>
-                        <pic:spPr bwMode="auto">
-                          <a:xfrm>
-                            <a:off x="0" y="0"/>
-                            <a:ext cx="1809750" cy="495300"/>
-                          </a:xfrm>
-                          <a:prstGeom prst="rect">
-                            <a:avLst/>
-                          </a:prstGeom>
-                        </pic:spPr>
-                      </pic:pic>
-                    </a:graphicData>
-                  </a:graphic>
-                </wp:inline>
-              </w:drawing>
-            </w:r>
-          </w:p>
-          <w:p>
-            <w:pPr>
-              <w:spacing w:after="0" w:before="0"/>
-              <w:jc w:val="center"/>
-            </w:pPr>
-            <w:r>
-              <w:rPr>
-                <w:rFonts w:ascii="Arial" w:cs="Arial" w:eastAsia="Arial" w:hAnsi="Arial"/>
-                <w:color w:val="595959"/>
-                <w:sz w:val="17"/>
-                <w:szCs w:val="17"/>
-              </w:rPr>
-              <w:t xml:space="preserve">Role Management › Application Enquiry (SC1)</w:t>
-            </w:r>
-          </w:p>
-        </w:tc>
-      </w:tr>
-      <w:tr>
-        <w:trPr>
-          <w:cantSplit/>
-        </w:trPr>
-        <w:tc>
-          <w:tcPr>
-            <w:tcW w:type="dxa" w:w="1715"/>
-            <w:shd w:fill="FFFFFF" w:color="auto" w:val="clear"/>
-            <w:tcMar>
-              <w:top w:type="dxa" w:w="90"/>
-              <w:left w:type="dxa" w:w="110"/>
-              <w:bottom w:type="dxa" w:w="90"/>
-              <w:right w:type="dxa" w:w="110"/>
-            </w:tcMar>
-            <w:vAlign w:val="top"/>
-          </w:tcPr>
-          <w:p>
-            <w:pPr>
-              <w:spacing w:after="0" w:before="0" w:line="252"/>
-            </w:pPr>
-            <w:r>
-              <w:rPr>
-                <w:rFonts w:ascii="Arial" w:cs="Arial" w:eastAsia="Arial" w:hAnsi="Arial"/>
-                <w:b w:val="false"/>
-                <w:bCs w:val="false"/>
-                <w:color w:val="000000"/>
-                <w:sz w:val="21"/>
-                <w:szCs w:val="21"/>
-              </w:rPr>
-              <w:t xml:space="preserve">Queue model / drop points</w:t>
-            </w:r>
-          </w:p>
-        </w:tc>
-        <w:tc>
-          <w:tcPr>
-            <w:tcW w:type="dxa" w:w="4062"/>
-            <w:shd w:fill="FFFFFF" w:color="auto" w:val="clear"/>
-            <w:tcMar>
-              <w:top w:type="dxa" w:w="90"/>
-              <w:left w:type="dxa" w:w="110"/>
-              <w:bottom w:type="dxa" w:w="90"/>
-              <w:right w:type="dxa" w:w="110"/>
-            </w:tcMar>
-            <w:vAlign w:val="top"/>
-          </w:tcPr>
-          <w:p>
-            <w:pPr>
-              <w:spacing w:after="0" w:before="0" w:line="252"/>
-            </w:pPr>
-            <w:r>
-              <w:rPr>
-                <w:rFonts w:ascii="Arial" w:cs="Arial" w:eastAsia="Arial" w:hAnsi="Arial"/>
-                <w:b w:val="false"/>
-                <w:bCs w:val="false"/>
-                <w:color w:val="000000"/>
-                <w:sz w:val="21"/>
-                <w:szCs w:val="21"/>
-              </w:rPr>
-              <w:t xml:space="preserve">One new queue (Revert Queue) in the Queue menu and the Manually Queue role section. The drop-points matrix gains a new entry (approved revert → Credit Queue L1), plus the parking of both DBR safety nets (Existing DBR &gt; 50% and Gross DBR &gt; 100%) → Credit Queue L1, which increases Credit Queue volume for every breach — not only reverted cases. Parked cases must carry the completed Rule Engine and Limit Assignment results into the queue view. The new parking drop points must be aligned with the drop-point / Failed Reason updates currently in delivery, and the DBR thresholds with the in-flight two-DBR calculation change.</w:t>
-            </w:r>
-          </w:p>
-        </w:tc>
-        <w:tc>
-          <w:tcPr>
-            <w:tcW w:type="dxa" w:w="3249"/>
-            <w:tcMar>
-              <w:top w:type="dxa" w:w="90"/>
-              <w:left w:type="dxa" w:w="110"/>
-              <w:bottom w:type="dxa" w:w="90"/>
-              <w:right w:type="dxa" w:w="110"/>
-            </w:tcMar>
-            <w:vAlign w:val="center"/>
-          </w:tcPr>
-          <w:p>
-            <w:pPr>
-              <w:spacing w:after="40" w:before="0"/>
-              <w:jc w:val="center"/>
-            </w:pPr>
-            <w:r>
-              <w:drawing>
-                <wp:inline distT="0" distB="0" distL="0" distR="0">
-                  <wp:extent cx="1809750" cy="828675"/>
-                  <wp:effectExtent t="0" r="0" b="0" l="0"/>
-                  <wp:docPr id="1" name="" descr="" title=""/>
-                  <wp:cNvGraphicFramePr>
-                    <a:graphicFrameLocks xmlns:a="http://schemas.openxmlformats.org/drawingml/2006/main" noChangeAspect="1"/>
-                  </wp:cNvGraphicFramePr>
-                  <a:graphic xmlns:a="http://schemas.openxmlformats.org/drawingml/2006/main">
-                    <a:graphicData uri="http://schemas.openxmlformats.org/drawingml/2006/picture">
-                      <pic:pic xmlns:pic="http://schemas.openxmlformats.org/drawingml/2006/picture">
-                        <pic:nvPicPr>
-                          <pic:cNvPr id="0" name="" descr=""/>
-                          <pic:cNvPicPr>
-                            <a:picLocks noChangeAspect="1" noChangeArrowheads="1"/>
-                          </pic:cNvPicPr>
-                        </pic:nvPicPr>
-                        <pic:blipFill>
-                          <a:blip r:embed="rId20" cstate="none"/>
-                          <a:srcRect/>
-                          <a:stretch>
-                            <a:fillRect/>
-                          </a:stretch>
-                        </pic:blipFill>
-                        <pic:spPr bwMode="auto">
-                          <a:xfrm>
-                            <a:off x="0" y="0"/>
-                            <a:ext cx="1809750" cy="828675"/>
-                          </a:xfrm>
-                          <a:prstGeom prst="rect">
-                            <a:avLst/>
-                          </a:prstGeom>
-                        </pic:spPr>
-                      </pic:pic>
-                    </a:graphicData>
-                  </a:graphic>
-                </wp:inline>
-              </w:drawing>
-            </w:r>
-          </w:p>
-          <w:p>
-            <w:pPr>
-              <w:spacing w:after="0" w:before="0"/>
-              <w:jc w:val="center"/>
-            </w:pPr>
-            <w:r>
-              <w:rPr>
-                <w:rFonts w:ascii="Arial" w:cs="Arial" w:eastAsia="Arial" w:hAnsi="Arial"/>
-                <w:color w:val="595959"/>
-                <w:sz w:val="17"/>
-                <w:szCs w:val="17"/>
-              </w:rPr>
-              <w:t xml:space="preserve">Queue menu — Revert Queue (SC4)</w:t>
-            </w:r>
-          </w:p>
-        </w:tc>
-      </w:tr>
-      <w:tr>
-        <w:trPr>
-          <w:cantSplit/>
-        </w:trPr>
-        <w:tc>
-          <w:tcPr>
-            <w:tcW w:type="dxa" w:w="1715"/>
-            <w:shd w:fill="FFFFFF" w:color="auto" w:val="clear"/>
-            <w:tcMar>
-              <w:top w:type="dxa" w:w="90"/>
-              <w:left w:type="dxa" w:w="110"/>
-              <w:bottom w:type="dxa" w:w="90"/>
-              <w:right w:type="dxa" w:w="110"/>
-            </w:tcMar>
-            <w:vAlign w:val="top"/>
-          </w:tcPr>
-          <w:p>
-            <w:pPr>
-              <w:spacing w:after="0" w:before="0" w:line="252"/>
-            </w:pPr>
-            <w:r>
-              <w:rPr>
-                <w:rFonts w:ascii="Arial" w:cs="Arial" w:eastAsia="Arial" w:hAnsi="Arial"/>
-                <w:b w:val="false"/>
-                <w:bCs w:val="false"/>
-                <w:color w:val="000000"/>
-                <w:sz w:val="21"/>
-                <w:szCs w:val="21"/>
-              </w:rPr>
-              <w:t xml:space="preserve">Status model / mobile app</w:t>
-            </w:r>
-          </w:p>
-        </w:tc>
-        <w:tc>
-          <w:tcPr>
-            <w:tcW w:type="dxa" w:w="4062"/>
-            <w:shd w:fill="FFFFFF" w:color="auto" w:val="clear"/>
-            <w:tcMar>
-              <w:top w:type="dxa" w:w="90"/>
-              <w:left w:type="dxa" w:w="110"/>
-              <w:bottom w:type="dxa" w:w="90"/>
-              <w:right w:type="dxa" w:w="110"/>
-            </w:tcMar>
-            <w:vAlign w:val="top"/>
-          </w:tcPr>
-          <w:p>
-            <w:pPr>
-              <w:spacing w:after="0" w:before="0" w:line="252"/>
-            </w:pPr>
-            <w:r>
-              <w:rPr>
-                <w:rFonts w:ascii="Arial" w:cs="Arial" w:eastAsia="Arial" w:hAnsi="Arial"/>
-                <w:b w:val="false"/>
-                <w:bCs w:val="false"/>
-                <w:color w:val="000000"/>
-                <w:sz w:val="21"/>
-                <w:szCs w:val="21"/>
-              </w:rPr>
-              <w:t xml:space="preserve">No new Application Status is introduced (Revert_App flag only, mirroring Cancel_App), so the mobile application requires no change and never displays a state that misrepresents the case.</w:t>
-            </w:r>
-          </w:p>
-        </w:tc>
-        <w:tc>
-          <w:tcPr>
-            <w:tcW w:type="dxa" w:w="3249"/>
-            <w:tcMar>
-              <w:top w:type="dxa" w:w="90"/>
-              <w:left w:type="dxa" w:w="110"/>
-              <w:bottom w:type="dxa" w:w="90"/>
-              <w:right w:type="dxa" w:w="110"/>
-            </w:tcMar>
-            <w:vAlign w:val="center"/>
-          </w:tcPr>
-          <w:p>
-            <w:pPr>
-              <w:spacing w:after="40" w:before="0"/>
-              <w:jc w:val="center"/>
-            </w:pPr>
-            <w:r>
-              <w:drawing>
-                <wp:inline distT="0" distB="0" distL="0" distR="0">
-                  <wp:extent cx="1809750" cy="514350"/>
                   <wp:effectExtent t="0" r="0" b="0" l="0"/>
                   <wp:docPr id="1" name="" descr="" title=""/>
                   <wp:cNvGraphicFramePr>
@@ -10764,7 +10950,7 @@
                         <pic:spPr bwMode="auto">
                           <a:xfrm>
                             <a:off x="0" y="0"/>
-                            <a:ext cx="1809750" cy="514350"/>
+                            <a:ext cx="1809750" cy="495300"/>
                           </a:xfrm>
                           <a:prstGeom prst="rect">
                             <a:avLst/>
@@ -10789,7 +10975,7 @@
                 <w:sz w:val="17"/>
                 <w:szCs w:val="17"/>
               </w:rPr>
-              <w:t xml:space="preserve">Status transition on approved revert</w:t>
+              <w:t xml:space="preserve">Role Management › Application Enquiry (SC1)</w:t>
             </w:r>
           </w:p>
         </w:tc>
@@ -10823,7 +11009,7 @@
                 <w:sz w:val="21"/>
                 <w:szCs w:val="21"/>
               </w:rPr>
-              <w:t xml:space="preserve">Audit trail</w:t>
+              <w:t xml:space="preserve">Queue model / drop points</w:t>
             </w:r>
           </w:p>
         </w:tc>
@@ -10852,7 +11038,7 @@
                 <w:sz w:val="21"/>
                 <w:szCs w:val="21"/>
               </w:rPr>
-              <w:t xml:space="preserve">Three new audit steps — 'Manual revert process', 'Revert Queue', 'Auto Revert Approval on timeout' (mirroring cancellation's 'Auto Cancellation on timeout') — each writing the full standard field set. The original rejection record is never modified. Revertibility is derived from the audit step recorded at rejection, so the known defect in the audit trail written for Financial-DBR rejections must be resolved before this feature relies on it.</w:t>
+              <w:t xml:space="preserve">One new queue (Revert Queue) in the Queue menu and the Manually Queue role section. The drop-points matrix gains a new entry (approved revert → Credit Queue L1), plus the parking of both DBR safety nets (Existing DBR &gt; 50% and Gross DBR &gt; 100%) → Credit Queue L1, which increases Credit Queue volume for every breach — not only reverted cases. Parked cases must carry the completed Rule Engine and Limit Assignment results into the queue view. The new parking drop points must be aligned with the drop-point / Failed Reason updates currently in delivery, and the DBR thresholds with the in-flight two-DBR calculation change.</w:t>
             </w:r>
           </w:p>
         </w:tc>
@@ -10875,7 +11061,7 @@
             <w:r>
               <w:drawing>
                 <wp:inline distT="0" distB="0" distL="0" distR="0">
-                  <wp:extent cx="1809750" cy="466725"/>
+                  <wp:extent cx="1809750" cy="828675"/>
                   <wp:effectExtent t="0" r="0" b="0" l="0"/>
                   <wp:docPr id="1" name="" descr="" title=""/>
                   <wp:cNvGraphicFramePr>
@@ -10900,7 +11086,7 @@
                         <pic:spPr bwMode="auto">
                           <a:xfrm>
                             <a:off x="0" y="0"/>
-                            <a:ext cx="1809750" cy="466725"/>
+                            <a:ext cx="1809750" cy="828675"/>
                           </a:xfrm>
                           <a:prstGeom prst="rect">
                             <a:avLst/>
@@ -10925,7 +11111,7 @@
                 <w:sz w:val="17"/>
                 <w:szCs w:val="17"/>
               </w:rPr>
-              <w:t xml:space="preserve">Application history steps — Application Enquiry</w:t>
+              <w:t xml:space="preserve">Queue menu — Revert Queue (SC4)</w:t>
             </w:r>
           </w:p>
         </w:tc>
@@ -10959,7 +11145,7 @@
                 <w:sz w:val="21"/>
                 <w:szCs w:val="21"/>
               </w:rPr>
-              <w:t xml:space="preserve">Communication Setup</w:t>
+              <w:t xml:space="preserve">Status model / mobile app</w:t>
             </w:r>
           </w:p>
         </w:tc>
@@ -10982,90 +11168,13 @@
             <w:r>
               <w:rPr>
                 <w:rFonts w:ascii="Arial" w:cs="Arial" w:eastAsia="Arial" w:hAnsi="Arial"/>
-                <w:b/>
-                <w:bCs/>
-                <w:color w:val="000000"/>
-                <w:sz w:val="21"/>
-                <w:szCs w:val="21"/>
-              </w:rPr>
-              <w:t xml:space="preserve">Three templates newly added in Communication Setup:</w:t>
-            </w:r>
-            <w:r>
-              <w:rPr>
-                <w:rFonts w:ascii="Arial" w:cs="Arial" w:eastAsia="Arial" w:hAnsi="Arial"/>
-                <w:b w:val="false"/>
-                <w:bCs w:val="false"/>
-                <w:color w:val="000000"/>
-                <w:sz w:val="21"/>
-                <w:szCs w:val="21"/>
-              </w:rPr>
-              <w:t xml:space="preserve"> two </w:t>
-            </w:r>
-            <w:r>
-              <w:rPr>
-                <w:rFonts w:ascii="Arial" w:cs="Arial" w:eastAsia="Arial" w:hAnsi="Arial"/>
-                <w:b/>
-                <w:bCs/>
-                <w:color w:val="000000"/>
-                <w:sz w:val="21"/>
-                <w:szCs w:val="21"/>
-              </w:rPr>
-              <w:t xml:space="preserve">Email (Bank)</w:t>
-            </w:r>
-            <w:r>
-              <w:rPr>
-                <w:rFonts w:ascii="Arial" w:cs="Arial" w:eastAsia="Arial" w:hAnsi="Arial"/>
-                <w:b w:val="false"/>
-                <w:bCs w:val="false"/>
-                <w:color w:val="000000"/>
-                <w:sz w:val="21"/>
-                <w:szCs w:val="21"/>
-              </w:rPr>
-              <w:t xml:space="preserve"> templates per product (revert approved / not approved) and one </w:t>
-            </w:r>
-            <w:r>
-              <w:rPr>
-                <w:rFonts w:ascii="Arial" w:cs="Arial" w:eastAsia="Arial" w:hAnsi="Arial"/>
-                <w:b/>
-                <w:bCs/>
-                <w:color w:val="000000"/>
-                <w:sz w:val="21"/>
-                <w:szCs w:val="21"/>
-              </w:rPr>
-              <w:t xml:space="preserve">Email (Client)</w:t>
-            </w:r>
-            <w:r>
-              <w:rPr>
-                <w:rFonts w:ascii="Arial" w:cs="Arial" w:eastAsia="Arial" w:hAnsi="Arial"/>
-                <w:b w:val="false"/>
-                <w:bCs w:val="false"/>
-                <w:color w:val="000000"/>
-                <w:sz w:val="21"/>
-                <w:szCs w:val="21"/>
-              </w:rPr>
-              <w:t xml:space="preserve"> template (approval after re-assessment, mirroring the standard approval message — section 6). English, banking tone, signing off as Reem Bank. </w:t>
-            </w:r>
-            <w:r>
-              <w:rPr>
-                <w:rFonts w:ascii="Arial" w:cs="Arial" w:eastAsia="Arial" w:hAnsi="Arial"/>
-                <w:b/>
-                <w:bCs/>
-                <w:color w:val="000000"/>
-                <w:sz w:val="21"/>
-                <w:szCs w:val="21"/>
-              </w:rPr>
-              <w:t xml:space="preserve">Exactly one client email per re-assessment decision</w:t>
-            </w:r>
-            <w:r>
-              <w:rPr>
-                <w:rFonts w:ascii="Arial" w:cs="Arial" w:eastAsia="Arial" w:hAnsi="Arial"/>
-                <w:b w:val="false"/>
-                <w:bCs w:val="false"/>
-                <w:color w:val="000000"/>
-                <w:sz w:val="21"/>
-                <w:szCs w:val="21"/>
-              </w:rPr>
-              <w:t xml:space="preserve"> — Approve or Reject — with duplicate decision notifications suppressed on the reopened run. The Compliance / Risk reject confirmation texts stay as they are — those rejections remain non-revertible.</w:t>
+                <w:b w:val="false"/>
+                <w:bCs w:val="false"/>
+                <w:color w:val="000000"/>
+                <w:sz w:val="21"/>
+                <w:szCs w:val="21"/>
+              </w:rPr>
+              <w:t xml:space="preserve">No new Application Status is introduced (Revert_App flag only, mirroring Cancel_App), so the mobile application requires no change and never displays a state that misrepresents the case.</w:t>
             </w:r>
           </w:p>
         </w:tc>
@@ -11088,7 +11197,7 @@
             <w:r>
               <w:drawing>
                 <wp:inline distT="0" distB="0" distL="0" distR="0">
-                  <wp:extent cx="1809750" cy="695325"/>
+                  <wp:extent cx="1809750" cy="514350"/>
                   <wp:effectExtent t="0" r="0" b="0" l="0"/>
                   <wp:docPr id="1" name="" descr="" title=""/>
                   <wp:cNvGraphicFramePr>
@@ -11113,7 +11222,7 @@
                         <pic:spPr bwMode="auto">
                           <a:xfrm>
                             <a:off x="0" y="0"/>
-                            <a:ext cx="1809750" cy="695325"/>
+                            <a:ext cx="1809750" cy="514350"/>
                           </a:xfrm>
                           <a:prstGeom prst="rect">
                             <a:avLst/>
@@ -11138,7 +11247,7 @@
                 <w:sz w:val="17"/>
                 <w:szCs w:val="17"/>
               </w:rPr>
-              <w:t xml:space="preserve">Communication Setup › Email Templates — Type: Client / Bank</w:t>
+              <w:t xml:space="preserve">Status transition on approved revert</w:t>
             </w:r>
           </w:p>
         </w:tc>
@@ -11172,7 +11281,7 @@
                 <w:sz w:val="21"/>
                 <w:szCs w:val="21"/>
               </w:rPr>
-              <w:t xml:space="preserve">Reporting / MIS</w:t>
+              <w:t xml:space="preserve">Audit trail</w:t>
             </w:r>
           </w:p>
         </w:tc>
@@ -11201,7 +11310,7 @@
                 <w:sz w:val="21"/>
                 <w:szCs w:val="21"/>
               </w:rPr>
-              <w:t xml:space="preserve">WIP, Exception, Policy Exception, E2E and Approved Transactions reports must handle reopened cases: rejection counts become mutable, E2E must not double-count the second pass, and an approval after revert should be identifiable as such.</w:t>
+              <w:t xml:space="preserve">Three new audit steps — 'Manual revert process', 'Revert Queue', 'Auto Revert Approval on timeout' (mirroring cancellation's 'Auto Cancellation on timeout') — each writing the full standard field set. The original rejection record is never modified. Revertibility is derived from the audit step recorded at rejection, so the known defect in the audit trail written for Financial-DBR rejections must be resolved before this feature relies on it.</w:t>
             </w:r>
           </w:p>
         </w:tc>
@@ -11224,7 +11333,7 @@
             <w:r>
               <w:drawing>
                 <wp:inline distT="0" distB="0" distL="0" distR="0">
-                  <wp:extent cx="1809750" cy="457200"/>
+                  <wp:extent cx="1809750" cy="466725"/>
                   <wp:effectExtent t="0" r="0" b="0" l="0"/>
                   <wp:docPr id="1" name="" descr="" title=""/>
                   <wp:cNvGraphicFramePr>
@@ -11249,7 +11358,7 @@
                         <pic:spPr bwMode="auto">
                           <a:xfrm>
                             <a:off x="0" y="0"/>
-                            <a:ext cx="1809750" cy="457200"/>
+                            <a:ext cx="1809750" cy="466725"/>
                           </a:xfrm>
                           <a:prstGeom prst="rect">
                             <a:avLst/>
@@ -11274,7 +11383,7 @@
                 <w:sz w:val="17"/>
                 <w:szCs w:val="17"/>
               </w:rPr>
-              <w:t xml:space="preserve">Enquiry › Report Enquiry</w:t>
+              <w:t xml:space="preserve">Application history steps — Application Enquiry</w:t>
             </w:r>
           </w:p>
         </w:tc>
@@ -11308,7 +11417,7 @@
                 <w:sz w:val="21"/>
                 <w:szCs w:val="21"/>
               </w:rPr>
-              <w:t xml:space="preserve">Services</w:t>
+              <w:t xml:space="preserve">Communication Setup</w:t>
             </w:r>
           </w:p>
         </w:tc>
@@ -11331,13 +11440,90 @@
             <w:r>
               <w:rPr>
                 <w:rFonts w:ascii="Arial" w:cs="Arial" w:eastAsia="Arial" w:hAnsi="Arial"/>
-                <w:b w:val="false"/>
-                <w:bCs w:val="false"/>
-                <w:color w:val="000000"/>
-                <w:sz w:val="21"/>
-                <w:szCs w:val="21"/>
-              </w:rPr>
-              <w:t xml:space="preserve">backoffice-service, application-service, queue-service, user-service, audit-trail-service, notification-service, scheduler-service (timeout job) and work-flow-service. The workflow engine is the key estimation item: a rejected application’s process instance has ended, and reverting requires resuming it or re-instantiating at the queue task.</w:t>
+                <w:b/>
+                <w:bCs/>
+                <w:color w:val="000000"/>
+                <w:sz w:val="21"/>
+                <w:szCs w:val="21"/>
+              </w:rPr>
+              <w:t xml:space="preserve">Four templates newly added in Communication Setup:</w:t>
+            </w:r>
+            <w:r>
+              <w:rPr>
+                <w:rFonts w:ascii="Arial" w:cs="Arial" w:eastAsia="Arial" w:hAnsi="Arial"/>
+                <w:b w:val="false"/>
+                <w:bCs w:val="false"/>
+                <w:color w:val="000000"/>
+                <w:sz w:val="21"/>
+                <w:szCs w:val="21"/>
+              </w:rPr>
+              <w:t xml:space="preserve"> two </w:t>
+            </w:r>
+            <w:r>
+              <w:rPr>
+                <w:rFonts w:ascii="Arial" w:cs="Arial" w:eastAsia="Arial" w:hAnsi="Arial"/>
+                <w:b/>
+                <w:bCs/>
+                <w:color w:val="000000"/>
+                <w:sz w:val="21"/>
+                <w:szCs w:val="21"/>
+              </w:rPr>
+              <w:t xml:space="preserve">Email (Bank)</w:t>
+            </w:r>
+            <w:r>
+              <w:rPr>
+                <w:rFonts w:ascii="Arial" w:cs="Arial" w:eastAsia="Arial" w:hAnsi="Arial"/>
+                <w:b w:val="false"/>
+                <w:bCs w:val="false"/>
+                <w:color w:val="000000"/>
+                <w:sz w:val="21"/>
+                <w:szCs w:val="21"/>
+              </w:rPr>
+              <w:t xml:space="preserve"> templates per product (revert approved / not approved) and two </w:t>
+            </w:r>
+            <w:r>
+              <w:rPr>
+                <w:rFonts w:ascii="Arial" w:cs="Arial" w:eastAsia="Arial" w:hAnsi="Arial"/>
+                <w:b/>
+                <w:bCs/>
+                <w:color w:val="000000"/>
+                <w:sz w:val="21"/>
+                <w:szCs w:val="21"/>
+              </w:rPr>
+              <w:t xml:space="preserve">Email (Client)</w:t>
+            </w:r>
+            <w:r>
+              <w:rPr>
+                <w:rFonts w:ascii="Arial" w:cs="Arial" w:eastAsia="Arial" w:hAnsi="Arial"/>
+                <w:b w:val="false"/>
+                <w:bCs w:val="false"/>
+                <w:color w:val="000000"/>
+                <w:sz w:val="21"/>
+                <w:szCs w:val="21"/>
+              </w:rPr>
+              <w:t xml:space="preserve"> templates — approval after re-assessment and rejection after re-assessment, both mentioning the further review (section 6). English, banking tone, signing off as Reem Bank. </w:t>
+            </w:r>
+            <w:r>
+              <w:rPr>
+                <w:rFonts w:ascii="Arial" w:cs="Arial" w:eastAsia="Arial" w:hAnsi="Arial"/>
+                <w:b/>
+                <w:bCs/>
+                <w:color w:val="000000"/>
+                <w:sz w:val="21"/>
+                <w:szCs w:val="21"/>
+              </w:rPr>
+              <w:t xml:space="preserve">Exactly one client email per re-assessment decision</w:t>
+            </w:r>
+            <w:r>
+              <w:rPr>
+                <w:rFonts w:ascii="Arial" w:cs="Arial" w:eastAsia="Arial" w:hAnsi="Arial"/>
+                <w:b w:val="false"/>
+                <w:bCs w:val="false"/>
+                <w:color w:val="000000"/>
+                <w:sz w:val="21"/>
+                <w:szCs w:val="21"/>
+              </w:rPr>
+              <w:t xml:space="preserve"> — Approve or Reject — with duplicate decision notifications suppressed on the reopened run. The Compliance / Risk reject confirmation texts stay as they are — those rejections remain non-revertible.</w:t>
             </w:r>
           </w:p>
         </w:tc>
@@ -11360,7 +11546,7 @@
             <w:r>
               <w:drawing>
                 <wp:inline distT="0" distB="0" distL="0" distR="0">
-                  <wp:extent cx="1809750" cy="809625"/>
+                  <wp:extent cx="1809750" cy="695325"/>
                   <wp:effectExtent t="0" r="0" b="0" l="0"/>
                   <wp:docPr id="1" name="" descr="" title=""/>
                   <wp:cNvGraphicFramePr>
@@ -11385,7 +11571,7 @@
                         <pic:spPr bwMode="auto">
                           <a:xfrm>
                             <a:off x="0" y="0"/>
-                            <a:ext cx="1809750" cy="809625"/>
+                            <a:ext cx="1809750" cy="695325"/>
                           </a:xfrm>
                           <a:prstGeom prst="rect">
                             <a:avLst/>
@@ -11410,7 +11596,7 @@
                 <w:sz w:val="17"/>
                 <w:szCs w:val="17"/>
               </w:rPr>
-              <w:t xml:space="preserve">Services touched — workflow engine is the key item</w:t>
+              <w:t xml:space="preserve">Communication Setup › Email Templates — Type: Client / Bank</w:t>
             </w:r>
           </w:p>
         </w:tc>
@@ -11444,7 +11630,7 @@
                 <w:sz w:val="21"/>
                 <w:szCs w:val="21"/>
               </w:rPr>
-              <w:t xml:space="preserve">Credit policy versioning</w:t>
+              <w:t xml:space="preserve">Reporting / MIS</w:t>
             </w:r>
           </w:p>
         </w:tc>
@@ -11473,7 +11659,7 @@
                 <w:sz w:val="21"/>
                 <w:szCs w:val="21"/>
               </w:rPr>
-              <w:t xml:space="preserve">Post-revert re-decisioning evaluates against the currently published Strategy / Score Check / Income Multiplier versions — which is the point of the feature — and the audit trail should record which published version was applied.</w:t>
+              <w:t xml:space="preserve">WIP, Exception, Policy Exception, E2E and Approved Transactions reports must handle reopened cases: rejection counts become mutable, E2E must not double-count the second pass, and an approval after revert should be identifiable as such.</w:t>
             </w:r>
           </w:p>
         </w:tc>
@@ -11496,7 +11682,7 @@
             <w:r>
               <w:drawing>
                 <wp:inline distT="0" distB="0" distL="0" distR="0">
-                  <wp:extent cx="1809750" cy="1019175"/>
+                  <wp:extent cx="1809750" cy="457200"/>
                   <wp:effectExtent t="0" r="0" b="0" l="0"/>
                   <wp:docPr id="1" name="" descr="" title=""/>
                   <wp:cNvGraphicFramePr>
@@ -11521,6 +11707,278 @@
                         <pic:spPr bwMode="auto">
                           <a:xfrm>
                             <a:off x="0" y="0"/>
+                            <a:ext cx="1809750" cy="457200"/>
+                          </a:xfrm>
+                          <a:prstGeom prst="rect">
+                            <a:avLst/>
+                          </a:prstGeom>
+                        </pic:spPr>
+                      </pic:pic>
+                    </a:graphicData>
+                  </a:graphic>
+                </wp:inline>
+              </w:drawing>
+            </w:r>
+          </w:p>
+          <w:p>
+            <w:pPr>
+              <w:spacing w:after="0" w:before="0"/>
+              <w:jc w:val="center"/>
+            </w:pPr>
+            <w:r>
+              <w:rPr>
+                <w:rFonts w:ascii="Arial" w:cs="Arial" w:eastAsia="Arial" w:hAnsi="Arial"/>
+                <w:color w:val="595959"/>
+                <w:sz w:val="17"/>
+                <w:szCs w:val="17"/>
+              </w:rPr>
+              <w:t xml:space="preserve">Enquiry › Report Enquiry</w:t>
+            </w:r>
+          </w:p>
+        </w:tc>
+      </w:tr>
+      <w:tr>
+        <w:trPr>
+          <w:cantSplit/>
+        </w:trPr>
+        <w:tc>
+          <w:tcPr>
+            <w:tcW w:type="dxa" w:w="1715"/>
+            <w:shd w:fill="FFFFFF" w:color="auto" w:val="clear"/>
+            <w:tcMar>
+              <w:top w:type="dxa" w:w="90"/>
+              <w:left w:type="dxa" w:w="110"/>
+              <w:bottom w:type="dxa" w:w="90"/>
+              <w:right w:type="dxa" w:w="110"/>
+            </w:tcMar>
+            <w:vAlign w:val="top"/>
+          </w:tcPr>
+          <w:p>
+            <w:pPr>
+              <w:spacing w:after="0" w:before="0" w:line="252"/>
+            </w:pPr>
+            <w:r>
+              <w:rPr>
+                <w:rFonts w:ascii="Arial" w:cs="Arial" w:eastAsia="Arial" w:hAnsi="Arial"/>
+                <w:b w:val="false"/>
+                <w:bCs w:val="false"/>
+                <w:color w:val="000000"/>
+                <w:sz w:val="21"/>
+                <w:szCs w:val="21"/>
+              </w:rPr>
+              <w:t xml:space="preserve">Services</w:t>
+            </w:r>
+          </w:p>
+        </w:tc>
+        <w:tc>
+          <w:tcPr>
+            <w:tcW w:type="dxa" w:w="4062"/>
+            <w:shd w:fill="FFFFFF" w:color="auto" w:val="clear"/>
+            <w:tcMar>
+              <w:top w:type="dxa" w:w="90"/>
+              <w:left w:type="dxa" w:w="110"/>
+              <w:bottom w:type="dxa" w:w="90"/>
+              <w:right w:type="dxa" w:w="110"/>
+            </w:tcMar>
+            <w:vAlign w:val="top"/>
+          </w:tcPr>
+          <w:p>
+            <w:pPr>
+              <w:spacing w:after="0" w:before="0" w:line="252"/>
+            </w:pPr>
+            <w:r>
+              <w:rPr>
+                <w:rFonts w:ascii="Arial" w:cs="Arial" w:eastAsia="Arial" w:hAnsi="Arial"/>
+                <w:b w:val="false"/>
+                <w:bCs w:val="false"/>
+                <w:color w:val="000000"/>
+                <w:sz w:val="21"/>
+                <w:szCs w:val="21"/>
+              </w:rPr>
+              <w:t xml:space="preserve">backoffice-service, application-service, queue-service, user-service, audit-trail-service, notification-service, scheduler-service (timeout job) and work-flow-service. The workflow engine is the key estimation item: a rejected application’s process instance has ended, and reverting requires resuming it or re-instantiating at the queue task.</w:t>
+            </w:r>
+          </w:p>
+        </w:tc>
+        <w:tc>
+          <w:tcPr>
+            <w:tcW w:type="dxa" w:w="3249"/>
+            <w:tcMar>
+              <w:top w:type="dxa" w:w="90"/>
+              <w:left w:type="dxa" w:w="110"/>
+              <w:bottom w:type="dxa" w:w="90"/>
+              <w:right w:type="dxa" w:w="110"/>
+            </w:tcMar>
+            <w:vAlign w:val="center"/>
+          </w:tcPr>
+          <w:p>
+            <w:pPr>
+              <w:spacing w:after="40" w:before="0"/>
+              <w:jc w:val="center"/>
+            </w:pPr>
+            <w:r>
+              <w:drawing>
+                <wp:inline distT="0" distB="0" distL="0" distR="0">
+                  <wp:extent cx="1809750" cy="809625"/>
+                  <wp:effectExtent t="0" r="0" b="0" l="0"/>
+                  <wp:docPr id="1" name="" descr="" title=""/>
+                  <wp:cNvGraphicFramePr>
+                    <a:graphicFrameLocks xmlns:a="http://schemas.openxmlformats.org/drawingml/2006/main" noChangeAspect="1"/>
+                  </wp:cNvGraphicFramePr>
+                  <a:graphic xmlns:a="http://schemas.openxmlformats.org/drawingml/2006/main">
+                    <a:graphicData uri="http://schemas.openxmlformats.org/drawingml/2006/picture">
+                      <pic:pic xmlns:pic="http://schemas.openxmlformats.org/drawingml/2006/picture">
+                        <pic:nvPicPr>
+                          <pic:cNvPr id="0" name="" descr=""/>
+                          <pic:cNvPicPr>
+                            <a:picLocks noChangeAspect="1" noChangeArrowheads="1"/>
+                          </pic:cNvPicPr>
+                        </pic:nvPicPr>
+                        <pic:blipFill>
+                          <a:blip r:embed="rId27" cstate="none"/>
+                          <a:srcRect/>
+                          <a:stretch>
+                            <a:fillRect/>
+                          </a:stretch>
+                        </pic:blipFill>
+                        <pic:spPr bwMode="auto">
+                          <a:xfrm>
+                            <a:off x="0" y="0"/>
+                            <a:ext cx="1809750" cy="809625"/>
+                          </a:xfrm>
+                          <a:prstGeom prst="rect">
+                            <a:avLst/>
+                          </a:prstGeom>
+                        </pic:spPr>
+                      </pic:pic>
+                    </a:graphicData>
+                  </a:graphic>
+                </wp:inline>
+              </w:drawing>
+            </w:r>
+          </w:p>
+          <w:p>
+            <w:pPr>
+              <w:spacing w:after="0" w:before="0"/>
+              <w:jc w:val="center"/>
+            </w:pPr>
+            <w:r>
+              <w:rPr>
+                <w:rFonts w:ascii="Arial" w:cs="Arial" w:eastAsia="Arial" w:hAnsi="Arial"/>
+                <w:color w:val="595959"/>
+                <w:sz w:val="17"/>
+                <w:szCs w:val="17"/>
+              </w:rPr>
+              <w:t xml:space="preserve">Services touched — workflow engine is the key item</w:t>
+            </w:r>
+          </w:p>
+        </w:tc>
+      </w:tr>
+      <w:tr>
+        <w:trPr>
+          <w:cantSplit/>
+        </w:trPr>
+        <w:tc>
+          <w:tcPr>
+            <w:tcW w:type="dxa" w:w="1715"/>
+            <w:shd w:fill="FFFFFF" w:color="auto" w:val="clear"/>
+            <w:tcMar>
+              <w:top w:type="dxa" w:w="90"/>
+              <w:left w:type="dxa" w:w="110"/>
+              <w:bottom w:type="dxa" w:w="90"/>
+              <w:right w:type="dxa" w:w="110"/>
+            </w:tcMar>
+            <w:vAlign w:val="top"/>
+          </w:tcPr>
+          <w:p>
+            <w:pPr>
+              <w:spacing w:after="0" w:before="0" w:line="252"/>
+            </w:pPr>
+            <w:r>
+              <w:rPr>
+                <w:rFonts w:ascii="Arial" w:cs="Arial" w:eastAsia="Arial" w:hAnsi="Arial"/>
+                <w:b w:val="false"/>
+                <w:bCs w:val="false"/>
+                <w:color w:val="000000"/>
+                <w:sz w:val="21"/>
+                <w:szCs w:val="21"/>
+              </w:rPr>
+              <w:t xml:space="preserve">Credit policy versioning</w:t>
+            </w:r>
+          </w:p>
+        </w:tc>
+        <w:tc>
+          <w:tcPr>
+            <w:tcW w:type="dxa" w:w="4062"/>
+            <w:shd w:fill="FFFFFF" w:color="auto" w:val="clear"/>
+            <w:tcMar>
+              <w:top w:type="dxa" w:w="90"/>
+              <w:left w:type="dxa" w:w="110"/>
+              <w:bottom w:type="dxa" w:w="90"/>
+              <w:right w:type="dxa" w:w="110"/>
+            </w:tcMar>
+            <w:vAlign w:val="top"/>
+          </w:tcPr>
+          <w:p>
+            <w:pPr>
+              <w:spacing w:after="0" w:before="0" w:line="252"/>
+            </w:pPr>
+            <w:r>
+              <w:rPr>
+                <w:rFonts w:ascii="Arial" w:cs="Arial" w:eastAsia="Arial" w:hAnsi="Arial"/>
+                <w:b w:val="false"/>
+                <w:bCs w:val="false"/>
+                <w:color w:val="000000"/>
+                <w:sz w:val="21"/>
+                <w:szCs w:val="21"/>
+              </w:rPr>
+              <w:t xml:space="preserve">Post-revert re-decisioning evaluates against the currently published Strategy / Score Check / Income Multiplier versions — which is the point of the feature — and the audit trail should record which published version was applied.</w:t>
+            </w:r>
+          </w:p>
+        </w:tc>
+        <w:tc>
+          <w:tcPr>
+            <w:tcW w:type="dxa" w:w="3249"/>
+            <w:tcMar>
+              <w:top w:type="dxa" w:w="90"/>
+              <w:left w:type="dxa" w:w="110"/>
+              <w:bottom w:type="dxa" w:w="90"/>
+              <w:right w:type="dxa" w:w="110"/>
+            </w:tcMar>
+            <w:vAlign w:val="center"/>
+          </w:tcPr>
+          <w:p>
+            <w:pPr>
+              <w:spacing w:after="40" w:before="0"/>
+              <w:jc w:val="center"/>
+            </w:pPr>
+            <w:r>
+              <w:drawing>
+                <wp:inline distT="0" distB="0" distL="0" distR="0">
+                  <wp:extent cx="1809750" cy="1019175"/>
+                  <wp:effectExtent t="0" r="0" b="0" l="0"/>
+                  <wp:docPr id="1" name="" descr="" title=""/>
+                  <wp:cNvGraphicFramePr>
+                    <a:graphicFrameLocks xmlns:a="http://schemas.openxmlformats.org/drawingml/2006/main" noChangeAspect="1"/>
+                  </wp:cNvGraphicFramePr>
+                  <a:graphic xmlns:a="http://schemas.openxmlformats.org/drawingml/2006/main">
+                    <a:graphicData uri="http://schemas.openxmlformats.org/drawingml/2006/picture">
+                      <pic:pic xmlns:pic="http://schemas.openxmlformats.org/drawingml/2006/picture">
+                        <pic:nvPicPr>
+                          <pic:cNvPr id="0" name="" descr=""/>
+                          <pic:cNvPicPr>
+                            <a:picLocks noChangeAspect="1" noChangeArrowheads="1"/>
+                          </pic:cNvPicPr>
+                        </pic:nvPicPr>
+                        <pic:blipFill>
+                          <a:blip r:embed="rId28" cstate="none"/>
+                          <a:srcRect/>
+                          <a:stretch>
+                            <a:fillRect/>
+                          </a:stretch>
+                        </pic:blipFill>
+                        <pic:spPr bwMode="auto">
+                          <a:xfrm>
+                            <a:off x="0" y="0"/>
                             <a:ext cx="1809750" cy="1019175"/>
                           </a:xfrm>
                           <a:prstGeom prst="rect">
@@ -11771,69 +12229,6 @@
                 <w:szCs w:val="21"/>
               </w:rPr>
               <w:t xml:space="preserve">Confirm the timeout period [X] — 5 days proposed, configurable in database, same as the cancellation timeout (RF source: currently set to 5 days).</w:t>
-            </w:r>
-          </w:p>
-        </w:tc>
-      </w:tr>
-      <w:tr>
-        <w:trPr>
-          <w:cantSplit/>
-        </w:trPr>
-        <w:tc>
-          <w:tcPr>
-            <w:tcW w:type="dxa" w:w="542"/>
-            <w:shd w:fill="FFFFFF" w:color="auto" w:val="clear"/>
-            <w:tcMar>
-              <w:top w:type="dxa" w:w="90"/>
-              <w:left w:type="dxa" w:w="110"/>
-              <w:bottom w:type="dxa" w:w="90"/>
-              <w:right w:type="dxa" w:w="110"/>
-            </w:tcMar>
-            <w:vAlign w:val="top"/>
-          </w:tcPr>
-          <w:p>
-            <w:pPr>
-              <w:spacing w:after="0" w:before="0" w:line="252"/>
-            </w:pPr>
-            <w:r>
-              <w:rPr>
-                <w:rFonts w:ascii="Arial" w:cs="Arial" w:eastAsia="Arial" w:hAnsi="Arial"/>
-                <w:b w:val="false"/>
-                <w:bCs w:val="false"/>
-                <w:color w:val="000000"/>
-                <w:sz w:val="21"/>
-                <w:szCs w:val="21"/>
-              </w:rPr>
-              <w:t xml:space="preserve">3</w:t>
-            </w:r>
-          </w:p>
-        </w:tc>
-        <w:tc>
-          <w:tcPr>
-            <w:tcW w:type="dxa" w:w="8484"/>
-            <w:shd w:fill="FFFFFF" w:color="auto" w:val="clear"/>
-            <w:tcMar>
-              <w:top w:type="dxa" w:w="90"/>
-              <w:left w:type="dxa" w:w="110"/>
-              <w:bottom w:type="dxa" w:w="90"/>
-              <w:right w:type="dxa" w:w="110"/>
-            </w:tcMar>
-            <w:vAlign w:val="top"/>
-          </w:tcPr>
-          <w:p>
-            <w:pPr>
-              <w:spacing w:after="0" w:before="0" w:line="252"/>
-            </w:pPr>
-            <w:r>
-              <w:rPr>
-                <w:rFonts w:ascii="Arial" w:cs="Arial" w:eastAsia="Arial" w:hAnsi="Arial"/>
-                <w:b w:val="false"/>
-                <w:bCs w:val="false"/>
-                <w:color w:val="000000"/>
-                <w:sz w:val="21"/>
-                <w:szCs w:val="21"/>
-              </w:rPr>
-              <w:t xml:space="preserve">Confirm the Revert_App flag with Application Status remaining “Rejected”, in preference to a new ‘User Initiated Revert’ status (zero mobile-app impact).</w:t>
             </w:r>
           </w:p>
         </w:tc>

</xml_diff>

<commit_message>
Rename submission audit step to Revert Initiated, tighten client emails
The application-history row for a revert submission now reads Step =
'Revert Initiated' (the State field keeps showing the live status,
Rejected, until approval - a note in section 3 and AC2.1 explains the
distinction). The two Email (Client) templates are shortened and say
'After re-assessment' outright, per PO feedback.

Co-Authored-By: Claude Fable 5 <noreply@anthropic.com>
Claude-Session: https://claude.ai/code/session_01GMyQEZm7CauvpgScBFz4Cf
</commit_message>
<xml_diff>
--- a/docs/brd/Appro_RF_Application_Revert_in_Super_Portal_v1.0.docx
+++ b/docs/brd/Appro_RF_Application_Revert_in_Super_Portal_v1.0.docx
@@ -5108,7 +5108,7 @@
           <w:sz w:val="22"/>
           <w:szCs w:val="22"/>
         </w:rPr>
-        <w:t xml:space="preserve">'Manual revert process'</w:t>
+        <w:t xml:space="preserve">'Revert Initiated'</w:t>
       </w:r>
       <w:r>
         <w:rPr>
@@ -5119,7 +5119,29 @@
           <w:sz w:val="22"/>
           <w:szCs w:val="22"/>
         </w:rPr>
-        <w:t xml:space="preserve">, State = 'Rejected', Step Status = 'Successful', Step Details = </w:t>
+        <w:t xml:space="preserve">, State = 'Rejected' </w:t>
+      </w:r>
+      <w:r>
+        <w:rPr>
+          <w:rFonts w:ascii="Arial" w:cs="Arial" w:eastAsia="Arial" w:hAnsi="Arial"/>
+          <w:i/>
+          <w:iCs/>
+          <w:color w:val="000000"/>
+          <w:sz w:val="22"/>
+          <w:szCs w:val="22"/>
+        </w:rPr>
+        <w:t xml:space="preserve">(State reflects the live Application Status, which changes only when the revert is approved — section 4.3)</w:t>
+      </w:r>
+      <w:r>
+        <w:rPr>
+          <w:rFonts w:ascii="Arial" w:cs="Arial" w:eastAsia="Arial" w:hAnsi="Arial"/>
+          <w:b w:val="false"/>
+          <w:bCs w:val="false"/>
+          <w:color w:val="000000"/>
+          <w:sz w:val="22"/>
+          <w:szCs w:val="22"/>
+        </w:rPr>
+        <w:t xml:space="preserve">, Step Status = 'Successful', Step Details = </w:t>
       </w:r>
       <w:r>
         <w:rPr>
@@ -5141,7 +5163,29 @@
           <w:sz w:val="22"/>
           <w:szCs w:val="22"/>
         </w:rPr>
-        <w:t xml:space="preserve">, Action by = &lt;user email id&gt;.</w:t>
+        <w:t xml:space="preserve">, Action by = &lt;user email id&gt;. The application history in Application Enquiry therefore shows a </w:t>
+      </w:r>
+      <w:r>
+        <w:rPr>
+          <w:rFonts w:ascii="Arial" w:cs="Arial" w:eastAsia="Arial" w:hAnsi="Arial"/>
+          <w:b/>
+          <w:bCs/>
+          <w:color w:val="000000"/>
+          <w:sz w:val="22"/>
+          <w:szCs w:val="22"/>
+        </w:rPr>
+        <w:t xml:space="preserve">'Revert Initiated'</w:t>
+      </w:r>
+      <w:r>
+        <w:rPr>
+          <w:rFonts w:ascii="Arial" w:cs="Arial" w:eastAsia="Arial" w:hAnsi="Arial"/>
+          <w:b w:val="false"/>
+          <w:bCs w:val="false"/>
+          <w:color w:val="000000"/>
+          <w:sz w:val="22"/>
+          <w:szCs w:val="22"/>
+        </w:rPr>
+        <w:t xml:space="preserve"> step while the status column still reads 'Rejected'.</w:t>
       </w:r>
     </w:p>
     <w:p>
@@ -9408,7 +9452,7 @@
                 <w:sz w:val="21"/>
                 <w:szCs w:val="21"/>
               </w:rPr>
-              <w:t xml:space="preserve">Dear %%CUSTOMER_NAME%%, Following a further review of your %%PRODUCT_TYPE%% application %%APPLICATION_ID%%, we are pleased to inform you that your application has been approved. No action is required from your side — we will be in touch with the next steps to complete your application. Thank you for choosing Reem Bank. Best Regards, Reem Bank</w:t>
+              <w:t xml:space="preserve">Dear %%CUSTOMER_NAME%%, After re-assessment, your %%PRODUCT_TYPE%% application %%APPLICATION_ID%% has been approved. We will be in touch with the next steps. Best Regards, Reem Bank</w:t>
             </w:r>
           </w:p>
         </w:tc>
@@ -9437,29 +9481,7 @@
                 <w:sz w:val="21"/>
                 <w:szCs w:val="21"/>
               </w:rPr>
-              <w:t xml:space="preserve">One time — when an application reopened via an approved revert is </w:t>
-            </w:r>
-            <w:r>
-              <w:rPr>
-                <w:rFonts w:ascii="Arial" w:cs="Arial" w:eastAsia="Arial" w:hAnsi="Arial"/>
-                <w:b/>
-                <w:bCs/>
-                <w:color w:val="000000"/>
-                <w:sz w:val="21"/>
-                <w:szCs w:val="21"/>
-              </w:rPr>
-              <w:t xml:space="preserve">approved</w:t>
-            </w:r>
-            <w:r>
-              <w:rPr>
-                <w:rFonts w:ascii="Arial" w:cs="Arial" w:eastAsia="Arial" w:hAnsi="Arial"/>
-                <w:b w:val="false"/>
-                <w:bCs w:val="false"/>
-                <w:color w:val="000000"/>
-                <w:sz w:val="21"/>
-                <w:szCs w:val="21"/>
-              </w:rPr>
-              <w:t xml:space="preserve"> after re-assessment. Newly added in Communication Setup, mirroring the standard approval message.</w:t>
+              <w:t xml:space="preserve">One time — approved after re-assessment (application reopened via approved revert). Newly added in Communication Setup.</w:t>
             </w:r>
           </w:p>
         </w:tc>
@@ -9551,7 +9573,7 @@
                 <w:sz w:val="21"/>
                 <w:szCs w:val="21"/>
               </w:rPr>
-              <w:t xml:space="preserve">Dear %%CUSTOMER_NAME%%, Following a further review of your %%PRODUCT_TYPE%% application %%APPLICATION_ID%%, we regret to inform you that your application has not been approved on this occasion. You may submit a new application after 30 days from the date of this decision. Thank you for your interest in Reem Bank. Best Regards, Reem Bank</w:t>
+              <w:t xml:space="preserve">Dear %%CUSTOMER_NAME%%, After re-assessment, your %%PRODUCT_TYPE%% application %%APPLICATION_ID%% has not been approved. You may submit a new application after 30 days. Best Regards, Reem Bank</w:t>
             </w:r>
           </w:p>
         </w:tc>
@@ -9580,29 +9602,7 @@
                 <w:sz w:val="21"/>
                 <w:szCs w:val="21"/>
               </w:rPr>
-              <w:t xml:space="preserve">One time — when an application reopened via an approved revert is </w:t>
-            </w:r>
-            <w:r>
-              <w:rPr>
-                <w:rFonts w:ascii="Arial" w:cs="Arial" w:eastAsia="Arial" w:hAnsi="Arial"/>
-                <w:b/>
-                <w:bCs/>
-                <w:color w:val="000000"/>
-                <w:sz w:val="21"/>
-                <w:szCs w:val="21"/>
-              </w:rPr>
-              <w:t xml:space="preserve">rejected again</w:t>
-            </w:r>
-            <w:r>
-              <w:rPr>
-                <w:rFonts w:ascii="Arial" w:cs="Arial" w:eastAsia="Arial" w:hAnsi="Arial"/>
-                <w:b w:val="false"/>
-                <w:bCs w:val="false"/>
-                <w:color w:val="000000"/>
-                <w:sz w:val="21"/>
-                <w:szCs w:val="21"/>
-              </w:rPr>
-              <w:t xml:space="preserve"> after re-assessment (replaces the generic rejection notification for this case). Exactly one client email per re-assessment decision — one email either way.</w:t>
+              <w:t xml:space="preserve">One time — rejected again after re-assessment (replaces the generic rejection notification). Exactly one client email per decision — either way.</w:t>
             </w:r>
           </w:p>
         </w:tc>
@@ -11310,7 +11310,7 @@
                 <w:sz w:val="21"/>
                 <w:szCs w:val="21"/>
               </w:rPr>
-              <w:t xml:space="preserve">Three new audit steps — 'Manual revert process', 'Revert Queue', 'Auto Revert Approval on timeout' (mirroring cancellation's 'Auto Cancellation on timeout') — each writing the full standard field set. The original rejection record is never modified. Revertibility is derived from the audit step recorded at rejection, so the known defect in the audit trail written for Financial-DBR rejections must be resolved before this feature relies on it.</w:t>
+              <w:t xml:space="preserve">Three new audit steps — 'Revert Initiated', 'Revert Queue', 'Auto Revert Approval on timeout' (mirroring cancellation's 'Auto Cancellation on timeout') — each writing the full standard field set. The original rejection record is never modified. Revertibility is derived from the audit step recorded at rejection, so the known defect in the audit trail written for Financial-DBR rejections must be resolved before this feature relies on it.</w:t>
             </w:r>
           </w:p>
         </w:tc>

</xml_diff>

<commit_message>
Adopt PO-reviewed final: audit wording, trimmed impact table, no OQ section
Matches the reviewed PDF: submission audit reads Step 'Manually
initiate revert' with State 'User Initiated Revert', the section 4
intro is shortened, the impact analysis keeps the five reviewed rows
(Reporting/MIS, Services and Credit-policy rows removed), and the Open
Questions section is dropped. The US mirrors the audit wording while
keeping its fuller engineering impact rows.

Co-Authored-By: Claude Fable 5 <noreply@anthropic.com>
Claude-Session: https://claude.ai/code/session_01GMyQEZm7CauvpgScBFz4Cf
</commit_message>
<xml_diff>
--- a/docs/brd/Appro_RF_Application_Revert_in_Super_Portal_v1.0.docx
+++ b/docs/brd/Appro_RF_Application_Revert_in_Super_Portal_v1.0.docx
@@ -5108,7 +5108,7 @@
           <w:sz w:val="22"/>
           <w:szCs w:val="22"/>
         </w:rPr>
-        <w:t xml:space="preserve">'Revert Initiated'</w:t>
+        <w:t xml:space="preserve">'Manually initiate revert'</w:t>
       </w:r>
       <w:r>
         <w:rPr>
@@ -5119,18 +5119,18 @@
           <w:sz w:val="22"/>
           <w:szCs w:val="22"/>
         </w:rPr>
-        <w:t xml:space="preserve">, State = 'Rejected' </w:t>
-      </w:r>
-      <w:r>
-        <w:rPr>
-          <w:rFonts w:ascii="Arial" w:cs="Arial" w:eastAsia="Arial" w:hAnsi="Arial"/>
-          <w:i/>
-          <w:iCs/>
-          <w:color w:val="000000"/>
-          <w:sz w:val="22"/>
-          <w:szCs w:val="22"/>
-        </w:rPr>
-        <w:t xml:space="preserve">(State reflects the live Application Status, which changes only when the revert is approved — section 4.3)</w:t>
+        <w:t xml:space="preserve">, State = </w:t>
+      </w:r>
+      <w:r>
+        <w:rPr>
+          <w:rFonts w:ascii="Arial" w:cs="Arial" w:eastAsia="Arial" w:hAnsi="Arial"/>
+          <w:b/>
+          <w:bCs/>
+          <w:color w:val="000000"/>
+          <w:sz w:val="22"/>
+          <w:szCs w:val="22"/>
+        </w:rPr>
+        <w:t xml:space="preserve">'User Initiated Revert'</w:t>
       </w:r>
       <w:r>
         <w:rPr>
@@ -5163,29 +5163,7 @@
           <w:sz w:val="22"/>
           <w:szCs w:val="22"/>
         </w:rPr>
-        <w:t xml:space="preserve">, Action by = &lt;user email id&gt;. The application history in Application Enquiry therefore shows a </w:t>
-      </w:r>
-      <w:r>
-        <w:rPr>
-          <w:rFonts w:ascii="Arial" w:cs="Arial" w:eastAsia="Arial" w:hAnsi="Arial"/>
-          <w:b/>
-          <w:bCs/>
-          <w:color w:val="000000"/>
-          <w:sz w:val="22"/>
-          <w:szCs w:val="22"/>
-        </w:rPr>
-        <w:t xml:space="preserve">'Revert Initiated'</w:t>
-      </w:r>
-      <w:r>
-        <w:rPr>
-          <w:rFonts w:ascii="Arial" w:cs="Arial" w:eastAsia="Arial" w:hAnsi="Arial"/>
-          <w:b w:val="false"/>
-          <w:bCs w:val="false"/>
-          <w:color w:val="000000"/>
-          <w:sz w:val="22"/>
-          <w:szCs w:val="22"/>
-        </w:rPr>
-        <w:t xml:space="preserve"> step while the status column still reads 'Rejected'.</w:t>
+        <w:t xml:space="preserve">, Action by = &lt;user email id&gt;.</w:t>
       </w:r>
     </w:p>
     <w:p>
@@ -5261,7 +5239,7 @@
           <w:sz w:val="22"/>
           <w:szCs w:val="22"/>
         </w:rPr>
-        <w:t xml:space="preserve">The Revert Queue is a new queue within the Super Portal that allows users to review and make decisions on applications that have been submitted for revert. It provides governance and an approval layer before a rejection is reopened — mirroring the Termination Queue used for manual cancellation. The Checker view is read-only apart from the decision: no Edit, Override, Send Application or FTS Retrigger is offered there.</w:t>
+        <w:t xml:space="preserve">The Revert Queue is a new queue within the Super Portal that allows users to review and make decisions on applications that have been submitted for revert. It provides governance and an approval layer before a rejection is reopened.</w:t>
       </w:r>
     </w:p>
     <w:p>
@@ -11310,7 +11288,7 @@
                 <w:sz w:val="21"/>
                 <w:szCs w:val="21"/>
               </w:rPr>
-              <w:t xml:space="preserve">Three new audit steps — 'Revert Initiated', 'Revert Queue', 'Auto Revert Approval on timeout' (mirroring cancellation's 'Auto Cancellation on timeout') — each writing the full standard field set. The original rejection record is never modified. Revertibility is derived from the audit step recorded at rejection, so the known defect in the audit trail written for Financial-DBR rejections must be resolved before this feature relies on it.</w:t>
+              <w:t xml:space="preserve">Three new audit steps — 'Manually initiate revert', 'Revert Queue', 'Auto Revert Approval on timeout' — each writing the full standard field set. The original rejection record is never modified. Revertibility is derived from the audit step recorded at rejection, so the known defect in the audit trail written for Financial-DBR rejections must be resolved before this feature relies on it.</w:t>
             </w:r>
           </w:p>
         </w:tc>
@@ -11597,638 +11575,6 @@
                 <w:szCs w:val="17"/>
               </w:rPr>
               <w:t xml:space="preserve">Communication Setup › Email Templates — Type: Client / Bank</w:t>
-            </w:r>
-          </w:p>
-        </w:tc>
-      </w:tr>
-      <w:tr>
-        <w:trPr>
-          <w:cantSplit/>
-        </w:trPr>
-        <w:tc>
-          <w:tcPr>
-            <w:tcW w:type="dxa" w:w="1715"/>
-            <w:shd w:fill="FFFFFF" w:color="auto" w:val="clear"/>
-            <w:tcMar>
-              <w:top w:type="dxa" w:w="90"/>
-              <w:left w:type="dxa" w:w="110"/>
-              <w:bottom w:type="dxa" w:w="90"/>
-              <w:right w:type="dxa" w:w="110"/>
-            </w:tcMar>
-            <w:vAlign w:val="top"/>
-          </w:tcPr>
-          <w:p>
-            <w:pPr>
-              <w:spacing w:after="0" w:before="0" w:line="252"/>
-            </w:pPr>
-            <w:r>
-              <w:rPr>
-                <w:rFonts w:ascii="Arial" w:cs="Arial" w:eastAsia="Arial" w:hAnsi="Arial"/>
-                <w:b w:val="false"/>
-                <w:bCs w:val="false"/>
-                <w:color w:val="000000"/>
-                <w:sz w:val="21"/>
-                <w:szCs w:val="21"/>
-              </w:rPr>
-              <w:t xml:space="preserve">Reporting / MIS</w:t>
-            </w:r>
-          </w:p>
-        </w:tc>
-        <w:tc>
-          <w:tcPr>
-            <w:tcW w:type="dxa" w:w="4062"/>
-            <w:shd w:fill="FFFFFF" w:color="auto" w:val="clear"/>
-            <w:tcMar>
-              <w:top w:type="dxa" w:w="90"/>
-              <w:left w:type="dxa" w:w="110"/>
-              <w:bottom w:type="dxa" w:w="90"/>
-              <w:right w:type="dxa" w:w="110"/>
-            </w:tcMar>
-            <w:vAlign w:val="top"/>
-          </w:tcPr>
-          <w:p>
-            <w:pPr>
-              <w:spacing w:after="0" w:before="0" w:line="252"/>
-            </w:pPr>
-            <w:r>
-              <w:rPr>
-                <w:rFonts w:ascii="Arial" w:cs="Arial" w:eastAsia="Arial" w:hAnsi="Arial"/>
-                <w:b w:val="false"/>
-                <w:bCs w:val="false"/>
-                <w:color w:val="000000"/>
-                <w:sz w:val="21"/>
-                <w:szCs w:val="21"/>
-              </w:rPr>
-              <w:t xml:space="preserve">WIP, Exception, Policy Exception, E2E and Approved Transactions reports must handle reopened cases: rejection counts become mutable, E2E must not double-count the second pass, and an approval after revert should be identifiable as such.</w:t>
-            </w:r>
-          </w:p>
-        </w:tc>
-        <w:tc>
-          <w:tcPr>
-            <w:tcW w:type="dxa" w:w="3249"/>
-            <w:tcMar>
-              <w:top w:type="dxa" w:w="90"/>
-              <w:left w:type="dxa" w:w="110"/>
-              <w:bottom w:type="dxa" w:w="90"/>
-              <w:right w:type="dxa" w:w="110"/>
-            </w:tcMar>
-            <w:vAlign w:val="center"/>
-          </w:tcPr>
-          <w:p>
-            <w:pPr>
-              <w:spacing w:after="40" w:before="0"/>
-              <w:jc w:val="center"/>
-            </w:pPr>
-            <w:r>
-              <w:drawing>
-                <wp:inline distT="0" distB="0" distL="0" distR="0">
-                  <wp:extent cx="1809750" cy="457200"/>
-                  <wp:effectExtent t="0" r="0" b="0" l="0"/>
-                  <wp:docPr id="1" name="" descr="" title=""/>
-                  <wp:cNvGraphicFramePr>
-                    <a:graphicFrameLocks xmlns:a="http://schemas.openxmlformats.org/drawingml/2006/main" noChangeAspect="1"/>
-                  </wp:cNvGraphicFramePr>
-                  <a:graphic xmlns:a="http://schemas.openxmlformats.org/drawingml/2006/main">
-                    <a:graphicData uri="http://schemas.openxmlformats.org/drawingml/2006/picture">
-                      <pic:pic xmlns:pic="http://schemas.openxmlformats.org/drawingml/2006/picture">
-                        <pic:nvPicPr>
-                          <pic:cNvPr id="0" name="" descr=""/>
-                          <pic:cNvPicPr>
-                            <a:picLocks noChangeAspect="1" noChangeArrowheads="1"/>
-                          </pic:cNvPicPr>
-                        </pic:nvPicPr>
-                        <pic:blipFill>
-                          <a:blip r:embed="rId26" cstate="none"/>
-                          <a:srcRect/>
-                          <a:stretch>
-                            <a:fillRect/>
-                          </a:stretch>
-                        </pic:blipFill>
-                        <pic:spPr bwMode="auto">
-                          <a:xfrm>
-                            <a:off x="0" y="0"/>
-                            <a:ext cx="1809750" cy="457200"/>
-                          </a:xfrm>
-                          <a:prstGeom prst="rect">
-                            <a:avLst/>
-                          </a:prstGeom>
-                        </pic:spPr>
-                      </pic:pic>
-                    </a:graphicData>
-                  </a:graphic>
-                </wp:inline>
-              </w:drawing>
-            </w:r>
-          </w:p>
-          <w:p>
-            <w:pPr>
-              <w:spacing w:after="0" w:before="0"/>
-              <w:jc w:val="center"/>
-            </w:pPr>
-            <w:r>
-              <w:rPr>
-                <w:rFonts w:ascii="Arial" w:cs="Arial" w:eastAsia="Arial" w:hAnsi="Arial"/>
-                <w:color w:val="595959"/>
-                <w:sz w:val="17"/>
-                <w:szCs w:val="17"/>
-              </w:rPr>
-              <w:t xml:space="preserve">Enquiry › Report Enquiry</w:t>
-            </w:r>
-          </w:p>
-        </w:tc>
-      </w:tr>
-      <w:tr>
-        <w:trPr>
-          <w:cantSplit/>
-        </w:trPr>
-        <w:tc>
-          <w:tcPr>
-            <w:tcW w:type="dxa" w:w="1715"/>
-            <w:shd w:fill="FFFFFF" w:color="auto" w:val="clear"/>
-            <w:tcMar>
-              <w:top w:type="dxa" w:w="90"/>
-              <w:left w:type="dxa" w:w="110"/>
-              <w:bottom w:type="dxa" w:w="90"/>
-              <w:right w:type="dxa" w:w="110"/>
-            </w:tcMar>
-            <w:vAlign w:val="top"/>
-          </w:tcPr>
-          <w:p>
-            <w:pPr>
-              <w:spacing w:after="0" w:before="0" w:line="252"/>
-            </w:pPr>
-            <w:r>
-              <w:rPr>
-                <w:rFonts w:ascii="Arial" w:cs="Arial" w:eastAsia="Arial" w:hAnsi="Arial"/>
-                <w:b w:val="false"/>
-                <w:bCs w:val="false"/>
-                <w:color w:val="000000"/>
-                <w:sz w:val="21"/>
-                <w:szCs w:val="21"/>
-              </w:rPr>
-              <w:t xml:space="preserve">Services</w:t>
-            </w:r>
-          </w:p>
-        </w:tc>
-        <w:tc>
-          <w:tcPr>
-            <w:tcW w:type="dxa" w:w="4062"/>
-            <w:shd w:fill="FFFFFF" w:color="auto" w:val="clear"/>
-            <w:tcMar>
-              <w:top w:type="dxa" w:w="90"/>
-              <w:left w:type="dxa" w:w="110"/>
-              <w:bottom w:type="dxa" w:w="90"/>
-              <w:right w:type="dxa" w:w="110"/>
-            </w:tcMar>
-            <w:vAlign w:val="top"/>
-          </w:tcPr>
-          <w:p>
-            <w:pPr>
-              <w:spacing w:after="0" w:before="0" w:line="252"/>
-            </w:pPr>
-            <w:r>
-              <w:rPr>
-                <w:rFonts w:ascii="Arial" w:cs="Arial" w:eastAsia="Arial" w:hAnsi="Arial"/>
-                <w:b w:val="false"/>
-                <w:bCs w:val="false"/>
-                <w:color w:val="000000"/>
-                <w:sz w:val="21"/>
-                <w:szCs w:val="21"/>
-              </w:rPr>
-              <w:t xml:space="preserve">backoffice-service, application-service, queue-service, user-service, audit-trail-service, notification-service, scheduler-service (timeout job) and work-flow-service. The workflow engine is the key estimation item: a rejected application’s process instance has ended, and reverting requires resuming it or re-instantiating at the queue task.</w:t>
-            </w:r>
-          </w:p>
-        </w:tc>
-        <w:tc>
-          <w:tcPr>
-            <w:tcW w:type="dxa" w:w="3249"/>
-            <w:tcMar>
-              <w:top w:type="dxa" w:w="90"/>
-              <w:left w:type="dxa" w:w="110"/>
-              <w:bottom w:type="dxa" w:w="90"/>
-              <w:right w:type="dxa" w:w="110"/>
-            </w:tcMar>
-            <w:vAlign w:val="center"/>
-          </w:tcPr>
-          <w:p>
-            <w:pPr>
-              <w:spacing w:after="40" w:before="0"/>
-              <w:jc w:val="center"/>
-            </w:pPr>
-            <w:r>
-              <w:drawing>
-                <wp:inline distT="0" distB="0" distL="0" distR="0">
-                  <wp:extent cx="1809750" cy="809625"/>
-                  <wp:effectExtent t="0" r="0" b="0" l="0"/>
-                  <wp:docPr id="1" name="" descr="" title=""/>
-                  <wp:cNvGraphicFramePr>
-                    <a:graphicFrameLocks xmlns:a="http://schemas.openxmlformats.org/drawingml/2006/main" noChangeAspect="1"/>
-                  </wp:cNvGraphicFramePr>
-                  <a:graphic xmlns:a="http://schemas.openxmlformats.org/drawingml/2006/main">
-                    <a:graphicData uri="http://schemas.openxmlformats.org/drawingml/2006/picture">
-                      <pic:pic xmlns:pic="http://schemas.openxmlformats.org/drawingml/2006/picture">
-                        <pic:nvPicPr>
-                          <pic:cNvPr id="0" name="" descr=""/>
-                          <pic:cNvPicPr>
-                            <a:picLocks noChangeAspect="1" noChangeArrowheads="1"/>
-                          </pic:cNvPicPr>
-                        </pic:nvPicPr>
-                        <pic:blipFill>
-                          <a:blip r:embed="rId27" cstate="none"/>
-                          <a:srcRect/>
-                          <a:stretch>
-                            <a:fillRect/>
-                          </a:stretch>
-                        </pic:blipFill>
-                        <pic:spPr bwMode="auto">
-                          <a:xfrm>
-                            <a:off x="0" y="0"/>
-                            <a:ext cx="1809750" cy="809625"/>
-                          </a:xfrm>
-                          <a:prstGeom prst="rect">
-                            <a:avLst/>
-                          </a:prstGeom>
-                        </pic:spPr>
-                      </pic:pic>
-                    </a:graphicData>
-                  </a:graphic>
-                </wp:inline>
-              </w:drawing>
-            </w:r>
-          </w:p>
-          <w:p>
-            <w:pPr>
-              <w:spacing w:after="0" w:before="0"/>
-              <w:jc w:val="center"/>
-            </w:pPr>
-            <w:r>
-              <w:rPr>
-                <w:rFonts w:ascii="Arial" w:cs="Arial" w:eastAsia="Arial" w:hAnsi="Arial"/>
-                <w:color w:val="595959"/>
-                <w:sz w:val="17"/>
-                <w:szCs w:val="17"/>
-              </w:rPr>
-              <w:t xml:space="preserve">Services touched — workflow engine is the key item</w:t>
-            </w:r>
-          </w:p>
-        </w:tc>
-      </w:tr>
-      <w:tr>
-        <w:trPr>
-          <w:cantSplit/>
-        </w:trPr>
-        <w:tc>
-          <w:tcPr>
-            <w:tcW w:type="dxa" w:w="1715"/>
-            <w:shd w:fill="FFFFFF" w:color="auto" w:val="clear"/>
-            <w:tcMar>
-              <w:top w:type="dxa" w:w="90"/>
-              <w:left w:type="dxa" w:w="110"/>
-              <w:bottom w:type="dxa" w:w="90"/>
-              <w:right w:type="dxa" w:w="110"/>
-            </w:tcMar>
-            <w:vAlign w:val="top"/>
-          </w:tcPr>
-          <w:p>
-            <w:pPr>
-              <w:spacing w:after="0" w:before="0" w:line="252"/>
-            </w:pPr>
-            <w:r>
-              <w:rPr>
-                <w:rFonts w:ascii="Arial" w:cs="Arial" w:eastAsia="Arial" w:hAnsi="Arial"/>
-                <w:b w:val="false"/>
-                <w:bCs w:val="false"/>
-                <w:color w:val="000000"/>
-                <w:sz w:val="21"/>
-                <w:szCs w:val="21"/>
-              </w:rPr>
-              <w:t xml:space="preserve">Credit policy versioning</w:t>
-            </w:r>
-          </w:p>
-        </w:tc>
-        <w:tc>
-          <w:tcPr>
-            <w:tcW w:type="dxa" w:w="4062"/>
-            <w:shd w:fill="FFFFFF" w:color="auto" w:val="clear"/>
-            <w:tcMar>
-              <w:top w:type="dxa" w:w="90"/>
-              <w:left w:type="dxa" w:w="110"/>
-              <w:bottom w:type="dxa" w:w="90"/>
-              <w:right w:type="dxa" w:w="110"/>
-            </w:tcMar>
-            <w:vAlign w:val="top"/>
-          </w:tcPr>
-          <w:p>
-            <w:pPr>
-              <w:spacing w:after="0" w:before="0" w:line="252"/>
-            </w:pPr>
-            <w:r>
-              <w:rPr>
-                <w:rFonts w:ascii="Arial" w:cs="Arial" w:eastAsia="Arial" w:hAnsi="Arial"/>
-                <w:b w:val="false"/>
-                <w:bCs w:val="false"/>
-                <w:color w:val="000000"/>
-                <w:sz w:val="21"/>
-                <w:szCs w:val="21"/>
-              </w:rPr>
-              <w:t xml:space="preserve">Post-revert re-decisioning evaluates against the currently published Strategy / Score Check / Income Multiplier versions — which is the point of the feature — and the audit trail should record which published version was applied.</w:t>
-            </w:r>
-          </w:p>
-        </w:tc>
-        <w:tc>
-          <w:tcPr>
-            <w:tcW w:type="dxa" w:w="3249"/>
-            <w:tcMar>
-              <w:top w:type="dxa" w:w="90"/>
-              <w:left w:type="dxa" w:w="110"/>
-              <w:bottom w:type="dxa" w:w="90"/>
-              <w:right w:type="dxa" w:w="110"/>
-            </w:tcMar>
-            <w:vAlign w:val="center"/>
-          </w:tcPr>
-          <w:p>
-            <w:pPr>
-              <w:spacing w:after="40" w:before="0"/>
-              <w:jc w:val="center"/>
-            </w:pPr>
-            <w:r>
-              <w:drawing>
-                <wp:inline distT="0" distB="0" distL="0" distR="0">
-                  <wp:extent cx="1809750" cy="1019175"/>
-                  <wp:effectExtent t="0" r="0" b="0" l="0"/>
-                  <wp:docPr id="1" name="" descr="" title=""/>
-                  <wp:cNvGraphicFramePr>
-                    <a:graphicFrameLocks xmlns:a="http://schemas.openxmlformats.org/drawingml/2006/main" noChangeAspect="1"/>
-                  </wp:cNvGraphicFramePr>
-                  <a:graphic xmlns:a="http://schemas.openxmlformats.org/drawingml/2006/main">
-                    <a:graphicData uri="http://schemas.openxmlformats.org/drawingml/2006/picture">
-                      <pic:pic xmlns:pic="http://schemas.openxmlformats.org/drawingml/2006/picture">
-                        <pic:nvPicPr>
-                          <pic:cNvPr id="0" name="" descr=""/>
-                          <pic:cNvPicPr>
-                            <a:picLocks noChangeAspect="1" noChangeArrowheads="1"/>
-                          </pic:cNvPicPr>
-                        </pic:nvPicPr>
-                        <pic:blipFill>
-                          <a:blip r:embed="rId28" cstate="none"/>
-                          <a:srcRect/>
-                          <a:stretch>
-                            <a:fillRect/>
-                          </a:stretch>
-                        </pic:blipFill>
-                        <pic:spPr bwMode="auto">
-                          <a:xfrm>
-                            <a:off x="0" y="0"/>
-                            <a:ext cx="1809750" cy="1019175"/>
-                          </a:xfrm>
-                          <a:prstGeom prst="rect">
-                            <a:avLst/>
-                          </a:prstGeom>
-                        </pic:spPr>
-                      </pic:pic>
-                    </a:graphicData>
-                  </a:graphic>
-                </wp:inline>
-              </w:drawing>
-            </w:r>
-          </w:p>
-          <w:p>
-            <w:pPr>
-              <w:spacing w:after="0" w:before="0"/>
-              <w:jc w:val="center"/>
-            </w:pPr>
-            <w:r>
-              <w:rPr>
-                <w:rFonts w:ascii="Arial" w:cs="Arial" w:eastAsia="Arial" w:hAnsi="Arial"/>
-                <w:color w:val="595959"/>
-                <w:sz w:val="17"/>
-                <w:szCs w:val="17"/>
-              </w:rPr>
-              <w:t xml:space="preserve">Strategies › Versions / Audit Trails menu</w:t>
-            </w:r>
-          </w:p>
-        </w:tc>
-      </w:tr>
-    </w:tbl>
-    <w:p>
-      <w:pPr>
-        <w:pStyle w:val="Heading1"/>
-        <w:spacing w:after="140" w:before="300"/>
-      </w:pPr>
-      <w:r>
-        <w:rPr>
-          <w:rFonts w:ascii="Arial" w:cs="Arial" w:eastAsia="Arial" w:hAnsi="Arial"/>
-          <w:b/>
-          <w:bCs/>
-          <w:color w:val="000000"/>
-          <w:sz w:val="26"/>
-          <w:szCs w:val="26"/>
-        </w:rPr>
-        <w:t xml:space="preserve">OPEN QUESTIONS</w:t>
-      </w:r>
-    </w:p>
-    <w:tbl>
-      <w:tblPr>
-        <w:tblW w:type="dxa" w:w="9026"/>
-        <w:tblBorders>
-          <w:top w:val="single" w:color="A6A6A6" w:sz="4"/>
-          <w:left w:val="single" w:color="A6A6A6" w:sz="4"/>
-          <w:bottom w:val="single" w:color="A6A6A6" w:sz="4"/>
-          <w:right w:val="single" w:color="A6A6A6" w:sz="4"/>
-          <w:insideH w:val="single" w:color="A6A6A6" w:sz="4"/>
-          <w:insideV w:val="single" w:color="A6A6A6" w:sz="4"/>
-        </w:tblBorders>
-      </w:tblPr>
-      <w:tblGrid>
-        <w:gridCol w:w="542"/>
-        <w:gridCol w:w="8484"/>
-      </w:tblGrid>
-      <w:tr>
-        <w:trPr>
-          <w:cantSplit/>
-          <w:tblHeader/>
-        </w:trPr>
-        <w:tc>
-          <w:tcPr>
-            <w:tcW w:type="dxa" w:w="542"/>
-            <w:shd w:fill="156082" w:color="auto" w:val="clear"/>
-            <w:tcMar>
-              <w:top w:type="dxa" w:w="90"/>
-              <w:left w:type="dxa" w:w="110"/>
-              <w:bottom w:type="dxa" w:w="90"/>
-              <w:right w:type="dxa" w:w="110"/>
-            </w:tcMar>
-            <w:vAlign w:val="top"/>
-          </w:tcPr>
-          <w:p>
-            <w:pPr>
-              <w:spacing w:after="0" w:before="0" w:line="252"/>
-            </w:pPr>
-            <w:r>
-              <w:rPr>
-                <w:rFonts w:ascii="Arial" w:cs="Arial" w:eastAsia="Arial" w:hAnsi="Arial"/>
-                <w:b/>
-                <w:bCs/>
-                <w:color w:val="FFFFFF"/>
-                <w:sz w:val="21"/>
-                <w:szCs w:val="21"/>
-              </w:rPr>
-              <w:t xml:space="preserve">#</w:t>
-            </w:r>
-          </w:p>
-        </w:tc>
-        <w:tc>
-          <w:tcPr>
-            <w:tcW w:type="dxa" w:w="8484"/>
-            <w:shd w:fill="156082" w:color="auto" w:val="clear"/>
-            <w:tcMar>
-              <w:top w:type="dxa" w:w="90"/>
-              <w:left w:type="dxa" w:w="110"/>
-              <w:bottom w:type="dxa" w:w="90"/>
-              <w:right w:type="dxa" w:w="110"/>
-            </w:tcMar>
-            <w:vAlign w:val="top"/>
-          </w:tcPr>
-          <w:p>
-            <w:pPr>
-              <w:spacing w:after="0" w:before="0" w:line="252"/>
-            </w:pPr>
-            <w:r>
-              <w:rPr>
-                <w:rFonts w:ascii="Arial" w:cs="Arial" w:eastAsia="Arial" w:hAnsi="Arial"/>
-                <w:b/>
-                <w:bCs/>
-                <w:color w:val="FFFFFF"/>
-                <w:sz w:val="21"/>
-                <w:szCs w:val="21"/>
-              </w:rPr>
-              <w:t xml:space="preserve">Question</w:t>
-            </w:r>
-          </w:p>
-        </w:tc>
-      </w:tr>
-      <w:tr>
-        <w:trPr>
-          <w:cantSplit/>
-        </w:trPr>
-        <w:tc>
-          <w:tcPr>
-            <w:tcW w:type="dxa" w:w="542"/>
-            <w:shd w:fill="FFFFFF" w:color="auto" w:val="clear"/>
-            <w:tcMar>
-              <w:top w:type="dxa" w:w="90"/>
-              <w:left w:type="dxa" w:w="110"/>
-              <w:bottom w:type="dxa" w:w="90"/>
-              <w:right w:type="dxa" w:w="110"/>
-            </w:tcMar>
-            <w:vAlign w:val="top"/>
-          </w:tcPr>
-          <w:p>
-            <w:pPr>
-              <w:spacing w:after="0" w:before="0" w:line="252"/>
-            </w:pPr>
-            <w:r>
-              <w:rPr>
-                <w:rFonts w:ascii="Arial" w:cs="Arial" w:eastAsia="Arial" w:hAnsi="Arial"/>
-                <w:b w:val="false"/>
-                <w:bCs w:val="false"/>
-                <w:color w:val="000000"/>
-                <w:sz w:val="21"/>
-                <w:szCs w:val="21"/>
-              </w:rPr>
-              <w:t xml:space="preserve">1</w:t>
-            </w:r>
-          </w:p>
-        </w:tc>
-        <w:tc>
-          <w:tcPr>
-            <w:tcW w:type="dxa" w:w="8484"/>
-            <w:shd w:fill="FFFFFF" w:color="auto" w:val="clear"/>
-            <w:tcMar>
-              <w:top w:type="dxa" w:w="90"/>
-              <w:left w:type="dxa" w:w="110"/>
-              <w:bottom w:type="dxa" w:w="90"/>
-              <w:right w:type="dxa" w:w="110"/>
-            </w:tcMar>
-            <w:vAlign w:val="top"/>
-          </w:tcPr>
-          <w:p>
-            <w:pPr>
-              <w:spacing w:after="0" w:before="0" w:line="252"/>
-            </w:pPr>
-            <w:r>
-              <w:rPr>
-                <w:rFonts w:ascii="Arial" w:cs="Arial" w:eastAsia="Arial" w:hAnsi="Arial"/>
-                <w:b w:val="false"/>
-                <w:bCs w:val="false"/>
-                <w:color w:val="000000"/>
-                <w:sz w:val="21"/>
-                <w:szCs w:val="21"/>
-              </w:rPr>
-              <w:t xml:space="preserve">Workflow engine (technical — parked for engineering estimation): can the terminated process instance be resumed, or must a new instance start at the queue task?</w:t>
-            </w:r>
-          </w:p>
-        </w:tc>
-      </w:tr>
-      <w:tr>
-        <w:trPr>
-          <w:cantSplit/>
-        </w:trPr>
-        <w:tc>
-          <w:tcPr>
-            <w:tcW w:type="dxa" w:w="542"/>
-            <w:shd w:fill="FFFFFF" w:color="auto" w:val="clear"/>
-            <w:tcMar>
-              <w:top w:type="dxa" w:w="90"/>
-              <w:left w:type="dxa" w:w="110"/>
-              <w:bottom w:type="dxa" w:w="90"/>
-              <w:right w:type="dxa" w:w="110"/>
-            </w:tcMar>
-            <w:vAlign w:val="top"/>
-          </w:tcPr>
-          <w:p>
-            <w:pPr>
-              <w:spacing w:after="0" w:before="0" w:line="252"/>
-            </w:pPr>
-            <w:r>
-              <w:rPr>
-                <w:rFonts w:ascii="Arial" w:cs="Arial" w:eastAsia="Arial" w:hAnsi="Arial"/>
-                <w:b w:val="false"/>
-                <w:bCs w:val="false"/>
-                <w:color w:val="000000"/>
-                <w:sz w:val="21"/>
-                <w:szCs w:val="21"/>
-              </w:rPr>
-              <w:t xml:space="preserve">2</w:t>
-            </w:r>
-          </w:p>
-        </w:tc>
-        <w:tc>
-          <w:tcPr>
-            <w:tcW w:type="dxa" w:w="8484"/>
-            <w:shd w:fill="FFFFFF" w:color="auto" w:val="clear"/>
-            <w:tcMar>
-              <w:top w:type="dxa" w:w="90"/>
-              <w:left w:type="dxa" w:w="110"/>
-              <w:bottom w:type="dxa" w:w="90"/>
-              <w:right w:type="dxa" w:w="110"/>
-            </w:tcMar>
-            <w:vAlign w:val="top"/>
-          </w:tcPr>
-          <w:p>
-            <w:pPr>
-              <w:spacing w:after="0" w:before="0" w:line="252"/>
-            </w:pPr>
-            <w:r>
-              <w:rPr>
-                <w:rFonts w:ascii="Arial" w:cs="Arial" w:eastAsia="Arial" w:hAnsi="Arial"/>
-                <w:b w:val="false"/>
-                <w:bCs w:val="false"/>
-                <w:color w:val="000000"/>
-                <w:sz w:val="21"/>
-                <w:szCs w:val="21"/>
-              </w:rPr>
-              <w:t xml:space="preserve">Confirm the timeout period [X] — 5 days proposed, configurable in database, same as the cancellation timeout (RF source: currently set to 5 days).</w:t>
             </w:r>
           </w:p>
         </w:tc>

</xml_diff>